<commit_message>
Complete submission P0 evidence and comparisons
</commit_message>
<xml_diff>
--- a/docs/submission/BakeNN_오픈소스개발자대회_결과보고서_초안.docx
+++ b/docs/submission/BakeNN_오픈소스개발자대회_결과보고서_초안.docx
@@ -28,7 +28,7 @@
       </w:pPr>
       <w:r>
         <w:rPr>
-          <w:rFonts w:ascii="Arial Unicode MS" w:hAnsi="Arial Unicode MS" w:eastAsia="Arial Unicode MS"/>
+          <w:rFonts w:ascii="AppleGothic" w:hAnsi="AppleGothic" w:eastAsia="AppleGothic"/>
           <w:b/>
           <w:i w:val="0"/>
           <w:color w:val="2E74B5"/>
@@ -44,7 +44,7 @@
       </w:pPr>
       <w:r>
         <w:rPr>
-          <w:rFonts w:ascii="Arial Unicode MS" w:hAnsi="Arial Unicode MS" w:eastAsia="Arial Unicode MS"/>
+          <w:rFonts w:ascii="AppleGothic" w:hAnsi="AppleGothic" w:eastAsia="AppleGothic"/>
           <w:b/>
           <w:i w:val="0"/>
           <w:color w:val="0B2545"/>
@@ -60,7 +60,7 @@
       </w:pPr>
       <w:r>
         <w:rPr>
-          <w:rFonts w:ascii="Arial Unicode MS" w:hAnsi="Arial Unicode MS" w:eastAsia="Arial Unicode MS"/>
+          <w:rFonts w:ascii="AppleGothic" w:hAnsi="AppleGothic" w:eastAsia="AppleGothic"/>
           <w:b w:val="0"/>
           <w:i w:val="0"/>
           <w:color w:val="1F4D78"/>
@@ -75,7 +75,7 @@
       </w:pPr>
       <w:r>
         <w:rPr>
-          <w:rFonts w:ascii="Arial Unicode MS" w:hAnsi="Arial Unicode MS" w:eastAsia="Arial Unicode MS"/>
+          <w:rFonts w:ascii="AppleGothic" w:hAnsi="AppleGothic" w:eastAsia="AppleGothic"/>
           <w:b w:val="0"/>
           <w:i w:val="0"/>
           <w:color w:val="666666"/>
@@ -129,7 +129,7 @@
             </w:pPr>
             <w:r>
               <w:rPr>
-                <w:rFonts w:ascii="Arial Unicode MS" w:hAnsi="Arial Unicode MS" w:eastAsia="Arial Unicode MS"/>
+                <w:rFonts w:ascii="AppleGothic" w:hAnsi="AppleGothic" w:eastAsia="AppleGothic"/>
                 <w:b/>
                 <w:i w:val="0"/>
                 <w:color w:val="0B2545"/>
@@ -158,7 +158,7 @@
             </w:pPr>
             <w:r>
               <w:rPr>
-                <w:rFonts w:ascii="Arial Unicode MS" w:hAnsi="Arial Unicode MS" w:eastAsia="Arial Unicode MS"/>
+                <w:rFonts w:ascii="AppleGothic" w:hAnsi="AppleGothic" w:eastAsia="AppleGothic"/>
                 <w:b/>
                 <w:i w:val="0"/>
                 <w:color w:val="0B2545"/>
@@ -192,7 +192,7 @@
             </w:pPr>
             <w:r>
               <w:rPr>
-                <w:rFonts w:ascii="Arial Unicode MS" w:hAnsi="Arial Unicode MS" w:eastAsia="Arial Unicode MS"/>
+                <w:rFonts w:ascii="AppleGothic" w:hAnsi="AppleGothic" w:eastAsia="AppleGothic"/>
                 <w:b w:val="0"/>
                 <w:i w:val="0"/>
                 <w:color w:val="000000"/>
@@ -220,7 +220,7 @@
             </w:pPr>
             <w:r>
               <w:rPr>
-                <w:rFonts w:ascii="Arial Unicode MS" w:hAnsi="Arial Unicode MS" w:eastAsia="Arial Unicode MS"/>
+                <w:rFonts w:ascii="AppleGothic" w:hAnsi="AppleGothic" w:eastAsia="AppleGothic"/>
                 <w:b w:val="0"/>
                 <w:i w:val="0"/>
                 <w:color w:val="000000"/>
@@ -254,7 +254,7 @@
             </w:pPr>
             <w:r>
               <w:rPr>
-                <w:rFonts w:ascii="Arial Unicode MS" w:hAnsi="Arial Unicode MS" w:eastAsia="Arial Unicode MS"/>
+                <w:rFonts w:ascii="AppleGothic" w:hAnsi="AppleGothic" w:eastAsia="AppleGothic"/>
                 <w:b w:val="0"/>
                 <w:i w:val="0"/>
                 <w:color w:val="000000"/>
@@ -282,7 +282,7 @@
             </w:pPr>
             <w:r>
               <w:rPr>
-                <w:rFonts w:ascii="Arial Unicode MS" w:hAnsi="Arial Unicode MS" w:eastAsia="Arial Unicode MS"/>
+                <w:rFonts w:ascii="AppleGothic" w:hAnsi="AppleGothic" w:eastAsia="AppleGothic"/>
                 <w:b w:val="0"/>
                 <w:i w:val="0"/>
                 <w:color w:val="000000"/>
@@ -316,7 +316,7 @@
             </w:pPr>
             <w:r>
               <w:rPr>
-                <w:rFonts w:ascii="Arial Unicode MS" w:hAnsi="Arial Unicode MS" w:eastAsia="Arial Unicode MS"/>
+                <w:rFonts w:ascii="AppleGothic" w:hAnsi="AppleGothic" w:eastAsia="AppleGothic"/>
                 <w:b w:val="0"/>
                 <w:i w:val="0"/>
                 <w:color w:val="000000"/>
@@ -344,7 +344,7 @@
             </w:pPr>
             <w:r>
               <w:rPr>
-                <w:rFonts w:ascii="Arial Unicode MS" w:hAnsi="Arial Unicode MS" w:eastAsia="Arial Unicode MS"/>
+                <w:rFonts w:ascii="AppleGothic" w:hAnsi="AppleGothic" w:eastAsia="AppleGothic"/>
                 <w:b w:val="0"/>
                 <w:i w:val="0"/>
                 <w:color w:val="000000"/>
@@ -378,7 +378,7 @@
             </w:pPr>
             <w:r>
               <w:rPr>
-                <w:rFonts w:ascii="Arial Unicode MS" w:hAnsi="Arial Unicode MS" w:eastAsia="Arial Unicode MS"/>
+                <w:rFonts w:ascii="AppleGothic" w:hAnsi="AppleGothic" w:eastAsia="AppleGothic"/>
                 <w:b w:val="0"/>
                 <w:i w:val="0"/>
                 <w:color w:val="000000"/>
@@ -406,13 +406,13 @@
             </w:pPr>
             <w:r>
               <w:rPr>
-                <w:rFonts w:ascii="Arial Unicode MS" w:hAnsi="Arial Unicode MS" w:eastAsia="Arial Unicode MS"/>
+                <w:rFonts w:ascii="AppleGothic" w:hAnsi="AppleGothic" w:eastAsia="AppleGothic"/>
                 <w:b w:val="0"/>
                 <w:i w:val="0"/>
                 <w:color w:val="000000"/>
                 <w:sz w:val="18"/>
               </w:rPr>
-              <w:t>2026년 8월 16일</w:t>
+              <w:t>2026년 8월 17일</w:t>
             </w:r>
           </w:p>
         </w:tc>
@@ -440,7 +440,7 @@
             </w:pPr>
             <w:r>
               <w:rPr>
-                <w:rFonts w:ascii="Arial Unicode MS" w:hAnsi="Arial Unicode MS" w:eastAsia="Arial Unicode MS"/>
+                <w:rFonts w:ascii="AppleGothic" w:hAnsi="AppleGothic" w:eastAsia="AppleGothic"/>
                 <w:b w:val="0"/>
                 <w:i w:val="0"/>
                 <w:color w:val="000000"/>
@@ -468,7 +468,7 @@
             </w:pPr>
             <w:r>
               <w:rPr>
-                <w:rFonts w:ascii="Arial Unicode MS" w:hAnsi="Arial Unicode MS" w:eastAsia="Arial Unicode MS"/>
+                <w:rFonts w:ascii="AppleGothic" w:hAnsi="AppleGothic" w:eastAsia="AppleGothic"/>
                 <w:b w:val="0"/>
                 <w:i w:val="0"/>
                 <w:color w:val="000000"/>
@@ -491,7 +491,7 @@
       </w:pPr>
       <w:r>
         <w:rPr>
-          <w:rFonts w:ascii="Arial Unicode MS" w:hAnsi="Arial Unicode MS" w:eastAsia="Arial Unicode MS"/>
+          <w:rFonts w:ascii="AppleGothic" w:hAnsi="AppleGothic" w:eastAsia="AppleGothic"/>
           <w:b w:val="0"/>
           <w:i/>
           <w:color w:val="666666"/>
@@ -527,7 +527,7 @@
       </w:pPr>
       <w:r>
         <w:rPr>
-          <w:rFonts w:ascii="Arial Unicode MS" w:hAnsi="Arial Unicode MS" w:eastAsia="Arial Unicode MS"/>
+          <w:rFonts w:ascii="AppleGothic" w:hAnsi="AppleGothic" w:eastAsia="AppleGothic"/>
           <w:b/>
           <w:i w:val="0"/>
           <w:color w:val="0B2545"/>
@@ -537,7 +537,7 @@
       </w:r>
       <w:r>
         <w:rPr>
-          <w:rFonts w:ascii="Arial Unicode MS" w:hAnsi="Arial Unicode MS" w:eastAsia="Arial Unicode MS"/>
+          <w:rFonts w:ascii="AppleGothic" w:hAnsi="AppleGothic" w:eastAsia="AppleGothic"/>
           <w:b w:val="0"/>
           <w:i w:val="0"/>
           <w:color w:val="0B2545"/>
@@ -549,7 +549,7 @@
     <w:p>
       <w:r>
         <w:rPr>
-          <w:rFonts w:ascii="Arial Unicode MS" w:hAnsi="Arial Unicode MS" w:eastAsia="Arial Unicode MS"/>
+          <w:rFonts w:ascii="AppleGothic" w:hAnsi="AppleGothic" w:eastAsia="AppleGothic"/>
           <w:b w:val="0"/>
           <w:i w:val="0"/>
           <w:color w:val="000000"/>
@@ -561,7 +561,7 @@
     <w:p>
       <w:r>
         <w:rPr>
-          <w:rFonts w:ascii="Arial Unicode MS" w:hAnsi="Arial Unicode MS" w:eastAsia="Arial Unicode MS"/>
+          <w:rFonts w:ascii="AppleGothic" w:hAnsi="AppleGothic" w:eastAsia="AppleGothic"/>
           <w:b w:val="0"/>
           <w:i w:val="0"/>
           <w:color w:val="000000"/>
@@ -587,7 +587,7 @@
       </w:pPr>
       <w:r>
         <w:rPr>
-          <w:rFonts w:ascii="Arial Unicode MS" w:hAnsi="Arial Unicode MS" w:eastAsia="Arial Unicode MS"/>
+          <w:rFonts w:ascii="AppleGothic" w:hAnsi="AppleGothic" w:eastAsia="AppleGothic"/>
           <w:b w:val="0"/>
           <w:i w:val="0"/>
           <w:color w:val="000000"/>
@@ -605,7 +605,7 @@
       </w:pPr>
       <w:r>
         <w:rPr>
-          <w:rFonts w:ascii="Arial Unicode MS" w:hAnsi="Arial Unicode MS" w:eastAsia="Arial Unicode MS"/>
+          <w:rFonts w:ascii="AppleGothic" w:hAnsi="AppleGothic" w:eastAsia="AppleGothic"/>
           <w:b w:val="0"/>
           <w:i w:val="0"/>
           <w:color w:val="000000"/>
@@ -623,7 +623,7 @@
       </w:pPr>
       <w:r>
         <w:rPr>
-          <w:rFonts w:ascii="Arial Unicode MS" w:hAnsi="Arial Unicode MS" w:eastAsia="Arial Unicode MS"/>
+          <w:rFonts w:ascii="AppleGothic" w:hAnsi="AppleGothic" w:eastAsia="AppleGothic"/>
           <w:b w:val="0"/>
           <w:i w:val="0"/>
           <w:color w:val="000000"/>
@@ -641,7 +641,7 @@
       </w:pPr>
       <w:r>
         <w:rPr>
-          <w:rFonts w:ascii="Arial Unicode MS" w:hAnsi="Arial Unicode MS" w:eastAsia="Arial Unicode MS"/>
+          <w:rFonts w:ascii="AppleGothic" w:hAnsi="AppleGothic" w:eastAsia="AppleGothic"/>
           <w:b w:val="0"/>
           <w:i w:val="0"/>
           <w:color w:val="000000"/>
@@ -695,7 +695,7 @@
       </w:pPr>
       <w:r>
         <w:rPr>
-          <w:rFonts w:ascii="Arial Unicode MS" w:hAnsi="Arial Unicode MS" w:eastAsia="Arial Unicode MS"/>
+          <w:rFonts w:ascii="AppleGothic" w:hAnsi="AppleGothic" w:eastAsia="AppleGothic"/>
           <w:b w:val="0"/>
           <w:i w:val="0"/>
           <w:color w:val="000000"/>
@@ -713,7 +713,7 @@
       </w:pPr>
       <w:r>
         <w:rPr>
-          <w:rFonts w:ascii="Arial Unicode MS" w:hAnsi="Arial Unicode MS" w:eastAsia="Arial Unicode MS"/>
+          <w:rFonts w:ascii="AppleGothic" w:hAnsi="AppleGothic" w:eastAsia="AppleGothic"/>
           <w:b w:val="0"/>
           <w:i w:val="0"/>
           <w:color w:val="000000"/>
@@ -731,7 +731,7 @@
       </w:pPr>
       <w:r>
         <w:rPr>
-          <w:rFonts w:ascii="Arial Unicode MS" w:hAnsi="Arial Unicode MS" w:eastAsia="Arial Unicode MS"/>
+          <w:rFonts w:ascii="AppleGothic" w:hAnsi="AppleGothic" w:eastAsia="AppleGothic"/>
           <w:b w:val="0"/>
           <w:i w:val="0"/>
           <w:color w:val="000000"/>
@@ -749,7 +749,7 @@
       </w:pPr>
       <w:r>
         <w:rPr>
-          <w:rFonts w:ascii="Arial Unicode MS" w:hAnsi="Arial Unicode MS" w:eastAsia="Arial Unicode MS"/>
+          <w:rFonts w:ascii="AppleGothic" w:hAnsi="AppleGothic" w:eastAsia="AppleGothic"/>
           <w:b w:val="0"/>
           <w:i w:val="0"/>
           <w:color w:val="000000"/>
@@ -767,7 +767,7 @@
       </w:pPr>
       <w:r>
         <w:rPr>
-          <w:rFonts w:ascii="Arial Unicode MS" w:hAnsi="Arial Unicode MS" w:eastAsia="Arial Unicode MS"/>
+          <w:rFonts w:ascii="AppleGothic" w:hAnsi="AppleGothic" w:eastAsia="AppleGothic"/>
           <w:b w:val="0"/>
           <w:i w:val="0"/>
           <w:color w:val="000000"/>
@@ -822,7 +822,7 @@
             </w:pPr>
             <w:r>
               <w:rPr>
-                <w:rFonts w:ascii="Arial Unicode MS" w:hAnsi="Arial Unicode MS" w:eastAsia="Arial Unicode MS"/>
+                <w:rFonts w:ascii="AppleGothic" w:hAnsi="AppleGothic" w:eastAsia="AppleGothic"/>
                 <w:b/>
                 <w:i w:val="0"/>
                 <w:color w:val="0B2545"/>
@@ -851,7 +851,7 @@
             </w:pPr>
             <w:r>
               <w:rPr>
-                <w:rFonts w:ascii="Arial Unicode MS" w:hAnsi="Arial Unicode MS" w:eastAsia="Arial Unicode MS"/>
+                <w:rFonts w:ascii="AppleGothic" w:hAnsi="AppleGothic" w:eastAsia="AppleGothic"/>
                 <w:b/>
                 <w:i w:val="0"/>
                 <w:color w:val="0B2545"/>
@@ -885,7 +885,7 @@
             </w:pPr>
             <w:r>
               <w:rPr>
-                <w:rFonts w:ascii="Arial Unicode MS" w:hAnsi="Arial Unicode MS" w:eastAsia="Arial Unicode MS"/>
+                <w:rFonts w:ascii="AppleGothic" w:hAnsi="AppleGothic" w:eastAsia="AppleGothic"/>
                 <w:b w:val="0"/>
                 <w:i w:val="0"/>
                 <w:color w:val="000000"/>
@@ -913,7 +913,7 @@
             </w:pPr>
             <w:r>
               <w:rPr>
-                <w:rFonts w:ascii="Arial Unicode MS" w:hAnsi="Arial Unicode MS" w:eastAsia="Arial Unicode MS"/>
+                <w:rFonts w:ascii="AppleGothic" w:hAnsi="AppleGothic" w:eastAsia="AppleGothic"/>
                 <w:b w:val="0"/>
                 <w:i w:val="0"/>
                 <w:color w:val="000000"/>
@@ -947,7 +947,7 @@
             </w:pPr>
             <w:r>
               <w:rPr>
-                <w:rFonts w:ascii="Arial Unicode MS" w:hAnsi="Arial Unicode MS" w:eastAsia="Arial Unicode MS"/>
+                <w:rFonts w:ascii="AppleGothic" w:hAnsi="AppleGothic" w:eastAsia="AppleGothic"/>
                 <w:b w:val="0"/>
                 <w:i w:val="0"/>
                 <w:color w:val="000000"/>
@@ -975,7 +975,7 @@
             </w:pPr>
             <w:r>
               <w:rPr>
-                <w:rFonts w:ascii="Arial Unicode MS" w:hAnsi="Arial Unicode MS" w:eastAsia="Arial Unicode MS"/>
+                <w:rFonts w:ascii="AppleGothic" w:hAnsi="AppleGothic" w:eastAsia="AppleGothic"/>
                 <w:b w:val="0"/>
                 <w:i w:val="0"/>
                 <w:color w:val="000000"/>
@@ -1009,7 +1009,7 @@
             </w:pPr>
             <w:r>
               <w:rPr>
-                <w:rFonts w:ascii="Arial Unicode MS" w:hAnsi="Arial Unicode MS" w:eastAsia="Arial Unicode MS"/>
+                <w:rFonts w:ascii="AppleGothic" w:hAnsi="AppleGothic" w:eastAsia="AppleGothic"/>
                 <w:b w:val="0"/>
                 <w:i w:val="0"/>
                 <w:color w:val="000000"/>
@@ -1037,7 +1037,7 @@
             </w:pPr>
             <w:r>
               <w:rPr>
-                <w:rFonts w:ascii="Arial Unicode MS" w:hAnsi="Arial Unicode MS" w:eastAsia="Arial Unicode MS"/>
+                <w:rFonts w:ascii="AppleGothic" w:hAnsi="AppleGothic" w:eastAsia="AppleGothic"/>
                 <w:b w:val="0"/>
                 <w:i w:val="0"/>
                 <w:color w:val="000000"/>
@@ -1071,7 +1071,7 @@
             </w:pPr>
             <w:r>
               <w:rPr>
-                <w:rFonts w:ascii="Arial Unicode MS" w:hAnsi="Arial Unicode MS" w:eastAsia="Arial Unicode MS"/>
+                <w:rFonts w:ascii="AppleGothic" w:hAnsi="AppleGothic" w:eastAsia="AppleGothic"/>
                 <w:b w:val="0"/>
                 <w:i w:val="0"/>
                 <w:color w:val="000000"/>
@@ -1099,7 +1099,7 @@
             </w:pPr>
             <w:r>
               <w:rPr>
-                <w:rFonts w:ascii="Arial Unicode MS" w:hAnsi="Arial Unicode MS" w:eastAsia="Arial Unicode MS"/>
+                <w:rFonts w:ascii="AppleGothic" w:hAnsi="AppleGothic" w:eastAsia="AppleGothic"/>
                 <w:b w:val="0"/>
                 <w:i w:val="0"/>
                 <w:color w:val="000000"/>
@@ -1133,7 +1133,7 @@
             </w:pPr>
             <w:r>
               <w:rPr>
-                <w:rFonts w:ascii="Arial Unicode MS" w:hAnsi="Arial Unicode MS" w:eastAsia="Arial Unicode MS"/>
+                <w:rFonts w:ascii="AppleGothic" w:hAnsi="AppleGothic" w:eastAsia="AppleGothic"/>
                 <w:b w:val="0"/>
                 <w:i w:val="0"/>
                 <w:color w:val="000000"/>
@@ -1161,7 +1161,7 @@
             </w:pPr>
             <w:r>
               <w:rPr>
-                <w:rFonts w:ascii="Arial Unicode MS" w:hAnsi="Arial Unicode MS" w:eastAsia="Arial Unicode MS"/>
+                <w:rFonts w:ascii="AppleGothic" w:hAnsi="AppleGothic" w:eastAsia="AppleGothic"/>
                 <w:b w:val="0"/>
                 <w:i w:val="0"/>
                 <w:color w:val="000000"/>
@@ -1195,7 +1195,7 @@
             </w:pPr>
             <w:r>
               <w:rPr>
-                <w:rFonts w:ascii="Arial Unicode MS" w:hAnsi="Arial Unicode MS" w:eastAsia="Arial Unicode MS"/>
+                <w:rFonts w:ascii="AppleGothic" w:hAnsi="AppleGothic" w:eastAsia="AppleGothic"/>
                 <w:b w:val="0"/>
                 <w:i w:val="0"/>
                 <w:color w:val="000000"/>
@@ -1223,7 +1223,7 @@
             </w:pPr>
             <w:r>
               <w:rPr>
-                <w:rFonts w:ascii="Arial Unicode MS" w:hAnsi="Arial Unicode MS" w:eastAsia="Arial Unicode MS"/>
+                <w:rFonts w:ascii="AppleGothic" w:hAnsi="AppleGothic" w:eastAsia="AppleGothic"/>
                 <w:b w:val="0"/>
                 <w:i w:val="0"/>
                 <w:color w:val="000000"/>
@@ -1243,7 +1243,7 @@
     <w:p>
       <w:r>
         <w:rPr>
-          <w:rFonts w:ascii="Arial Unicode MS" w:hAnsi="Arial Unicode MS" w:eastAsia="Arial Unicode MS"/>
+          <w:rFonts w:ascii="AppleGothic" w:hAnsi="AppleGothic" w:eastAsia="AppleGothic"/>
           <w:b w:val="0"/>
           <w:i w:val="0"/>
           <w:color w:val="000000"/>
@@ -1299,7 +1299,7 @@
             </w:pPr>
             <w:r>
               <w:rPr>
-                <w:rFonts w:ascii="Arial Unicode MS" w:hAnsi="Arial Unicode MS" w:eastAsia="Arial Unicode MS"/>
+                <w:rFonts w:ascii="AppleGothic" w:hAnsi="AppleGothic" w:eastAsia="AppleGothic"/>
                 <w:b/>
                 <w:i w:val="0"/>
                 <w:color w:val="0B2545"/>
@@ -1328,7 +1328,7 @@
             </w:pPr>
             <w:r>
               <w:rPr>
-                <w:rFonts w:ascii="Arial Unicode MS" w:hAnsi="Arial Unicode MS" w:eastAsia="Arial Unicode MS"/>
+                <w:rFonts w:ascii="AppleGothic" w:hAnsi="AppleGothic" w:eastAsia="AppleGothic"/>
                 <w:b/>
                 <w:i w:val="0"/>
                 <w:color w:val="0B2545"/>
@@ -1357,7 +1357,7 @@
             </w:pPr>
             <w:r>
               <w:rPr>
-                <w:rFonts w:ascii="Arial Unicode MS" w:hAnsi="Arial Unicode MS" w:eastAsia="Arial Unicode MS"/>
+                <w:rFonts w:ascii="AppleGothic" w:hAnsi="AppleGothic" w:eastAsia="AppleGothic"/>
                 <w:b/>
                 <w:i w:val="0"/>
                 <w:color w:val="0B2545"/>
@@ -1391,7 +1391,7 @@
             </w:pPr>
             <w:r>
               <w:rPr>
-                <w:rFonts w:ascii="Arial Unicode MS" w:hAnsi="Arial Unicode MS" w:eastAsia="Arial Unicode MS"/>
+                <w:rFonts w:ascii="AppleGothic" w:hAnsi="AppleGothic" w:eastAsia="AppleGothic"/>
                 <w:b w:val="0"/>
                 <w:i w:val="0"/>
                 <w:color w:val="000000"/>
@@ -1419,7 +1419,7 @@
             </w:pPr>
             <w:r>
               <w:rPr>
-                <w:rFonts w:ascii="Arial Unicode MS" w:hAnsi="Arial Unicode MS" w:eastAsia="Arial Unicode MS"/>
+                <w:rFonts w:ascii="AppleGothic" w:hAnsi="AppleGothic" w:eastAsia="AppleGothic"/>
                 <w:b w:val="0"/>
                 <w:i w:val="0"/>
                 <w:color w:val="000000"/>
@@ -1447,7 +1447,7 @@
             </w:pPr>
             <w:r>
               <w:rPr>
-                <w:rFonts w:ascii="Arial Unicode MS" w:hAnsi="Arial Unicode MS" w:eastAsia="Arial Unicode MS"/>
+                <w:rFonts w:ascii="AppleGothic" w:hAnsi="AppleGothic" w:eastAsia="AppleGothic"/>
                 <w:b w:val="0"/>
                 <w:i w:val="0"/>
                 <w:color w:val="000000"/>
@@ -1481,7 +1481,7 @@
             </w:pPr>
             <w:r>
               <w:rPr>
-                <w:rFonts w:ascii="Arial Unicode MS" w:hAnsi="Arial Unicode MS" w:eastAsia="Arial Unicode MS"/>
+                <w:rFonts w:ascii="AppleGothic" w:hAnsi="AppleGothic" w:eastAsia="AppleGothic"/>
                 <w:b w:val="0"/>
                 <w:i w:val="0"/>
                 <w:color w:val="000000"/>
@@ -1509,7 +1509,7 @@
             </w:pPr>
             <w:r>
               <w:rPr>
-                <w:rFonts w:ascii="Arial Unicode MS" w:hAnsi="Arial Unicode MS" w:eastAsia="Arial Unicode MS"/>
+                <w:rFonts w:ascii="AppleGothic" w:hAnsi="AppleGothic" w:eastAsia="AppleGothic"/>
                 <w:b w:val="0"/>
                 <w:i w:val="0"/>
                 <w:color w:val="000000"/>
@@ -1537,7 +1537,7 @@
             </w:pPr>
             <w:r>
               <w:rPr>
-                <w:rFonts w:ascii="Arial Unicode MS" w:hAnsi="Arial Unicode MS" w:eastAsia="Arial Unicode MS"/>
+                <w:rFonts w:ascii="AppleGothic" w:hAnsi="AppleGothic" w:eastAsia="AppleGothic"/>
                 <w:b w:val="0"/>
                 <w:i w:val="0"/>
                 <w:color w:val="000000"/>
@@ -1571,7 +1571,7 @@
             </w:pPr>
             <w:r>
               <w:rPr>
-                <w:rFonts w:ascii="Arial Unicode MS" w:hAnsi="Arial Unicode MS" w:eastAsia="Arial Unicode MS"/>
+                <w:rFonts w:ascii="AppleGothic" w:hAnsi="AppleGothic" w:eastAsia="AppleGothic"/>
                 <w:b w:val="0"/>
                 <w:i w:val="0"/>
                 <w:color w:val="000000"/>
@@ -1599,7 +1599,7 @@
             </w:pPr>
             <w:r>
               <w:rPr>
-                <w:rFonts w:ascii="Arial Unicode MS" w:hAnsi="Arial Unicode MS" w:eastAsia="Arial Unicode MS"/>
+                <w:rFonts w:ascii="AppleGothic" w:hAnsi="AppleGothic" w:eastAsia="AppleGothic"/>
                 <w:b w:val="0"/>
                 <w:i w:val="0"/>
                 <w:color w:val="000000"/>
@@ -1627,7 +1627,7 @@
             </w:pPr>
             <w:r>
               <w:rPr>
-                <w:rFonts w:ascii="Arial Unicode MS" w:hAnsi="Arial Unicode MS" w:eastAsia="Arial Unicode MS"/>
+                <w:rFonts w:ascii="AppleGothic" w:hAnsi="AppleGothic" w:eastAsia="AppleGothic"/>
                 <w:b w:val="0"/>
                 <w:i w:val="0"/>
                 <w:color w:val="000000"/>
@@ -1661,7 +1661,7 @@
             </w:pPr>
             <w:r>
               <w:rPr>
-                <w:rFonts w:ascii="Arial Unicode MS" w:hAnsi="Arial Unicode MS" w:eastAsia="Arial Unicode MS"/>
+                <w:rFonts w:ascii="AppleGothic" w:hAnsi="AppleGothic" w:eastAsia="AppleGothic"/>
                 <w:b w:val="0"/>
                 <w:i w:val="0"/>
                 <w:color w:val="000000"/>
@@ -1689,7 +1689,7 @@
             </w:pPr>
             <w:r>
               <w:rPr>
-                <w:rFonts w:ascii="Arial Unicode MS" w:hAnsi="Arial Unicode MS" w:eastAsia="Arial Unicode MS"/>
+                <w:rFonts w:ascii="AppleGothic" w:hAnsi="AppleGothic" w:eastAsia="AppleGothic"/>
                 <w:b w:val="0"/>
                 <w:i w:val="0"/>
                 <w:color w:val="000000"/>
@@ -1717,7 +1717,7 @@
             </w:pPr>
             <w:r>
               <w:rPr>
-                <w:rFonts w:ascii="Arial Unicode MS" w:hAnsi="Arial Unicode MS" w:eastAsia="Arial Unicode MS"/>
+                <w:rFonts w:ascii="AppleGothic" w:hAnsi="AppleGothic" w:eastAsia="AppleGothic"/>
                 <w:b w:val="0"/>
                 <w:i w:val="0"/>
                 <w:color w:val="000000"/>
@@ -1751,7 +1751,7 @@
             </w:pPr>
             <w:r>
               <w:rPr>
-                <w:rFonts w:ascii="Arial Unicode MS" w:hAnsi="Arial Unicode MS" w:eastAsia="Arial Unicode MS"/>
+                <w:rFonts w:ascii="AppleGothic" w:hAnsi="AppleGothic" w:eastAsia="AppleGothic"/>
                 <w:b w:val="0"/>
                 <w:i w:val="0"/>
                 <w:color w:val="000000"/>
@@ -1779,7 +1779,7 @@
             </w:pPr>
             <w:r>
               <w:rPr>
-                <w:rFonts w:ascii="Arial Unicode MS" w:hAnsi="Arial Unicode MS" w:eastAsia="Arial Unicode MS"/>
+                <w:rFonts w:ascii="AppleGothic" w:hAnsi="AppleGothic" w:eastAsia="AppleGothic"/>
                 <w:b w:val="0"/>
                 <w:i w:val="0"/>
                 <w:color w:val="000000"/>
@@ -1807,7 +1807,7 @@
             </w:pPr>
             <w:r>
               <w:rPr>
-                <w:rFonts w:ascii="Arial Unicode MS" w:hAnsi="Arial Unicode MS" w:eastAsia="Arial Unicode MS"/>
+                <w:rFonts w:ascii="AppleGothic" w:hAnsi="AppleGothic" w:eastAsia="AppleGothic"/>
                 <w:b w:val="0"/>
                 <w:i w:val="0"/>
                 <w:color w:val="000000"/>
@@ -1841,7 +1841,7 @@
             </w:pPr>
             <w:r>
               <w:rPr>
-                <w:rFonts w:ascii="Arial Unicode MS" w:hAnsi="Arial Unicode MS" w:eastAsia="Arial Unicode MS"/>
+                <w:rFonts w:ascii="AppleGothic" w:hAnsi="AppleGothic" w:eastAsia="AppleGothic"/>
                 <w:b w:val="0"/>
                 <w:i w:val="0"/>
                 <w:color w:val="000000"/>
@@ -1869,7 +1869,7 @@
             </w:pPr>
             <w:r>
               <w:rPr>
-                <w:rFonts w:ascii="Arial Unicode MS" w:hAnsi="Arial Unicode MS" w:eastAsia="Arial Unicode MS"/>
+                <w:rFonts w:ascii="AppleGothic" w:hAnsi="AppleGothic" w:eastAsia="AppleGothic"/>
                 <w:b w:val="0"/>
                 <w:i w:val="0"/>
                 <w:color w:val="000000"/>
@@ -1897,7 +1897,7 @@
             </w:pPr>
             <w:r>
               <w:rPr>
-                <w:rFonts w:ascii="Arial Unicode MS" w:hAnsi="Arial Unicode MS" w:eastAsia="Arial Unicode MS"/>
+                <w:rFonts w:ascii="AppleGothic" w:hAnsi="AppleGothic" w:eastAsia="AppleGothic"/>
                 <w:b w:val="0"/>
                 <w:i w:val="0"/>
                 <w:color w:val="000000"/>
@@ -1917,7 +1917,7 @@
     <w:p>
       <w:r>
         <w:rPr>
-          <w:rFonts w:ascii="Arial Unicode MS" w:hAnsi="Arial Unicode MS" w:eastAsia="Arial Unicode MS"/>
+          <w:rFonts w:ascii="AppleGothic" w:hAnsi="AppleGothic" w:eastAsia="AppleGothic"/>
           <w:b w:val="0"/>
           <w:i w:val="0"/>
           <w:color w:val="000000"/>
@@ -1973,7 +1973,7 @@
             </w:pPr>
             <w:r>
               <w:rPr>
-                <w:rFonts w:ascii="Arial Unicode MS" w:hAnsi="Arial Unicode MS" w:eastAsia="Arial Unicode MS"/>
+                <w:rFonts w:ascii="AppleGothic" w:hAnsi="AppleGothic" w:eastAsia="AppleGothic"/>
                 <w:b/>
                 <w:i w:val="0"/>
                 <w:color w:val="0B2545"/>
@@ -2002,7 +2002,7 @@
             </w:pPr>
             <w:r>
               <w:rPr>
-                <w:rFonts w:ascii="Arial Unicode MS" w:hAnsi="Arial Unicode MS" w:eastAsia="Arial Unicode MS"/>
+                <w:rFonts w:ascii="AppleGothic" w:hAnsi="AppleGothic" w:eastAsia="AppleGothic"/>
                 <w:b/>
                 <w:i w:val="0"/>
                 <w:color w:val="0B2545"/>
@@ -2031,7 +2031,7 @@
             </w:pPr>
             <w:r>
               <w:rPr>
-                <w:rFonts w:ascii="Arial Unicode MS" w:hAnsi="Arial Unicode MS" w:eastAsia="Arial Unicode MS"/>
+                <w:rFonts w:ascii="AppleGothic" w:hAnsi="AppleGothic" w:eastAsia="AppleGothic"/>
                 <w:b/>
                 <w:i w:val="0"/>
                 <w:color w:val="0B2545"/>
@@ -2065,7 +2065,7 @@
             </w:pPr>
             <w:r>
               <w:rPr>
-                <w:rFonts w:ascii="Arial Unicode MS" w:hAnsi="Arial Unicode MS" w:eastAsia="Arial Unicode MS"/>
+                <w:rFonts w:ascii="AppleGothic" w:hAnsi="AppleGothic" w:eastAsia="AppleGothic"/>
                 <w:b w:val="0"/>
                 <w:i w:val="0"/>
                 <w:color w:val="000000"/>
@@ -2093,7 +2093,7 @@
             </w:pPr>
             <w:r>
               <w:rPr>
-                <w:rFonts w:ascii="Arial Unicode MS" w:hAnsi="Arial Unicode MS" w:eastAsia="Arial Unicode MS"/>
+                <w:rFonts w:ascii="AppleGothic" w:hAnsi="AppleGothic" w:eastAsia="AppleGothic"/>
                 <w:b w:val="0"/>
                 <w:i w:val="0"/>
                 <w:color w:val="000000"/>
@@ -2121,7 +2121,7 @@
             </w:pPr>
             <w:r>
               <w:rPr>
-                <w:rFonts w:ascii="Arial Unicode MS" w:hAnsi="Arial Unicode MS" w:eastAsia="Arial Unicode MS"/>
+                <w:rFonts w:ascii="AppleGothic" w:hAnsi="AppleGothic" w:eastAsia="AppleGothic"/>
                 <w:b w:val="0"/>
                 <w:i w:val="0"/>
                 <w:color w:val="000000"/>
@@ -2155,7 +2155,7 @@
             </w:pPr>
             <w:r>
               <w:rPr>
-                <w:rFonts w:ascii="Arial Unicode MS" w:hAnsi="Arial Unicode MS" w:eastAsia="Arial Unicode MS"/>
+                <w:rFonts w:ascii="AppleGothic" w:hAnsi="AppleGothic" w:eastAsia="AppleGothic"/>
                 <w:b w:val="0"/>
                 <w:i w:val="0"/>
                 <w:color w:val="000000"/>
@@ -2183,7 +2183,7 @@
             </w:pPr>
             <w:r>
               <w:rPr>
-                <w:rFonts w:ascii="Arial Unicode MS" w:hAnsi="Arial Unicode MS" w:eastAsia="Arial Unicode MS"/>
+                <w:rFonts w:ascii="AppleGothic" w:hAnsi="AppleGothic" w:eastAsia="AppleGothic"/>
                 <w:b w:val="0"/>
                 <w:i w:val="0"/>
                 <w:color w:val="000000"/>
@@ -2211,7 +2211,7 @@
             </w:pPr>
             <w:r>
               <w:rPr>
-                <w:rFonts w:ascii="Arial Unicode MS" w:hAnsi="Arial Unicode MS" w:eastAsia="Arial Unicode MS"/>
+                <w:rFonts w:ascii="AppleGothic" w:hAnsi="AppleGothic" w:eastAsia="AppleGothic"/>
                 <w:b w:val="0"/>
                 <w:i w:val="0"/>
                 <w:color w:val="000000"/>
@@ -2245,7 +2245,7 @@
             </w:pPr>
             <w:r>
               <w:rPr>
-                <w:rFonts w:ascii="Arial Unicode MS" w:hAnsi="Arial Unicode MS" w:eastAsia="Arial Unicode MS"/>
+                <w:rFonts w:ascii="AppleGothic" w:hAnsi="AppleGothic" w:eastAsia="AppleGothic"/>
                 <w:b w:val="0"/>
                 <w:i w:val="0"/>
                 <w:color w:val="000000"/>
@@ -2273,7 +2273,7 @@
             </w:pPr>
             <w:r>
               <w:rPr>
-                <w:rFonts w:ascii="Arial Unicode MS" w:hAnsi="Arial Unicode MS" w:eastAsia="Arial Unicode MS"/>
+                <w:rFonts w:ascii="AppleGothic" w:hAnsi="AppleGothic" w:eastAsia="AppleGothic"/>
                 <w:b w:val="0"/>
                 <w:i w:val="0"/>
                 <w:color w:val="000000"/>
@@ -2301,7 +2301,7 @@
             </w:pPr>
             <w:r>
               <w:rPr>
-                <w:rFonts w:ascii="Arial Unicode MS" w:hAnsi="Arial Unicode MS" w:eastAsia="Arial Unicode MS"/>
+                <w:rFonts w:ascii="AppleGothic" w:hAnsi="AppleGothic" w:eastAsia="AppleGothic"/>
                 <w:b w:val="0"/>
                 <w:i w:val="0"/>
                 <w:color w:val="000000"/>
@@ -2335,7 +2335,7 @@
             </w:pPr>
             <w:r>
               <w:rPr>
-                <w:rFonts w:ascii="Arial Unicode MS" w:hAnsi="Arial Unicode MS" w:eastAsia="Arial Unicode MS"/>
+                <w:rFonts w:ascii="AppleGothic" w:hAnsi="AppleGothic" w:eastAsia="AppleGothic"/>
                 <w:b w:val="0"/>
                 <w:i w:val="0"/>
                 <w:color w:val="000000"/>
@@ -2363,7 +2363,7 @@
             </w:pPr>
             <w:r>
               <w:rPr>
-                <w:rFonts w:ascii="Arial Unicode MS" w:hAnsi="Arial Unicode MS" w:eastAsia="Arial Unicode MS"/>
+                <w:rFonts w:ascii="AppleGothic" w:hAnsi="AppleGothic" w:eastAsia="AppleGothic"/>
                 <w:b w:val="0"/>
                 <w:i w:val="0"/>
                 <w:color w:val="000000"/>
@@ -2391,7 +2391,7 @@
             </w:pPr>
             <w:r>
               <w:rPr>
-                <w:rFonts w:ascii="Arial Unicode MS" w:hAnsi="Arial Unicode MS" w:eastAsia="Arial Unicode MS"/>
+                <w:rFonts w:ascii="AppleGothic" w:hAnsi="AppleGothic" w:eastAsia="AppleGothic"/>
                 <w:b w:val="0"/>
                 <w:i w:val="0"/>
                 <w:color w:val="000000"/>
@@ -2425,7 +2425,7 @@
             </w:pPr>
             <w:r>
               <w:rPr>
-                <w:rFonts w:ascii="Arial Unicode MS" w:hAnsi="Arial Unicode MS" w:eastAsia="Arial Unicode MS"/>
+                <w:rFonts w:ascii="AppleGothic" w:hAnsi="AppleGothic" w:eastAsia="AppleGothic"/>
                 <w:b w:val="0"/>
                 <w:i w:val="0"/>
                 <w:color w:val="000000"/>
@@ -2453,7 +2453,7 @@
             </w:pPr>
             <w:r>
               <w:rPr>
-                <w:rFonts w:ascii="Arial Unicode MS" w:hAnsi="Arial Unicode MS" w:eastAsia="Arial Unicode MS"/>
+                <w:rFonts w:ascii="AppleGothic" w:hAnsi="AppleGothic" w:eastAsia="AppleGothic"/>
                 <w:b w:val="0"/>
                 <w:i w:val="0"/>
                 <w:color w:val="000000"/>
@@ -2481,7 +2481,7 @@
             </w:pPr>
             <w:r>
               <w:rPr>
-                <w:rFonts w:ascii="Arial Unicode MS" w:hAnsi="Arial Unicode MS" w:eastAsia="Arial Unicode MS"/>
+                <w:rFonts w:ascii="AppleGothic" w:hAnsi="AppleGothic" w:eastAsia="AppleGothic"/>
                 <w:b w:val="0"/>
                 <w:i w:val="0"/>
                 <w:color w:val="000000"/>
@@ -2515,7 +2515,7 @@
             </w:pPr>
             <w:r>
               <w:rPr>
-                <w:rFonts w:ascii="Arial Unicode MS" w:hAnsi="Arial Unicode MS" w:eastAsia="Arial Unicode MS"/>
+                <w:rFonts w:ascii="AppleGothic" w:hAnsi="AppleGothic" w:eastAsia="AppleGothic"/>
                 <w:b w:val="0"/>
                 <w:i w:val="0"/>
                 <w:color w:val="000000"/>
@@ -2543,7 +2543,7 @@
             </w:pPr>
             <w:r>
               <w:rPr>
-                <w:rFonts w:ascii="Arial Unicode MS" w:hAnsi="Arial Unicode MS" w:eastAsia="Arial Unicode MS"/>
+                <w:rFonts w:ascii="AppleGothic" w:hAnsi="AppleGothic" w:eastAsia="AppleGothic"/>
                 <w:b w:val="0"/>
                 <w:i w:val="0"/>
                 <w:color w:val="000000"/>
@@ -2571,7 +2571,7 @@
             </w:pPr>
             <w:r>
               <w:rPr>
-                <w:rFonts w:ascii="Arial Unicode MS" w:hAnsi="Arial Unicode MS" w:eastAsia="Arial Unicode MS"/>
+                <w:rFonts w:ascii="AppleGothic" w:hAnsi="AppleGothic" w:eastAsia="AppleGothic"/>
                 <w:b w:val="0"/>
                 <w:i w:val="0"/>
                 <w:color w:val="000000"/>
@@ -2605,7 +2605,7 @@
             </w:pPr>
             <w:r>
               <w:rPr>
-                <w:rFonts w:ascii="Arial Unicode MS" w:hAnsi="Arial Unicode MS" w:eastAsia="Arial Unicode MS"/>
+                <w:rFonts w:ascii="AppleGothic" w:hAnsi="AppleGothic" w:eastAsia="AppleGothic"/>
                 <w:b w:val="0"/>
                 <w:i w:val="0"/>
                 <w:color w:val="000000"/>
@@ -2633,7 +2633,7 @@
             </w:pPr>
             <w:r>
               <w:rPr>
-                <w:rFonts w:ascii="Arial Unicode MS" w:hAnsi="Arial Unicode MS" w:eastAsia="Arial Unicode MS"/>
+                <w:rFonts w:ascii="AppleGothic" w:hAnsi="AppleGothic" w:eastAsia="AppleGothic"/>
                 <w:b w:val="0"/>
                 <w:i w:val="0"/>
                 <w:color w:val="000000"/>
@@ -2661,7 +2661,7 @@
             </w:pPr>
             <w:r>
               <w:rPr>
-                <w:rFonts w:ascii="Arial Unicode MS" w:hAnsi="Arial Unicode MS" w:eastAsia="Arial Unicode MS"/>
+                <w:rFonts w:ascii="AppleGothic" w:hAnsi="AppleGothic" w:eastAsia="AppleGothic"/>
                 <w:b w:val="0"/>
                 <w:i w:val="0"/>
                 <w:color w:val="000000"/>
@@ -2700,7 +2700,7 @@
       </w:pPr>
       <w:r>
         <w:rPr>
-          <w:rFonts w:ascii="Arial Unicode MS" w:hAnsi="Arial Unicode MS" w:eastAsia="Arial Unicode MS"/>
+          <w:rFonts w:ascii="AppleGothic" w:hAnsi="AppleGothic" w:eastAsia="AppleGothic"/>
           <w:b/>
           <w:i w:val="0"/>
           <w:color w:val="0B2545"/>
@@ -2710,13 +2710,13 @@
       </w:r>
       <w:r>
         <w:rPr>
-          <w:rFonts w:ascii="Arial Unicode MS" w:hAnsi="Arial Unicode MS" w:eastAsia="Arial Unicode MS"/>
+          <w:rFonts w:ascii="AppleGothic" w:hAnsi="AppleGothic" w:eastAsia="AppleGothic"/>
           <w:b w:val="0"/>
           <w:i w:val="0"/>
           <w:color w:val="0B2545"/>
           <w:sz w:val="21"/>
         </w:rPr>
-        <w:t>2026-08-16 동결 브랜치에서 279 tests + 6 subtests가 통과했다. GitHub Actions는 Python 3.10/3.12 × GCC/Clang, PyTorch frontend/wheel, ARM/RISC-V cross-toolchain, ESP-IDF 3종을 검증한다.</w:t>
+        <w:t>2026-08-17 제출 준비 브랜치에서 287 tests + 6 subtests가 통과했다. GitHub Actions는 Python 3.10/3.12 × GCC/Clang, PyTorch frontend/wheel, ARM/RISC-V cross-toolchain, ESP-IDF 3종을 검증한다.</w:t>
       </w:r>
     </w:p>
     <w:p>
@@ -2728,7 +2728,7 @@
       </w:pPr>
       <w:r>
         <w:rPr>
-          <w:rFonts w:ascii="Arial Unicode MS" w:hAnsi="Arial Unicode MS" w:eastAsia="Arial Unicode MS"/>
+          <w:rFonts w:ascii="AppleGothic" w:hAnsi="AppleGothic" w:eastAsia="AppleGothic"/>
           <w:b w:val="0"/>
           <w:i w:val="0"/>
           <w:color w:val="000000"/>
@@ -2746,7 +2746,7 @@
       </w:pPr>
       <w:r>
         <w:rPr>
-          <w:rFonts w:ascii="Arial Unicode MS" w:hAnsi="Arial Unicode MS" w:eastAsia="Arial Unicode MS"/>
+          <w:rFonts w:ascii="AppleGothic" w:hAnsi="AppleGothic" w:eastAsia="AppleGothic"/>
           <w:b w:val="0"/>
           <w:i w:val="0"/>
           <w:color w:val="000000"/>
@@ -2764,7 +2764,7 @@
       </w:pPr>
       <w:r>
         <w:rPr>
-          <w:rFonts w:ascii="Arial Unicode MS" w:hAnsi="Arial Unicode MS" w:eastAsia="Arial Unicode MS"/>
+          <w:rFonts w:ascii="AppleGothic" w:hAnsi="AppleGothic" w:eastAsia="AppleGothic"/>
           <w:b w:val="0"/>
           <w:i w:val="0"/>
           <w:color w:val="000000"/>
@@ -2782,7 +2782,7 @@
       </w:pPr>
       <w:r>
         <w:rPr>
-          <w:rFonts w:ascii="Arial Unicode MS" w:hAnsi="Arial Unicode MS" w:eastAsia="Arial Unicode MS"/>
+          <w:rFonts w:ascii="AppleGothic" w:hAnsi="AppleGothic" w:eastAsia="AppleGothic"/>
           <w:b w:val="0"/>
           <w:i w:val="0"/>
           <w:color w:val="000000"/>
@@ -2800,7 +2800,7 @@
       </w:pPr>
       <w:r>
         <w:rPr>
-          <w:rFonts w:ascii="Arial Unicode MS" w:hAnsi="Arial Unicode MS" w:eastAsia="Arial Unicode MS"/>
+          <w:rFonts w:ascii="AppleGothic" w:hAnsi="AppleGothic" w:eastAsia="AppleGothic"/>
           <w:b w:val="0"/>
           <w:i w:val="0"/>
           <w:color w:val="000000"/>
@@ -2818,15 +2818,380 @@
       </w:r>
     </w:p>
     <w:p>
+      <w:pPr>
+        <w:shd w:fill="E8EEF5"/>
+        <w:pBdr>
+          <w:top w:val="single" w:sz="8" w:space="5" w:color="000000"/>
+          <w:left w:val="single" w:sz="8" w:space="5" w:color="000000"/>
+          <w:bottom w:val="single" w:sz="8" w:space="5" w:color="000000"/>
+          <w:right w:val="single" w:sz="8" w:space="5" w:color="000000"/>
+        </w:pBdr>
+        <w:spacing w:before="80" w:after="160"/>
+        <w:ind w:left="115" w:right="115"/>
+      </w:pPr>
       <w:r>
         <w:rPr>
-          <w:rFonts w:ascii="Arial Unicode MS" w:hAnsi="Arial Unicode MS" w:eastAsia="Arial Unicode MS"/>
+          <w:rFonts w:ascii="AppleGothic" w:hAnsi="AppleGothic" w:eastAsia="AppleGothic"/>
+          <w:b/>
+          <w:i w:val="0"/>
+          <w:color w:val="0B2545"/>
+          <w:sz w:val="21"/>
+        </w:rPr>
+        <w:t xml:space="preserve">trained MNIST full model  </w:t>
+      </w:r>
+      <w:r>
+        <w:rPr>
+          <w:rFonts w:ascii="AppleGothic" w:hAnsi="AppleGothic" w:eastAsia="AppleGothic"/>
+          <w:b w:val="0"/>
+          <w:i w:val="0"/>
+          <w:color w:val="0B2545"/>
+          <w:sz w:val="21"/>
+        </w:rPr>
+        <w:t>고정 seed로 60,000장을 4 epoch 학습한 CNN은 FP32 96.92%, 생성 C INT8 97.02%를 기록했다. 전체 10,000장 추론과 1,280 output-byte Python↔C 비교를 수행했으며 mismatch는 0이었다.</w:t>
+      </w:r>
+    </w:p>
+    <w:tbl>
+      <w:tblPr>
+        <w:tblStyle w:val="TableGrid"/>
+        <w:tblW w:type="dxa" w:w="9360"/>
+        <w:tblLayout w:type="fixed"/>
+        <w:tblLook w:firstColumn="1" w:firstRow="1" w:lastColumn="0" w:lastRow="0" w:noHBand="0" w:noVBand="1" w:val="04A0"/>
+        <w:tblInd w:w="120" w:type="dxa"/>
+      </w:tblPr>
+      <w:tblGrid>
+        <w:gridCol w:w="3300"/>
+        <w:gridCol w:w="6060"/>
+      </w:tblGrid>
+      <w:tr>
+        <w:trPr>
+          <w:trHeight w:hRule="atLeast"/>
+          <w:cantSplit/>
+          <w:tblHeader w:val="true"/>
+          <w:cantSplit/>
+        </w:trPr>
+        <w:tc>
+          <w:tcPr>
+            <w:tcW w:type="dxa" w:w="3300"/>
+            <w:vAlign w:val="center"/>
+            <w:tcMar>
+              <w:top w:w="80" w:type="dxa"/>
+              <w:bottom w:w="80" w:type="dxa"/>
+              <w:start w:w="120" w:type="dxa"/>
+              <w:end w:w="120" w:type="dxa"/>
+            </w:tcMar>
+            <w:shd w:fill="F2F4F7"/>
+          </w:tcPr>
+          <w:p>
+            <w:pPr>
+              <w:spacing w:after="0"/>
+              <w:jc w:val="left"/>
+            </w:pPr>
+            <w:r>
+              <w:rPr>
+                <w:rFonts w:ascii="AppleGothic" w:hAnsi="AppleGothic" w:eastAsia="AppleGothic"/>
+                <w:b/>
+                <w:i w:val="0"/>
+                <w:color w:val="0B2545"/>
+                <w:sz w:val="19"/>
+              </w:rPr>
+              <w:t>증거</w:t>
+            </w:r>
+          </w:p>
+        </w:tc>
+        <w:tc>
+          <w:tcPr>
+            <w:tcW w:type="dxa" w:w="6060"/>
+            <w:vAlign w:val="center"/>
+            <w:tcMar>
+              <w:top w:w="80" w:type="dxa"/>
+              <w:bottom w:w="80" w:type="dxa"/>
+              <w:start w:w="120" w:type="dxa"/>
+              <w:end w:w="120" w:type="dxa"/>
+            </w:tcMar>
+            <w:shd w:fill="F2F4F7"/>
+          </w:tcPr>
+          <w:p>
+            <w:pPr>
+              <w:spacing w:after="0"/>
+              <w:jc w:val="left"/>
+            </w:pPr>
+            <w:r>
+              <w:rPr>
+                <w:rFonts w:ascii="AppleGothic" w:hAnsi="AppleGothic" w:eastAsia="AppleGothic"/>
+                <w:b/>
+                <w:i w:val="0"/>
+                <w:color w:val="0B2545"/>
+                <w:sz w:val="19"/>
+              </w:rPr>
+              <w:t>값</w:t>
+            </w:r>
+          </w:p>
+        </w:tc>
+      </w:tr>
+      <w:tr>
+        <w:trPr>
+          <w:trHeight w:hRule="atLeast"/>
+          <w:cantSplit/>
+        </w:trPr>
+        <w:tc>
+          <w:tcPr>
+            <w:tcW w:type="dxa" w:w="3300"/>
+            <w:vAlign w:val="center"/>
+            <w:tcMar>
+              <w:top w:w="80" w:type="dxa"/>
+              <w:bottom w:w="80" w:type="dxa"/>
+              <w:start w:w="120" w:type="dxa"/>
+              <w:end w:w="120" w:type="dxa"/>
+            </w:tcMar>
+          </w:tcPr>
+          <w:p>
+            <w:pPr>
+              <w:spacing w:after="0"/>
+              <w:jc w:val="left"/>
+            </w:pPr>
+            <w:r>
+              <w:rPr>
+                <w:rFonts w:ascii="AppleGothic" w:hAnsi="AppleGothic" w:eastAsia="AppleGothic"/>
+                <w:b w:val="0"/>
+                <w:i w:val="0"/>
+                <w:color w:val="000000"/>
+                <w:sz w:val="18"/>
+              </w:rPr>
+              <w:t>FP32 checkpoint logical SHA-256</w:t>
+            </w:r>
+          </w:p>
+        </w:tc>
+        <w:tc>
+          <w:tcPr>
+            <w:tcW w:type="dxa" w:w="6060"/>
+            <w:vAlign w:val="center"/>
+            <w:tcMar>
+              <w:top w:w="80" w:type="dxa"/>
+              <w:bottom w:w="80" w:type="dxa"/>
+              <w:start w:w="120" w:type="dxa"/>
+              <w:end w:w="120" w:type="dxa"/>
+            </w:tcMar>
+          </w:tcPr>
+          <w:p>
+            <w:pPr>
+              <w:spacing w:after="0"/>
+              <w:jc w:val="left"/>
+            </w:pPr>
+            <w:r>
+              <w:rPr>
+                <w:rFonts w:ascii="AppleGothic" w:hAnsi="AppleGothic" w:eastAsia="AppleGothic"/>
+                <w:b w:val="0"/>
+                <w:i w:val="0"/>
+                <w:color w:val="000000"/>
+                <w:sz w:val="18"/>
+              </w:rPr>
+              <w:t>733130916e926da785afc63da0786d7613b0db808c3482398ae84b41ab706840</w:t>
+            </w:r>
+          </w:p>
+        </w:tc>
+      </w:tr>
+      <w:tr>
+        <w:trPr>
+          <w:trHeight w:hRule="atLeast"/>
+          <w:cantSplit/>
+        </w:trPr>
+        <w:tc>
+          <w:tcPr>
+            <w:tcW w:type="dxa" w:w="3300"/>
+            <w:vAlign w:val="center"/>
+            <w:tcMar>
+              <w:top w:w="80" w:type="dxa"/>
+              <w:bottom w:w="80" w:type="dxa"/>
+              <w:start w:w="120" w:type="dxa"/>
+              <w:end w:w="120" w:type="dxa"/>
+            </w:tcMar>
+          </w:tcPr>
+          <w:p>
+            <w:pPr>
+              <w:spacing w:after="0"/>
+              <w:jc w:val="left"/>
+            </w:pPr>
+            <w:r>
+              <w:rPr>
+                <w:rFonts w:ascii="AppleGothic" w:hAnsi="AppleGothic" w:eastAsia="AppleGothic"/>
+                <w:b w:val="0"/>
+                <w:i w:val="0"/>
+                <w:color w:val="000000"/>
+                <w:sz w:val="18"/>
+              </w:rPr>
+              <w:t>Calibration corpus SHA-256</w:t>
+            </w:r>
+          </w:p>
+        </w:tc>
+        <w:tc>
+          <w:tcPr>
+            <w:tcW w:type="dxa" w:w="6060"/>
+            <w:vAlign w:val="center"/>
+            <w:tcMar>
+              <w:top w:w="80" w:type="dxa"/>
+              <w:bottom w:w="80" w:type="dxa"/>
+              <w:start w:w="120" w:type="dxa"/>
+              <w:end w:w="120" w:type="dxa"/>
+            </w:tcMar>
+          </w:tcPr>
+          <w:p>
+            <w:pPr>
+              <w:spacing w:after="0"/>
+              <w:jc w:val="left"/>
+            </w:pPr>
+            <w:r>
+              <w:rPr>
+                <w:rFonts w:ascii="AppleGothic" w:hAnsi="AppleGothic" w:eastAsia="AppleGothic"/>
+                <w:b w:val="0"/>
+                <w:i w:val="0"/>
+                <w:color w:val="000000"/>
+                <w:sz w:val="18"/>
+              </w:rPr>
+              <w:t>06ce2a1aaaa0f75e566b9494c17b3c1fce4063272d1ce4e879c24b868bbb4e29</w:t>
+            </w:r>
+          </w:p>
+        </w:tc>
+      </w:tr>
+      <w:tr>
+        <w:trPr>
+          <w:trHeight w:hRule="atLeast"/>
+          <w:cantSplit/>
+        </w:trPr>
+        <w:tc>
+          <w:tcPr>
+            <w:tcW w:type="dxa" w:w="3300"/>
+            <w:vAlign w:val="center"/>
+            <w:tcMar>
+              <w:top w:w="80" w:type="dxa"/>
+              <w:bottom w:w="80" w:type="dxa"/>
+              <w:start w:w="120" w:type="dxa"/>
+              <w:end w:w="120" w:type="dxa"/>
+            </w:tcMar>
+          </w:tcPr>
+          <w:p>
+            <w:pPr>
+              <w:spacing w:after="0"/>
+              <w:jc w:val="left"/>
+            </w:pPr>
+            <w:r>
+              <w:rPr>
+                <w:rFonts w:ascii="AppleGothic" w:hAnsi="AppleGothic" w:eastAsia="AppleGothic"/>
+                <w:b w:val="0"/>
+                <w:i w:val="0"/>
+                <w:color w:val="000000"/>
+                <w:sz w:val="18"/>
+              </w:rPr>
+              <w:t>Generated artifact-set SHA-256</w:t>
+            </w:r>
+          </w:p>
+        </w:tc>
+        <w:tc>
+          <w:tcPr>
+            <w:tcW w:type="dxa" w:w="6060"/>
+            <w:vAlign w:val="center"/>
+            <w:tcMar>
+              <w:top w:w="80" w:type="dxa"/>
+              <w:bottom w:w="80" w:type="dxa"/>
+              <w:start w:w="120" w:type="dxa"/>
+              <w:end w:w="120" w:type="dxa"/>
+            </w:tcMar>
+          </w:tcPr>
+          <w:p>
+            <w:pPr>
+              <w:spacing w:after="0"/>
+              <w:jc w:val="left"/>
+            </w:pPr>
+            <w:r>
+              <w:rPr>
+                <w:rFonts w:ascii="AppleGothic" w:hAnsi="AppleGothic" w:eastAsia="AppleGothic"/>
+                <w:b w:val="0"/>
+                <w:i w:val="0"/>
+                <w:color w:val="000000"/>
+                <w:sz w:val="18"/>
+              </w:rPr>
+              <w:t>cc59172a18cc8d752185ab76c4a5a50c1bdccbcbf9abf8d8457a013e63d28f12</w:t>
+            </w:r>
+          </w:p>
+        </w:tc>
+      </w:tr>
+      <w:tr>
+        <w:trPr>
+          <w:trHeight w:hRule="atLeast"/>
+          <w:cantSplit/>
+        </w:trPr>
+        <w:tc>
+          <w:tcPr>
+            <w:tcW w:type="dxa" w:w="3300"/>
+            <w:vAlign w:val="center"/>
+            <w:tcMar>
+              <w:top w:w="80" w:type="dxa"/>
+              <w:bottom w:w="80" w:type="dxa"/>
+              <w:start w:w="120" w:type="dxa"/>
+              <w:end w:w="120" w:type="dxa"/>
+            </w:tcMar>
+          </w:tcPr>
+          <w:p>
+            <w:pPr>
+              <w:spacing w:after="0"/>
+              <w:jc w:val="left"/>
+            </w:pPr>
+            <w:r>
+              <w:rPr>
+                <w:rFonts w:ascii="AppleGothic" w:hAnsi="AppleGothic" w:eastAsia="AppleGothic"/>
+                <w:b w:val="0"/>
+                <w:i w:val="0"/>
+                <w:color w:val="000000"/>
+                <w:sz w:val="18"/>
+              </w:rPr>
+              <w:t>Physical corpus</w:t>
+            </w:r>
+          </w:p>
+        </w:tc>
+        <w:tc>
+          <w:tcPr>
+            <w:tcW w:type="dxa" w:w="6060"/>
+            <w:vAlign w:val="center"/>
+            <w:tcMar>
+              <w:top w:w="80" w:type="dxa"/>
+              <w:bottom w:w="80" w:type="dxa"/>
+              <w:start w:w="120" w:type="dxa"/>
+              <w:end w:w="120" w:type="dxa"/>
+            </w:tcMar>
+          </w:tcPr>
+          <w:p>
+            <w:pPr>
+              <w:spacing w:after="0"/>
+              <w:jc w:val="left"/>
+            </w:pPr>
+            <w:r>
+              <w:rPr>
+                <w:rFonts w:ascii="AppleGothic" w:hAnsi="AppleGothic" w:eastAsia="AppleGothic"/>
+                <w:b w:val="0"/>
+                <w:i w:val="0"/>
+                <w:color w:val="000000"/>
+                <w:sz w:val="18"/>
+              </w:rPr>
+              <w:t>100장 class-balanced, Python INT8 99/100 correct, expected output hash 고정</w:t>
+            </w:r>
+          </w:p>
+        </w:tc>
+      </w:tr>
+    </w:tbl>
+    <w:p>
+      <w:pPr>
+        <w:spacing w:after="0"/>
+      </w:pPr>
+    </w:p>
+    <w:p>
+      <w:r>
+        <w:rPr>
+          <w:rFonts w:ascii="AppleGothic" w:hAnsi="AppleGothic" w:eastAsia="AppleGothic"/>
           <w:b w:val="0"/>
           <w:i w:val="0"/>
           <w:color w:val="000000"/>
           <w:sz w:val="22"/>
         </w:rPr>
-        <w:t>MNIST 2종과 CIFAR-10 4종을 각각 전체 training split으로 1 epoch 학습하고, 100개 class-balanced 이미지로 calibration한 뒤 10,000개 test 이미지를 생성 C로 실행했다.</w:t>
+        <w:t>추가 model-family smoke로 MNIST 2종과 CIFAR-10 4종을 각각 전체 training split으로 1 epoch 학습하고, 100개 class-balanced 이미지로 calibration한 뒤 10,000개 test 이미지를 생성 C로 실행했다.</w:t>
       </w:r>
     </w:p>
     <w:tbl>
@@ -2870,7 +3235,7 @@
             </w:pPr>
             <w:r>
               <w:rPr>
-                <w:rFonts w:ascii="Arial Unicode MS" w:hAnsi="Arial Unicode MS" w:eastAsia="Arial Unicode MS"/>
+                <w:rFonts w:ascii="AppleGothic" w:hAnsi="AppleGothic" w:eastAsia="AppleGothic"/>
                 <w:b/>
                 <w:i w:val="0"/>
                 <w:color w:val="0B2545"/>
@@ -2899,7 +3264,7 @@
             </w:pPr>
             <w:r>
               <w:rPr>
-                <w:rFonts w:ascii="Arial Unicode MS" w:hAnsi="Arial Unicode MS" w:eastAsia="Arial Unicode MS"/>
+                <w:rFonts w:ascii="AppleGothic" w:hAnsi="AppleGothic" w:eastAsia="AppleGothic"/>
                 <w:b/>
                 <w:i w:val="0"/>
                 <w:color w:val="0B2545"/>
@@ -2928,7 +3293,7 @@
             </w:pPr>
             <w:r>
               <w:rPr>
-                <w:rFonts w:ascii="Arial Unicode MS" w:hAnsi="Arial Unicode MS" w:eastAsia="Arial Unicode MS"/>
+                <w:rFonts w:ascii="AppleGothic" w:hAnsi="AppleGothic" w:eastAsia="AppleGothic"/>
                 <w:b/>
                 <w:i w:val="0"/>
                 <w:color w:val="0B2545"/>
@@ -2957,7 +3322,7 @@
             </w:pPr>
             <w:r>
               <w:rPr>
-                <w:rFonts w:ascii="Arial Unicode MS" w:hAnsi="Arial Unicode MS" w:eastAsia="Arial Unicode MS"/>
+                <w:rFonts w:ascii="AppleGothic" w:hAnsi="AppleGothic" w:eastAsia="AppleGothic"/>
                 <w:b/>
                 <w:i w:val="0"/>
                 <w:color w:val="0B2545"/>
@@ -2986,7 +3351,7 @@
             </w:pPr>
             <w:r>
               <w:rPr>
-                <w:rFonts w:ascii="Arial Unicode MS" w:hAnsi="Arial Unicode MS" w:eastAsia="Arial Unicode MS"/>
+                <w:rFonts w:ascii="AppleGothic" w:hAnsi="AppleGothic" w:eastAsia="AppleGothic"/>
                 <w:b/>
                 <w:i w:val="0"/>
                 <w:color w:val="0B2545"/>
@@ -3020,7 +3385,7 @@
             </w:pPr>
             <w:r>
               <w:rPr>
-                <w:rFonts w:ascii="Arial Unicode MS" w:hAnsi="Arial Unicode MS" w:eastAsia="Arial Unicode MS"/>
+                <w:rFonts w:ascii="AppleGothic" w:hAnsi="AppleGothic" w:eastAsia="AppleGothic"/>
                 <w:b w:val="0"/>
                 <w:i w:val="0"/>
                 <w:color w:val="000000"/>
@@ -3048,7 +3413,7 @@
             </w:pPr>
             <w:r>
               <w:rPr>
-                <w:rFonts w:ascii="Arial Unicode MS" w:hAnsi="Arial Unicode MS" w:eastAsia="Arial Unicode MS"/>
+                <w:rFonts w:ascii="AppleGothic" w:hAnsi="AppleGothic" w:eastAsia="AppleGothic"/>
                 <w:b w:val="0"/>
                 <w:i w:val="0"/>
                 <w:color w:val="000000"/>
@@ -3076,7 +3441,7 @@
             </w:pPr>
             <w:r>
               <w:rPr>
-                <w:rFonts w:ascii="Arial Unicode MS" w:hAnsi="Arial Unicode MS" w:eastAsia="Arial Unicode MS"/>
+                <w:rFonts w:ascii="AppleGothic" w:hAnsi="AppleGothic" w:eastAsia="AppleGothic"/>
                 <w:b w:val="0"/>
                 <w:i w:val="0"/>
                 <w:color w:val="000000"/>
@@ -3104,7 +3469,7 @@
             </w:pPr>
             <w:r>
               <w:rPr>
-                <w:rFonts w:ascii="Arial Unicode MS" w:hAnsi="Arial Unicode MS" w:eastAsia="Arial Unicode MS"/>
+                <w:rFonts w:ascii="AppleGothic" w:hAnsi="AppleGothic" w:eastAsia="AppleGothic"/>
                 <w:b w:val="0"/>
                 <w:i w:val="0"/>
                 <w:color w:val="000000"/>
@@ -3132,7 +3497,7 @@
             </w:pPr>
             <w:r>
               <w:rPr>
-                <w:rFonts w:ascii="Arial Unicode MS" w:hAnsi="Arial Unicode MS" w:eastAsia="Arial Unicode MS"/>
+                <w:rFonts w:ascii="AppleGothic" w:hAnsi="AppleGothic" w:eastAsia="AppleGothic"/>
                 <w:b w:val="0"/>
                 <w:i w:val="0"/>
                 <w:color w:val="000000"/>
@@ -3166,7 +3531,7 @@
             </w:pPr>
             <w:r>
               <w:rPr>
-                <w:rFonts w:ascii="Arial Unicode MS" w:hAnsi="Arial Unicode MS" w:eastAsia="Arial Unicode MS"/>
+                <w:rFonts w:ascii="AppleGothic" w:hAnsi="AppleGothic" w:eastAsia="AppleGothic"/>
                 <w:b w:val="0"/>
                 <w:i w:val="0"/>
                 <w:color w:val="000000"/>
@@ -3194,7 +3559,7 @@
             </w:pPr>
             <w:r>
               <w:rPr>
-                <w:rFonts w:ascii="Arial Unicode MS" w:hAnsi="Arial Unicode MS" w:eastAsia="Arial Unicode MS"/>
+                <w:rFonts w:ascii="AppleGothic" w:hAnsi="AppleGothic" w:eastAsia="AppleGothic"/>
                 <w:b w:val="0"/>
                 <w:i w:val="0"/>
                 <w:color w:val="000000"/>
@@ -3222,7 +3587,7 @@
             </w:pPr>
             <w:r>
               <w:rPr>
-                <w:rFonts w:ascii="Arial Unicode MS" w:hAnsi="Arial Unicode MS" w:eastAsia="Arial Unicode MS"/>
+                <w:rFonts w:ascii="AppleGothic" w:hAnsi="AppleGothic" w:eastAsia="AppleGothic"/>
                 <w:b w:val="0"/>
                 <w:i w:val="0"/>
                 <w:color w:val="000000"/>
@@ -3250,7 +3615,7 @@
             </w:pPr>
             <w:r>
               <w:rPr>
-                <w:rFonts w:ascii="Arial Unicode MS" w:hAnsi="Arial Unicode MS" w:eastAsia="Arial Unicode MS"/>
+                <w:rFonts w:ascii="AppleGothic" w:hAnsi="AppleGothic" w:eastAsia="AppleGothic"/>
                 <w:b w:val="0"/>
                 <w:i w:val="0"/>
                 <w:color w:val="000000"/>
@@ -3278,7 +3643,7 @@
             </w:pPr>
             <w:r>
               <w:rPr>
-                <w:rFonts w:ascii="Arial Unicode MS" w:hAnsi="Arial Unicode MS" w:eastAsia="Arial Unicode MS"/>
+                <w:rFonts w:ascii="AppleGothic" w:hAnsi="AppleGothic" w:eastAsia="AppleGothic"/>
                 <w:b w:val="0"/>
                 <w:i w:val="0"/>
                 <w:color w:val="000000"/>
@@ -3312,7 +3677,7 @@
             </w:pPr>
             <w:r>
               <w:rPr>
-                <w:rFonts w:ascii="Arial Unicode MS" w:hAnsi="Arial Unicode MS" w:eastAsia="Arial Unicode MS"/>
+                <w:rFonts w:ascii="AppleGothic" w:hAnsi="AppleGothic" w:eastAsia="AppleGothic"/>
                 <w:b w:val="0"/>
                 <w:i w:val="0"/>
                 <w:color w:val="000000"/>
@@ -3340,7 +3705,7 @@
             </w:pPr>
             <w:r>
               <w:rPr>
-                <w:rFonts w:ascii="Arial Unicode MS" w:hAnsi="Arial Unicode MS" w:eastAsia="Arial Unicode MS"/>
+                <w:rFonts w:ascii="AppleGothic" w:hAnsi="AppleGothic" w:eastAsia="AppleGothic"/>
                 <w:b w:val="0"/>
                 <w:i w:val="0"/>
                 <w:color w:val="000000"/>
@@ -3368,7 +3733,7 @@
             </w:pPr>
             <w:r>
               <w:rPr>
-                <w:rFonts w:ascii="Arial Unicode MS" w:hAnsi="Arial Unicode MS" w:eastAsia="Arial Unicode MS"/>
+                <w:rFonts w:ascii="AppleGothic" w:hAnsi="AppleGothic" w:eastAsia="AppleGothic"/>
                 <w:b w:val="0"/>
                 <w:i w:val="0"/>
                 <w:color w:val="000000"/>
@@ -3396,7 +3761,7 @@
             </w:pPr>
             <w:r>
               <w:rPr>
-                <w:rFonts w:ascii="Arial Unicode MS" w:hAnsi="Arial Unicode MS" w:eastAsia="Arial Unicode MS"/>
+                <w:rFonts w:ascii="AppleGothic" w:hAnsi="AppleGothic" w:eastAsia="AppleGothic"/>
                 <w:b w:val="0"/>
                 <w:i w:val="0"/>
                 <w:color w:val="000000"/>
@@ -3424,7 +3789,7 @@
             </w:pPr>
             <w:r>
               <w:rPr>
-                <w:rFonts w:ascii="Arial Unicode MS" w:hAnsi="Arial Unicode MS" w:eastAsia="Arial Unicode MS"/>
+                <w:rFonts w:ascii="AppleGothic" w:hAnsi="AppleGothic" w:eastAsia="AppleGothic"/>
                 <w:b w:val="0"/>
                 <w:i w:val="0"/>
                 <w:color w:val="000000"/>
@@ -3458,7 +3823,7 @@
             </w:pPr>
             <w:r>
               <w:rPr>
-                <w:rFonts w:ascii="Arial Unicode MS" w:hAnsi="Arial Unicode MS" w:eastAsia="Arial Unicode MS"/>
+                <w:rFonts w:ascii="AppleGothic" w:hAnsi="AppleGothic" w:eastAsia="AppleGothic"/>
                 <w:b w:val="0"/>
                 <w:i w:val="0"/>
                 <w:color w:val="000000"/>
@@ -3486,7 +3851,7 @@
             </w:pPr>
             <w:r>
               <w:rPr>
-                <w:rFonts w:ascii="Arial Unicode MS" w:hAnsi="Arial Unicode MS" w:eastAsia="Arial Unicode MS"/>
+                <w:rFonts w:ascii="AppleGothic" w:hAnsi="AppleGothic" w:eastAsia="AppleGothic"/>
                 <w:b w:val="0"/>
                 <w:i w:val="0"/>
                 <w:color w:val="000000"/>
@@ -3514,7 +3879,7 @@
             </w:pPr>
             <w:r>
               <w:rPr>
-                <w:rFonts w:ascii="Arial Unicode MS" w:hAnsi="Arial Unicode MS" w:eastAsia="Arial Unicode MS"/>
+                <w:rFonts w:ascii="AppleGothic" w:hAnsi="AppleGothic" w:eastAsia="AppleGothic"/>
                 <w:b w:val="0"/>
                 <w:i w:val="0"/>
                 <w:color w:val="000000"/>
@@ -3542,7 +3907,7 @@
             </w:pPr>
             <w:r>
               <w:rPr>
-                <w:rFonts w:ascii="Arial Unicode MS" w:hAnsi="Arial Unicode MS" w:eastAsia="Arial Unicode MS"/>
+                <w:rFonts w:ascii="AppleGothic" w:hAnsi="AppleGothic" w:eastAsia="AppleGothic"/>
                 <w:b w:val="0"/>
                 <w:i w:val="0"/>
                 <w:color w:val="000000"/>
@@ -3570,7 +3935,7 @@
             </w:pPr>
             <w:r>
               <w:rPr>
-                <w:rFonts w:ascii="Arial Unicode MS" w:hAnsi="Arial Unicode MS" w:eastAsia="Arial Unicode MS"/>
+                <w:rFonts w:ascii="AppleGothic" w:hAnsi="AppleGothic" w:eastAsia="AppleGothic"/>
                 <w:b w:val="0"/>
                 <w:i w:val="0"/>
                 <w:color w:val="000000"/>
@@ -3604,7 +3969,7 @@
             </w:pPr>
             <w:r>
               <w:rPr>
-                <w:rFonts w:ascii="Arial Unicode MS" w:hAnsi="Arial Unicode MS" w:eastAsia="Arial Unicode MS"/>
+                <w:rFonts w:ascii="AppleGothic" w:hAnsi="AppleGothic" w:eastAsia="AppleGothic"/>
                 <w:b w:val="0"/>
                 <w:i w:val="0"/>
                 <w:color w:val="000000"/>
@@ -3632,7 +3997,7 @@
             </w:pPr>
             <w:r>
               <w:rPr>
-                <w:rFonts w:ascii="Arial Unicode MS" w:hAnsi="Arial Unicode MS" w:eastAsia="Arial Unicode MS"/>
+                <w:rFonts w:ascii="AppleGothic" w:hAnsi="AppleGothic" w:eastAsia="AppleGothic"/>
                 <w:b w:val="0"/>
                 <w:i w:val="0"/>
                 <w:color w:val="000000"/>
@@ -3660,7 +4025,7 @@
             </w:pPr>
             <w:r>
               <w:rPr>
-                <w:rFonts w:ascii="Arial Unicode MS" w:hAnsi="Arial Unicode MS" w:eastAsia="Arial Unicode MS"/>
+                <w:rFonts w:ascii="AppleGothic" w:hAnsi="AppleGothic" w:eastAsia="AppleGothic"/>
                 <w:b w:val="0"/>
                 <w:i w:val="0"/>
                 <w:color w:val="000000"/>
@@ -3688,7 +4053,7 @@
             </w:pPr>
             <w:r>
               <w:rPr>
-                <w:rFonts w:ascii="Arial Unicode MS" w:hAnsi="Arial Unicode MS" w:eastAsia="Arial Unicode MS"/>
+                <w:rFonts w:ascii="AppleGothic" w:hAnsi="AppleGothic" w:eastAsia="AppleGothic"/>
                 <w:b w:val="0"/>
                 <w:i w:val="0"/>
                 <w:color w:val="000000"/>
@@ -3716,7 +4081,7 @@
             </w:pPr>
             <w:r>
               <w:rPr>
-                <w:rFonts w:ascii="Arial Unicode MS" w:hAnsi="Arial Unicode MS" w:eastAsia="Arial Unicode MS"/>
+                <w:rFonts w:ascii="AppleGothic" w:hAnsi="AppleGothic" w:eastAsia="AppleGothic"/>
                 <w:b w:val="0"/>
                 <w:i w:val="0"/>
                 <w:color w:val="000000"/>
@@ -3750,7 +4115,7 @@
             </w:pPr>
             <w:r>
               <w:rPr>
-                <w:rFonts w:ascii="Arial Unicode MS" w:hAnsi="Arial Unicode MS" w:eastAsia="Arial Unicode MS"/>
+                <w:rFonts w:ascii="AppleGothic" w:hAnsi="AppleGothic" w:eastAsia="AppleGothic"/>
                 <w:b w:val="0"/>
                 <w:i w:val="0"/>
                 <w:color w:val="000000"/>
@@ -3778,7 +4143,7 @@
             </w:pPr>
             <w:r>
               <w:rPr>
-                <w:rFonts w:ascii="Arial Unicode MS" w:hAnsi="Arial Unicode MS" w:eastAsia="Arial Unicode MS"/>
+                <w:rFonts w:ascii="AppleGothic" w:hAnsi="AppleGothic" w:eastAsia="AppleGothic"/>
                 <w:b w:val="0"/>
                 <w:i w:val="0"/>
                 <w:color w:val="000000"/>
@@ -3806,7 +4171,7 @@
             </w:pPr>
             <w:r>
               <w:rPr>
-                <w:rFonts w:ascii="Arial Unicode MS" w:hAnsi="Arial Unicode MS" w:eastAsia="Arial Unicode MS"/>
+                <w:rFonts w:ascii="AppleGothic" w:hAnsi="AppleGothic" w:eastAsia="AppleGothic"/>
                 <w:b w:val="0"/>
                 <w:i w:val="0"/>
                 <w:color w:val="000000"/>
@@ -3834,7 +4199,7 @@
             </w:pPr>
             <w:r>
               <w:rPr>
-                <w:rFonts w:ascii="Arial Unicode MS" w:hAnsi="Arial Unicode MS" w:eastAsia="Arial Unicode MS"/>
+                <w:rFonts w:ascii="AppleGothic" w:hAnsi="AppleGothic" w:eastAsia="AppleGothic"/>
                 <w:b w:val="0"/>
                 <w:i w:val="0"/>
                 <w:color w:val="000000"/>
@@ -3862,7 +4227,7 @@
             </w:pPr>
             <w:r>
               <w:rPr>
-                <w:rFonts w:ascii="Arial Unicode MS" w:hAnsi="Arial Unicode MS" w:eastAsia="Arial Unicode MS"/>
+                <w:rFonts w:ascii="AppleGothic" w:hAnsi="AppleGothic" w:eastAsia="AppleGothic"/>
                 <w:b w:val="0"/>
                 <w:i w:val="0"/>
                 <w:color w:val="000000"/>
@@ -3882,7 +4247,7 @@
     <w:p>
       <w:r>
         <w:rPr>
-          <w:rFonts w:ascii="Arial Unicode MS" w:hAnsi="Arial Unicode MS" w:eastAsia="Arial Unicode MS"/>
+          <w:rFonts w:ascii="AppleGothic" w:hAnsi="AppleGothic" w:eastAsia="AppleGothic"/>
           <w:b w:val="0"/>
           <w:i w:val="0"/>
           <w:color w:val="000000"/>
@@ -3896,13 +4261,54 @@
         <w:pStyle w:val="Heading1"/>
       </w:pPr>
       <w:r>
-        <w:t>9. TFLite Micro 대비 실보드 결과</w:t>
+        <w:t>9. 물리보드 성능 결과</w:t>
+      </w:r>
+    </w:p>
+    <w:p>
+      <w:pPr>
+        <w:shd w:fill="E8EEF5"/>
+        <w:pBdr>
+          <w:top w:val="single" w:sz="8" w:space="5" w:color="000000"/>
+          <w:left w:val="single" w:sz="8" w:space="5" w:color="000000"/>
+          <w:bottom w:val="single" w:sz="8" w:space="5" w:color="000000"/>
+          <w:right w:val="single" w:sz="8" w:space="5" w:color="000000"/>
+        </w:pBdr>
+        <w:spacing w:before="80" w:after="160"/>
+        <w:ind w:left="115" w:right="115"/>
+      </w:pPr>
+      <w:r>
+        <w:rPr>
+          <w:rFonts w:ascii="AppleGothic" w:hAnsi="AppleGothic" w:eastAsia="AppleGothic"/>
+          <w:b/>
+          <w:i w:val="0"/>
+          <w:color w:val="0B2545"/>
+          <w:sz w:val="21"/>
+        </w:rPr>
+        <w:t xml:space="preserve">증거 경계  </w:t>
+      </w:r>
+      <w:r>
+        <w:rPr>
+          <w:rFonts w:ascii="AppleGothic" w:hAnsi="AppleGothic" w:eastAsia="AppleGothic"/>
+          <w:b w:val="0"/>
+          <w:i w:val="0"/>
+          <w:color w:val="0B2545"/>
+          <w:sz w:val="21"/>
+        </w:rPr>
+        <w:t>이 절에는 실제 MCU에서 UART로 수집한 cycles·Flash·SRAM만 둔다. host 실행과 cross-build 결과는 다음 절에 분리하며 성능 수치로 사용하지 않는다.</w:t>
+      </w:r>
+    </w:p>
+    <w:p>
+      <w:pPr>
+        <w:pStyle w:val="Heading2"/>
+      </w:pPr>
+      <w:r>
+        <w:t>9.1 nRF52840: TFLM/CMSIS-NN 비교</w:t>
       </w:r>
     </w:p>
     <w:p>
       <w:r>
         <w:rPr>
-          <w:rFonts w:ascii="Arial Unicode MS" w:hAnsi="Arial Unicode MS" w:eastAsia="Arial Unicode MS"/>
+          <w:rFonts w:ascii="AppleGothic" w:hAnsi="AppleGothic" w:eastAsia="AppleGothic"/>
           <w:b w:val="0"/>
           <w:i w:val="0"/>
           <w:color w:val="000000"/>
@@ -3951,7 +4357,7 @@
             </w:pPr>
             <w:r>
               <w:rPr>
-                <w:rFonts w:ascii="Arial Unicode MS" w:hAnsi="Arial Unicode MS" w:eastAsia="Arial Unicode MS"/>
+                <w:rFonts w:ascii="AppleGothic" w:hAnsi="AppleGothic" w:eastAsia="AppleGothic"/>
                 <w:b/>
                 <w:i w:val="0"/>
                 <w:color w:val="0B2545"/>
@@ -3980,7 +4386,7 @@
             </w:pPr>
             <w:r>
               <w:rPr>
-                <w:rFonts w:ascii="Arial Unicode MS" w:hAnsi="Arial Unicode MS" w:eastAsia="Arial Unicode MS"/>
+                <w:rFonts w:ascii="AppleGothic" w:hAnsi="AppleGothic" w:eastAsia="AppleGothic"/>
                 <w:b/>
                 <w:i w:val="0"/>
                 <w:color w:val="0B2545"/>
@@ -4009,7 +4415,7 @@
             </w:pPr>
             <w:r>
               <w:rPr>
-                <w:rFonts w:ascii="Arial Unicode MS" w:hAnsi="Arial Unicode MS" w:eastAsia="Arial Unicode MS"/>
+                <w:rFonts w:ascii="AppleGothic" w:hAnsi="AppleGothic" w:eastAsia="AppleGothic"/>
                 <w:b/>
                 <w:i w:val="0"/>
                 <w:color w:val="0B2545"/>
@@ -4038,7 +4444,7 @@
             </w:pPr>
             <w:r>
               <w:rPr>
-                <w:rFonts w:ascii="Arial Unicode MS" w:hAnsi="Arial Unicode MS" w:eastAsia="Arial Unicode MS"/>
+                <w:rFonts w:ascii="AppleGothic" w:hAnsi="AppleGothic" w:eastAsia="AppleGothic"/>
                 <w:b/>
                 <w:i w:val="0"/>
                 <w:color w:val="0B2545"/>
@@ -4072,7 +4478,7 @@
             </w:pPr>
             <w:r>
               <w:rPr>
-                <w:rFonts w:ascii="Arial Unicode MS" w:hAnsi="Arial Unicode MS" w:eastAsia="Arial Unicode MS"/>
+                <w:rFonts w:ascii="AppleGothic" w:hAnsi="AppleGothic" w:eastAsia="AppleGothic"/>
                 <w:b w:val="0"/>
                 <w:i w:val="0"/>
                 <w:color w:val="000000"/>
@@ -4100,7 +4506,7 @@
             </w:pPr>
             <w:r>
               <w:rPr>
-                <w:rFonts w:ascii="Arial Unicode MS" w:hAnsi="Arial Unicode MS" w:eastAsia="Arial Unicode MS"/>
+                <w:rFonts w:ascii="AppleGothic" w:hAnsi="AppleGothic" w:eastAsia="AppleGothic"/>
                 <w:b w:val="0"/>
                 <w:i w:val="0"/>
                 <w:color w:val="000000"/>
@@ -4128,7 +4534,7 @@
             </w:pPr>
             <w:r>
               <w:rPr>
-                <w:rFonts w:ascii="Arial Unicode MS" w:hAnsi="Arial Unicode MS" w:eastAsia="Arial Unicode MS"/>
+                <w:rFonts w:ascii="AppleGothic" w:hAnsi="AppleGothic" w:eastAsia="AppleGothic"/>
                 <w:b w:val="0"/>
                 <w:i w:val="0"/>
                 <w:color w:val="000000"/>
@@ -4156,7 +4562,7 @@
             </w:pPr>
             <w:r>
               <w:rPr>
-                <w:rFonts w:ascii="Arial Unicode MS" w:hAnsi="Arial Unicode MS" w:eastAsia="Arial Unicode MS"/>
+                <w:rFonts w:ascii="AppleGothic" w:hAnsi="AppleGothic" w:eastAsia="AppleGothic"/>
                 <w:b w:val="0"/>
                 <w:i w:val="0"/>
                 <w:color w:val="000000"/>
@@ -4190,7 +4596,7 @@
             </w:pPr>
             <w:r>
               <w:rPr>
-                <w:rFonts w:ascii="Arial Unicode MS" w:hAnsi="Arial Unicode MS" w:eastAsia="Arial Unicode MS"/>
+                <w:rFonts w:ascii="AppleGothic" w:hAnsi="AppleGothic" w:eastAsia="AppleGothic"/>
                 <w:b w:val="0"/>
                 <w:i w:val="0"/>
                 <w:color w:val="000000"/>
@@ -4218,7 +4624,7 @@
             </w:pPr>
             <w:r>
               <w:rPr>
-                <w:rFonts w:ascii="Arial Unicode MS" w:hAnsi="Arial Unicode MS" w:eastAsia="Arial Unicode MS"/>
+                <w:rFonts w:ascii="AppleGothic" w:hAnsi="AppleGothic" w:eastAsia="AppleGothic"/>
                 <w:b w:val="0"/>
                 <w:i w:val="0"/>
                 <w:color w:val="000000"/>
@@ -4246,7 +4652,7 @@
             </w:pPr>
             <w:r>
               <w:rPr>
-                <w:rFonts w:ascii="Arial Unicode MS" w:hAnsi="Arial Unicode MS" w:eastAsia="Arial Unicode MS"/>
+                <w:rFonts w:ascii="AppleGothic" w:hAnsi="AppleGothic" w:eastAsia="AppleGothic"/>
                 <w:b w:val="0"/>
                 <w:i w:val="0"/>
                 <w:color w:val="000000"/>
@@ -4274,7 +4680,7 @@
             </w:pPr>
             <w:r>
               <w:rPr>
-                <w:rFonts w:ascii="Arial Unicode MS" w:hAnsi="Arial Unicode MS" w:eastAsia="Arial Unicode MS"/>
+                <w:rFonts w:ascii="AppleGothic" w:hAnsi="AppleGothic" w:eastAsia="AppleGothic"/>
                 <w:b w:val="0"/>
                 <w:i w:val="0"/>
                 <w:color w:val="000000"/>
@@ -4308,7 +4714,7 @@
             </w:pPr>
             <w:r>
               <w:rPr>
-                <w:rFonts w:ascii="Arial Unicode MS" w:hAnsi="Arial Unicode MS" w:eastAsia="Arial Unicode MS"/>
+                <w:rFonts w:ascii="AppleGothic" w:hAnsi="AppleGothic" w:eastAsia="AppleGothic"/>
                 <w:b w:val="0"/>
                 <w:i w:val="0"/>
                 <w:color w:val="000000"/>
@@ -4336,7 +4742,7 @@
             </w:pPr>
             <w:r>
               <w:rPr>
-                <w:rFonts w:ascii="Arial Unicode MS" w:hAnsi="Arial Unicode MS" w:eastAsia="Arial Unicode MS"/>
+                <w:rFonts w:ascii="AppleGothic" w:hAnsi="AppleGothic" w:eastAsia="AppleGothic"/>
                 <w:b w:val="0"/>
                 <w:i w:val="0"/>
                 <w:color w:val="000000"/>
@@ -4364,7 +4770,7 @@
             </w:pPr>
             <w:r>
               <w:rPr>
-                <w:rFonts w:ascii="Arial Unicode MS" w:hAnsi="Arial Unicode MS" w:eastAsia="Arial Unicode MS"/>
+                <w:rFonts w:ascii="AppleGothic" w:hAnsi="AppleGothic" w:eastAsia="AppleGothic"/>
                 <w:b w:val="0"/>
                 <w:i w:val="0"/>
                 <w:color w:val="000000"/>
@@ -4392,7 +4798,7 @@
             </w:pPr>
             <w:r>
               <w:rPr>
-                <w:rFonts w:ascii="Arial Unicode MS" w:hAnsi="Arial Unicode MS" w:eastAsia="Arial Unicode MS"/>
+                <w:rFonts w:ascii="AppleGothic" w:hAnsi="AppleGothic" w:eastAsia="AppleGothic"/>
                 <w:b w:val="0"/>
                 <w:i w:val="0"/>
                 <w:color w:val="000000"/>
@@ -4426,7 +4832,7 @@
             </w:pPr>
             <w:r>
               <w:rPr>
-                <w:rFonts w:ascii="Arial Unicode MS" w:hAnsi="Arial Unicode MS" w:eastAsia="Arial Unicode MS"/>
+                <w:rFonts w:ascii="AppleGothic" w:hAnsi="AppleGothic" w:eastAsia="AppleGothic"/>
                 <w:b w:val="0"/>
                 <w:i w:val="0"/>
                 <w:color w:val="000000"/>
@@ -4454,7 +4860,7 @@
             </w:pPr>
             <w:r>
               <w:rPr>
-                <w:rFonts w:ascii="Arial Unicode MS" w:hAnsi="Arial Unicode MS" w:eastAsia="Arial Unicode MS"/>
+                <w:rFonts w:ascii="AppleGothic" w:hAnsi="AppleGothic" w:eastAsia="AppleGothic"/>
                 <w:b w:val="0"/>
                 <w:i w:val="0"/>
                 <w:color w:val="000000"/>
@@ -4482,7 +4888,7 @@
             </w:pPr>
             <w:r>
               <w:rPr>
-                <w:rFonts w:ascii="Arial Unicode MS" w:hAnsi="Arial Unicode MS" w:eastAsia="Arial Unicode MS"/>
+                <w:rFonts w:ascii="AppleGothic" w:hAnsi="AppleGothic" w:eastAsia="AppleGothic"/>
                 <w:b w:val="0"/>
                 <w:i w:val="0"/>
                 <w:color w:val="000000"/>
@@ -4510,7 +4916,7 @@
             </w:pPr>
             <w:r>
               <w:rPr>
-                <w:rFonts w:ascii="Arial Unicode MS" w:hAnsi="Arial Unicode MS" w:eastAsia="Arial Unicode MS"/>
+                <w:rFonts w:ascii="AppleGothic" w:hAnsi="AppleGothic" w:eastAsia="AppleGothic"/>
                 <w:b w:val="0"/>
                 <w:i w:val="0"/>
                 <w:color w:val="000000"/>
@@ -4541,7 +4947,7 @@
       </w:pPr>
       <w:r>
         <w:rPr>
-          <w:rFonts w:ascii="Arial Unicode MS" w:hAnsi="Arial Unicode MS" w:eastAsia="Arial Unicode MS"/>
+          <w:rFonts w:ascii="AppleGothic" w:hAnsi="AppleGothic" w:eastAsia="AppleGothic"/>
           <w:b/>
           <w:i w:val="0"/>
           <w:color w:val="0B2545"/>
@@ -4551,7 +4957,7 @@
       </w:r>
       <w:r>
         <w:rPr>
-          <w:rFonts w:ascii="Arial Unicode MS" w:hAnsi="Arial Unicode MS" w:eastAsia="Arial Unicode MS"/>
+          <w:rFonts w:ascii="AppleGothic" w:hAnsi="AppleGothic" w:eastAsia="AppleGothic"/>
           <w:b w:val="0"/>
           <w:i w:val="0"/>
           <w:color w:val="0B2545"/>
@@ -4563,7 +4969,7 @@
     <w:p>
       <w:r>
         <w:rPr>
-          <w:rFonts w:ascii="Arial Unicode MS" w:hAnsi="Arial Unicode MS" w:eastAsia="Arial Unicode MS"/>
+          <w:rFonts w:ascii="AppleGothic" w:hAnsi="AppleGothic" w:eastAsia="AppleGothic"/>
           <w:b w:val="0"/>
           <w:i w:val="0"/>
           <w:color w:val="000000"/>
@@ -4574,10 +4980,1071 @@
     </w:p>
     <w:p>
       <w:pPr>
+        <w:pStyle w:val="Heading2"/>
+      </w:pPr>
+      <w:r>
+        <w:t>9.2 ESP32: trained MobileNetV2-0.25</w:t>
+      </w:r>
+    </w:p>
+    <w:p>
+      <w:r>
+        <w:rPr>
+          <w:rFonts w:ascii="AppleGothic" w:hAnsi="AppleGothic" w:eastAsia="AppleGothic"/>
+          <w:b w:val="0"/>
+          <w:i w:val="0"/>
+          <w:color w:val="000000"/>
+          <w:sz w:val="22"/>
+        </w:rPr>
+        <w:t>동일한 1-epoch CIFAR-10 checkpoint·calibration·INT8 graph·입력에서 ESP32-D0WDQ6 240 MHz, 8 warmups, 101회 측정으로 BakeNN portable, BakeNN+ESP-NN, TFLM+ESP-NN을 비교했다. 세 경로의 출력은 일치했다.</w:t>
+      </w:r>
+    </w:p>
+    <w:tbl>
+      <w:tblPr>
+        <w:tblStyle w:val="TableGrid"/>
+        <w:tblW w:type="dxa" w:w="9360"/>
+        <w:tblLayout w:type="fixed"/>
+        <w:tblLook w:firstColumn="1" w:firstRow="1" w:lastColumn="0" w:lastRow="0" w:noHBand="0" w:noVBand="1" w:val="04A0"/>
+        <w:tblInd w:w="120" w:type="dxa"/>
+      </w:tblPr>
+      <w:tblGrid>
+        <w:gridCol w:w="3600"/>
+        <w:gridCol w:w="1900"/>
+        <w:gridCol w:w="1900"/>
+        <w:gridCol w:w="1960"/>
+      </w:tblGrid>
+      <w:tr>
+        <w:trPr>
+          <w:trHeight w:hRule="atLeast"/>
+          <w:cantSplit/>
+          <w:tblHeader w:val="true"/>
+          <w:cantSplit/>
+        </w:trPr>
+        <w:tc>
+          <w:tcPr>
+            <w:tcW w:type="dxa" w:w="3600"/>
+            <w:vAlign w:val="center"/>
+            <w:tcMar>
+              <w:top w:w="80" w:type="dxa"/>
+              <w:bottom w:w="80" w:type="dxa"/>
+              <w:start w:w="120" w:type="dxa"/>
+              <w:end w:w="120" w:type="dxa"/>
+            </w:tcMar>
+            <w:shd w:fill="F2F4F7"/>
+          </w:tcPr>
+          <w:p>
+            <w:pPr>
+              <w:spacing w:after="0"/>
+              <w:jc w:val="left"/>
+            </w:pPr>
+            <w:r>
+              <w:rPr>
+                <w:rFonts w:ascii="AppleGothic" w:hAnsi="AppleGothic" w:eastAsia="AppleGothic"/>
+                <w:b/>
+                <w:i w:val="0"/>
+                <w:color w:val="0B2545"/>
+                <w:sz w:val="19"/>
+              </w:rPr>
+              <w:t>Path</w:t>
+            </w:r>
+          </w:p>
+        </w:tc>
+        <w:tc>
+          <w:tcPr>
+            <w:tcW w:type="dxa" w:w="1900"/>
+            <w:vAlign w:val="center"/>
+            <w:tcMar>
+              <w:top w:w="80" w:type="dxa"/>
+              <w:bottom w:w="80" w:type="dxa"/>
+              <w:start w:w="120" w:type="dxa"/>
+              <w:end w:w="120" w:type="dxa"/>
+            </w:tcMar>
+            <w:shd w:fill="F2F4F7"/>
+          </w:tcPr>
+          <w:p>
+            <w:pPr>
+              <w:spacing w:after="0"/>
+              <w:jc w:val="center"/>
+            </w:pPr>
+            <w:r>
+              <w:rPr>
+                <w:rFonts w:ascii="AppleGothic" w:hAnsi="AppleGothic" w:eastAsia="AppleGothic"/>
+                <w:b/>
+                <w:i w:val="0"/>
+                <w:color w:val="0B2545"/>
+                <w:sz w:val="19"/>
+              </w:rPr>
+              <w:t>Median</w:t>
+            </w:r>
+          </w:p>
+        </w:tc>
+        <w:tc>
+          <w:tcPr>
+            <w:tcW w:type="dxa" w:w="1900"/>
+            <w:vAlign w:val="center"/>
+            <w:tcMar>
+              <w:top w:w="80" w:type="dxa"/>
+              <w:bottom w:w="80" w:type="dxa"/>
+              <w:start w:w="120" w:type="dxa"/>
+              <w:end w:w="120" w:type="dxa"/>
+            </w:tcMar>
+            <w:shd w:fill="F2F4F7"/>
+          </w:tcPr>
+          <w:p>
+            <w:pPr>
+              <w:spacing w:after="0"/>
+              <w:jc w:val="center"/>
+            </w:pPr>
+            <w:r>
+              <w:rPr>
+                <w:rFonts w:ascii="AppleGothic" w:hAnsi="AppleGothic" w:eastAsia="AppleGothic"/>
+                <w:b/>
+                <w:i w:val="0"/>
+                <w:color w:val="0B2545"/>
+                <w:sz w:val="19"/>
+              </w:rPr>
+              <w:t>App binary</w:t>
+            </w:r>
+          </w:p>
+        </w:tc>
+        <w:tc>
+          <w:tcPr>
+            <w:tcW w:type="dxa" w:w="1960"/>
+            <w:vAlign w:val="center"/>
+            <w:tcMar>
+              <w:top w:w="80" w:type="dxa"/>
+              <w:bottom w:w="80" w:type="dxa"/>
+              <w:start w:w="120" w:type="dxa"/>
+              <w:end w:w="120" w:type="dxa"/>
+            </w:tcMar>
+            <w:shd w:fill="F2F4F7"/>
+          </w:tcPr>
+          <w:p>
+            <w:pPr>
+              <w:spacing w:after="0"/>
+              <w:jc w:val="center"/>
+            </w:pPr>
+            <w:r>
+              <w:rPr>
+                <w:rFonts w:ascii="AppleGothic" w:hAnsi="AppleGothic" w:eastAsia="AppleGothic"/>
+                <w:b/>
+                <w:i w:val="0"/>
+                <w:color w:val="0B2545"/>
+                <w:sz w:val="19"/>
+              </w:rPr>
+              <w:t>Linked DRAM</w:t>
+            </w:r>
+          </w:p>
+        </w:tc>
+      </w:tr>
+      <w:tr>
+        <w:trPr>
+          <w:trHeight w:hRule="atLeast"/>
+          <w:cantSplit/>
+        </w:trPr>
+        <w:tc>
+          <w:tcPr>
+            <w:tcW w:type="dxa" w:w="3600"/>
+            <w:vAlign w:val="center"/>
+            <w:tcMar>
+              <w:top w:w="80" w:type="dxa"/>
+              <w:bottom w:w="80" w:type="dxa"/>
+              <w:start w:w="120" w:type="dxa"/>
+              <w:end w:w="120" w:type="dxa"/>
+            </w:tcMar>
+          </w:tcPr>
+          <w:p>
+            <w:pPr>
+              <w:spacing w:after="0"/>
+              <w:jc w:val="left"/>
+            </w:pPr>
+            <w:r>
+              <w:rPr>
+                <w:rFonts w:ascii="AppleGothic" w:hAnsi="AppleGothic" w:eastAsia="AppleGothic"/>
+                <w:b w:val="0"/>
+                <w:i w:val="0"/>
+                <w:color w:val="000000"/>
+                <w:sz w:val="18"/>
+              </w:rPr>
+              <w:t>BakeNN portable C</w:t>
+            </w:r>
+          </w:p>
+        </w:tc>
+        <w:tc>
+          <w:tcPr>
+            <w:tcW w:type="dxa" w:w="1900"/>
+            <w:vAlign w:val="center"/>
+            <w:tcMar>
+              <w:top w:w="80" w:type="dxa"/>
+              <w:bottom w:w="80" w:type="dxa"/>
+              <w:start w:w="120" w:type="dxa"/>
+              <w:end w:w="120" w:type="dxa"/>
+            </w:tcMar>
+          </w:tcPr>
+          <w:p>
+            <w:pPr>
+              <w:spacing w:after="0"/>
+              <w:jc w:val="center"/>
+            </w:pPr>
+            <w:r>
+              <w:rPr>
+                <w:rFonts w:ascii="AppleGothic" w:hAnsi="AppleGothic" w:eastAsia="AppleGothic"/>
+                <w:b w:val="0"/>
+                <w:i w:val="0"/>
+                <w:color w:val="000000"/>
+                <w:sz w:val="18"/>
+              </w:rPr>
+              <w:t>285.546 ms</w:t>
+            </w:r>
+          </w:p>
+        </w:tc>
+        <w:tc>
+          <w:tcPr>
+            <w:tcW w:type="dxa" w:w="1900"/>
+            <w:vAlign w:val="center"/>
+            <w:tcMar>
+              <w:top w:w="80" w:type="dxa"/>
+              <w:bottom w:w="80" w:type="dxa"/>
+              <w:start w:w="120" w:type="dxa"/>
+              <w:end w:w="120" w:type="dxa"/>
+            </w:tcMar>
+          </w:tcPr>
+          <w:p>
+            <w:pPr>
+              <w:spacing w:after="0"/>
+              <w:jc w:val="center"/>
+            </w:pPr>
+            <w:r>
+              <w:rPr>
+                <w:rFonts w:ascii="AppleGothic" w:hAnsi="AppleGothic" w:eastAsia="AppleGothic"/>
+                <w:b w:val="0"/>
+                <w:i w:val="0"/>
+                <w:color w:val="000000"/>
+                <w:sz w:val="18"/>
+              </w:rPr>
+              <w:t>459,088 B</w:t>
+            </w:r>
+          </w:p>
+        </w:tc>
+        <w:tc>
+          <w:tcPr>
+            <w:tcW w:type="dxa" w:w="1960"/>
+            <w:vAlign w:val="center"/>
+            <w:tcMar>
+              <w:top w:w="80" w:type="dxa"/>
+              <w:bottom w:w="80" w:type="dxa"/>
+              <w:start w:w="120" w:type="dxa"/>
+              <w:end w:w="120" w:type="dxa"/>
+            </w:tcMar>
+          </w:tcPr>
+          <w:p>
+            <w:pPr>
+              <w:spacing w:after="0"/>
+              <w:jc w:val="center"/>
+            </w:pPr>
+            <w:r>
+              <w:rPr>
+                <w:rFonts w:ascii="AppleGothic" w:hAnsi="AppleGothic" w:eastAsia="AppleGothic"/>
+                <w:b w:val="0"/>
+                <w:i w:val="0"/>
+                <w:color w:val="000000"/>
+                <w:sz w:val="18"/>
+              </w:rPr>
+              <w:t>31,900 B</w:t>
+            </w:r>
+          </w:p>
+        </w:tc>
+      </w:tr>
+      <w:tr>
+        <w:trPr>
+          <w:trHeight w:hRule="atLeast"/>
+          <w:cantSplit/>
+        </w:trPr>
+        <w:tc>
+          <w:tcPr>
+            <w:tcW w:type="dxa" w:w="3600"/>
+            <w:vAlign w:val="center"/>
+            <w:tcMar>
+              <w:top w:w="80" w:type="dxa"/>
+              <w:bottom w:w="80" w:type="dxa"/>
+              <w:start w:w="120" w:type="dxa"/>
+              <w:end w:w="120" w:type="dxa"/>
+            </w:tcMar>
+          </w:tcPr>
+          <w:p>
+            <w:pPr>
+              <w:spacing w:after="0"/>
+              <w:jc w:val="left"/>
+            </w:pPr>
+            <w:r>
+              <w:rPr>
+                <w:rFonts w:ascii="AppleGothic" w:hAnsi="AppleGothic" w:eastAsia="AppleGothic"/>
+                <w:b w:val="0"/>
+                <w:i w:val="0"/>
+                <w:color w:val="000000"/>
+                <w:sz w:val="18"/>
+              </w:rPr>
+              <w:t>BakeNN + ESP-NN</w:t>
+            </w:r>
+          </w:p>
+        </w:tc>
+        <w:tc>
+          <w:tcPr>
+            <w:tcW w:type="dxa" w:w="1900"/>
+            <w:vAlign w:val="center"/>
+            <w:tcMar>
+              <w:top w:w="80" w:type="dxa"/>
+              <w:bottom w:w="80" w:type="dxa"/>
+              <w:start w:w="120" w:type="dxa"/>
+              <w:end w:w="120" w:type="dxa"/>
+            </w:tcMar>
+          </w:tcPr>
+          <w:p>
+            <w:pPr>
+              <w:spacing w:after="0"/>
+              <w:jc w:val="center"/>
+            </w:pPr>
+            <w:r>
+              <w:rPr>
+                <w:rFonts w:ascii="AppleGothic" w:hAnsi="AppleGothic" w:eastAsia="AppleGothic"/>
+                <w:b w:val="0"/>
+                <w:i w:val="0"/>
+                <w:color w:val="000000"/>
+                <w:sz w:val="18"/>
+              </w:rPr>
+              <w:t>97.685 ms</w:t>
+            </w:r>
+          </w:p>
+        </w:tc>
+        <w:tc>
+          <w:tcPr>
+            <w:tcW w:type="dxa" w:w="1900"/>
+            <w:vAlign w:val="center"/>
+            <w:tcMar>
+              <w:top w:w="80" w:type="dxa"/>
+              <w:bottom w:w="80" w:type="dxa"/>
+              <w:start w:w="120" w:type="dxa"/>
+              <w:end w:w="120" w:type="dxa"/>
+            </w:tcMar>
+          </w:tcPr>
+          <w:p>
+            <w:pPr>
+              <w:spacing w:after="0"/>
+              <w:jc w:val="center"/>
+            </w:pPr>
+            <w:r>
+              <w:rPr>
+                <w:rFonts w:ascii="AppleGothic" w:hAnsi="AppleGothic" w:eastAsia="AppleGothic"/>
+                <w:b w:val="0"/>
+                <w:i w:val="0"/>
+                <w:color w:val="000000"/>
+                <w:sz w:val="18"/>
+              </w:rPr>
+              <w:t>465,296 B</w:t>
+            </w:r>
+          </w:p>
+        </w:tc>
+        <w:tc>
+          <w:tcPr>
+            <w:tcW w:type="dxa" w:w="1960"/>
+            <w:vAlign w:val="center"/>
+            <w:tcMar>
+              <w:top w:w="80" w:type="dxa"/>
+              <w:bottom w:w="80" w:type="dxa"/>
+              <w:start w:w="120" w:type="dxa"/>
+              <w:end w:w="120" w:type="dxa"/>
+            </w:tcMar>
+          </w:tcPr>
+          <w:p>
+            <w:pPr>
+              <w:spacing w:after="0"/>
+              <w:jc w:val="center"/>
+            </w:pPr>
+            <w:r>
+              <w:rPr>
+                <w:rFonts w:ascii="AppleGothic" w:hAnsi="AppleGothic" w:eastAsia="AppleGothic"/>
+                <w:b w:val="0"/>
+                <w:i w:val="0"/>
+                <w:color w:val="000000"/>
+                <w:sz w:val="18"/>
+              </w:rPr>
+              <w:t>31,900 B</w:t>
+            </w:r>
+          </w:p>
+        </w:tc>
+      </w:tr>
+      <w:tr>
+        <w:trPr>
+          <w:trHeight w:hRule="atLeast"/>
+          <w:cantSplit/>
+        </w:trPr>
+        <w:tc>
+          <w:tcPr>
+            <w:tcW w:type="dxa" w:w="3600"/>
+            <w:vAlign w:val="center"/>
+            <w:tcMar>
+              <w:top w:w="80" w:type="dxa"/>
+              <w:bottom w:w="80" w:type="dxa"/>
+              <w:start w:w="120" w:type="dxa"/>
+              <w:end w:w="120" w:type="dxa"/>
+            </w:tcMar>
+          </w:tcPr>
+          <w:p>
+            <w:pPr>
+              <w:spacing w:after="0"/>
+              <w:jc w:val="left"/>
+            </w:pPr>
+            <w:r>
+              <w:rPr>
+                <w:rFonts w:ascii="AppleGothic" w:hAnsi="AppleGothic" w:eastAsia="AppleGothic"/>
+                <w:b w:val="0"/>
+                <w:i w:val="0"/>
+                <w:color w:val="000000"/>
+                <w:sz w:val="18"/>
+              </w:rPr>
+              <w:t>TFLM + ESP-NN</w:t>
+            </w:r>
+          </w:p>
+        </w:tc>
+        <w:tc>
+          <w:tcPr>
+            <w:tcW w:type="dxa" w:w="1900"/>
+            <w:vAlign w:val="center"/>
+            <w:tcMar>
+              <w:top w:w="80" w:type="dxa"/>
+              <w:bottom w:w="80" w:type="dxa"/>
+              <w:start w:w="120" w:type="dxa"/>
+              <w:end w:w="120" w:type="dxa"/>
+            </w:tcMar>
+          </w:tcPr>
+          <w:p>
+            <w:pPr>
+              <w:spacing w:after="0"/>
+              <w:jc w:val="center"/>
+            </w:pPr>
+            <w:r>
+              <w:rPr>
+                <w:rFonts w:ascii="AppleGothic" w:hAnsi="AppleGothic" w:eastAsia="AppleGothic"/>
+                <w:b w:val="0"/>
+                <w:i w:val="0"/>
+                <w:color w:val="000000"/>
+                <w:sz w:val="18"/>
+              </w:rPr>
+              <w:t>98.891 ms</w:t>
+            </w:r>
+          </w:p>
+        </w:tc>
+        <w:tc>
+          <w:tcPr>
+            <w:tcW w:type="dxa" w:w="1900"/>
+            <w:vAlign w:val="center"/>
+            <w:tcMar>
+              <w:top w:w="80" w:type="dxa"/>
+              <w:bottom w:w="80" w:type="dxa"/>
+              <w:start w:w="120" w:type="dxa"/>
+              <w:end w:w="120" w:type="dxa"/>
+            </w:tcMar>
+          </w:tcPr>
+          <w:p>
+            <w:pPr>
+              <w:spacing w:after="0"/>
+              <w:jc w:val="center"/>
+            </w:pPr>
+            <w:r>
+              <w:rPr>
+                <w:rFonts w:ascii="AppleGothic" w:hAnsi="AppleGothic" w:eastAsia="AppleGothic"/>
+                <w:b w:val="0"/>
+                <w:i w:val="0"/>
+                <w:color w:val="000000"/>
+                <w:sz w:val="18"/>
+              </w:rPr>
+              <w:t>665,504 B</w:t>
+            </w:r>
+          </w:p>
+        </w:tc>
+        <w:tc>
+          <w:tcPr>
+            <w:tcW w:type="dxa" w:w="1960"/>
+            <w:vAlign w:val="center"/>
+            <w:tcMar>
+              <w:top w:w="80" w:type="dxa"/>
+              <w:bottom w:w="80" w:type="dxa"/>
+              <w:start w:w="120" w:type="dxa"/>
+              <w:end w:w="120" w:type="dxa"/>
+            </w:tcMar>
+          </w:tcPr>
+          <w:p>
+            <w:pPr>
+              <w:spacing w:after="0"/>
+              <w:jc w:val="center"/>
+            </w:pPr>
+            <w:r>
+              <w:rPr>
+                <w:rFonts w:ascii="AppleGothic" w:hAnsi="AppleGothic" w:eastAsia="AppleGothic"/>
+                <w:b w:val="0"/>
+                <w:i w:val="0"/>
+                <w:color w:val="000000"/>
+                <w:sz w:val="18"/>
+              </w:rPr>
+              <w:t>95,332 B</w:t>
+            </w:r>
+          </w:p>
+        </w:tc>
+      </w:tr>
+    </w:tbl>
+    <w:p>
+      <w:pPr>
+        <w:spacing w:after="0"/>
+      </w:pPr>
+    </w:p>
+    <w:p>
+      <w:r>
+        <w:rPr>
+          <w:rFonts w:ascii="AppleGothic" w:hAnsi="AppleGothic" w:eastAsia="AppleGothic"/>
+          <w:b w:val="0"/>
+          <w:i w:val="0"/>
+          <w:color w:val="000000"/>
+          <w:sz w:val="22"/>
+        </w:rPr>
+        <w:t>이 artifact에서 BakeNN+ESP-NN은 TFLM+ESP-NN보다 latency가 1.22% 낮았고 app binary는 30.1%, linked DRAM은 66.5% 작았다. optimized kernel이 지배하는 CNN에서는 BakeNN의 큰 차이가 주로 메모리와 통합 단순성에서 나타났다.</w:t>
+      </w:r>
+    </w:p>
+    <w:p>
+      <w:pPr>
         <w:pStyle w:val="Heading1"/>
       </w:pPr>
       <w:r>
-        <w:t>10. TFLM 대비 실용적 차별점</w:t>
+        <w:t>10. 보드리스 cross-build 및 microTVM 비교</w:t>
+      </w:r>
+    </w:p>
+    <w:p>
+      <w:pPr>
+        <w:shd w:fill="E8EEF5"/>
+        <w:pBdr>
+          <w:top w:val="single" w:sz="8" w:space="5" w:color="000000"/>
+          <w:left w:val="single" w:sz="8" w:space="5" w:color="000000"/>
+          <w:bottom w:val="single" w:sz="8" w:space="5" w:color="000000"/>
+          <w:right w:val="single" w:sz="8" w:space="5" w:color="000000"/>
+        </w:pBdr>
+        <w:spacing w:before="80" w:after="160"/>
+        <w:ind w:left="115" w:right="115"/>
+      </w:pPr>
+      <w:r>
+        <w:rPr>
+          <w:rFonts w:ascii="AppleGothic" w:hAnsi="AppleGothic" w:eastAsia="AppleGothic"/>
+          <w:b/>
+          <w:i w:val="0"/>
+          <w:color w:val="0B2545"/>
+          <w:sz w:val="21"/>
+        </w:rPr>
+        <w:t xml:space="preserve">성능 주장 금지  </w:t>
+      </w:r>
+      <w:r>
+        <w:rPr>
+          <w:rFonts w:ascii="AppleGothic" w:hAnsi="AppleGothic" w:eastAsia="AppleGothic"/>
+          <w:b w:val="0"/>
+          <w:i w:val="0"/>
+          <w:color w:val="0B2545"/>
+          <w:sz w:val="21"/>
+        </w:rPr>
+        <w:t>cross-build는 타겟 ABI·컴파일러·링커·section size·undefined symbol을 검증한다. 실제 MCU cycles, cache, energy, stack high-water를 증명하지 않는다.</w:t>
+      </w:r>
+    </w:p>
+    <w:p>
+      <w:r>
+        <w:rPr>
+          <w:rFonts w:ascii="AppleGothic" w:hAnsi="AppleGothic" w:eastAsia="AppleGothic"/>
+          <w:b w:val="0"/>
+          <w:i w:val="0"/>
+          <w:color w:val="000000"/>
+          <w:sz w:val="22"/>
+        </w:rPr>
+        <w:t>동일 trained MNIST checkpoint와 160장 calibration에서 만든 하나의 quantized contract를 BakeNN direct CMSIS-NN과 Apache TVM 0.16.0 AOT+USMP+CMSIS-NN으로 Cortex-M4에 cross-link했다. 두 생성 C는 각각 integer reference와 1,000/1,000 output bytes가 일치했다.</w:t>
+      </w:r>
+    </w:p>
+    <w:tbl>
+      <w:tblPr>
+        <w:tblStyle w:val="TableGrid"/>
+        <w:tblW w:type="dxa" w:w="9360"/>
+        <w:tblLayout w:type="fixed"/>
+        <w:tblLook w:firstColumn="1" w:firstRow="1" w:lastColumn="0" w:lastRow="0" w:noHBand="0" w:noVBand="1" w:val="04A0"/>
+        <w:tblInd w:w="120" w:type="dxa"/>
+      </w:tblPr>
+      <w:tblGrid>
+        <w:gridCol w:w="3100"/>
+        <w:gridCol w:w="1600"/>
+        <w:gridCol w:w="1600"/>
+        <w:gridCol w:w="1500"/>
+        <w:gridCol w:w="1560"/>
+      </w:tblGrid>
+      <w:tr>
+        <w:trPr>
+          <w:trHeight w:hRule="atLeast"/>
+          <w:cantSplit/>
+          <w:tblHeader w:val="true"/>
+          <w:cantSplit/>
+        </w:trPr>
+        <w:tc>
+          <w:tcPr>
+            <w:tcW w:type="dxa" w:w="3100"/>
+            <w:vAlign w:val="center"/>
+            <w:tcMar>
+              <w:top w:w="80" w:type="dxa"/>
+              <w:bottom w:w="80" w:type="dxa"/>
+              <w:start w:w="120" w:type="dxa"/>
+              <w:end w:w="120" w:type="dxa"/>
+            </w:tcMar>
+            <w:shd w:fill="F2F4F7"/>
+          </w:tcPr>
+          <w:p>
+            <w:pPr>
+              <w:spacing w:after="0"/>
+              <w:jc w:val="left"/>
+            </w:pPr>
+            <w:r>
+              <w:rPr>
+                <w:rFonts w:ascii="AppleGothic" w:hAnsi="AppleGothic" w:eastAsia="AppleGothic"/>
+                <w:b/>
+                <w:i w:val="0"/>
+                <w:color w:val="0B2545"/>
+                <w:sz w:val="19"/>
+              </w:rPr>
+              <w:t>Path</w:t>
+            </w:r>
+          </w:p>
+        </w:tc>
+        <w:tc>
+          <w:tcPr>
+            <w:tcW w:type="dxa" w:w="1600"/>
+            <w:vAlign w:val="center"/>
+            <w:tcMar>
+              <w:top w:w="80" w:type="dxa"/>
+              <w:bottom w:w="80" w:type="dxa"/>
+              <w:start w:w="120" w:type="dxa"/>
+              <w:end w:w="120" w:type="dxa"/>
+            </w:tcMar>
+            <w:shd w:fill="F2F4F7"/>
+          </w:tcPr>
+          <w:p>
+            <w:pPr>
+              <w:spacing w:after="0"/>
+              <w:jc w:val="center"/>
+            </w:pPr>
+            <w:r>
+              <w:rPr>
+                <w:rFonts w:ascii="AppleGothic" w:hAnsi="AppleGothic" w:eastAsia="AppleGothic"/>
+                <w:b/>
+                <w:i w:val="0"/>
+                <w:color w:val="0B2545"/>
+                <w:sz w:val="19"/>
+              </w:rPr>
+              <w:t>Linked Flash</w:t>
+            </w:r>
+          </w:p>
+        </w:tc>
+        <w:tc>
+          <w:tcPr>
+            <w:tcW w:type="dxa" w:w="1600"/>
+            <w:vAlign w:val="center"/>
+            <w:tcMar>
+              <w:top w:w="80" w:type="dxa"/>
+              <w:bottom w:w="80" w:type="dxa"/>
+              <w:start w:w="120" w:type="dxa"/>
+              <w:end w:w="120" w:type="dxa"/>
+            </w:tcMar>
+            <w:shd w:fill="F2F4F7"/>
+          </w:tcPr>
+          <w:p>
+            <w:pPr>
+              <w:spacing w:after="0"/>
+              <w:jc w:val="center"/>
+            </w:pPr>
+            <w:r>
+              <w:rPr>
+                <w:rFonts w:ascii="AppleGothic" w:hAnsi="AppleGothic" w:eastAsia="AppleGothic"/>
+                <w:b/>
+                <w:i w:val="0"/>
+                <w:color w:val="0B2545"/>
+                <w:sz w:val="19"/>
+              </w:rPr>
+              <w:t>Static SRAM</w:t>
+            </w:r>
+          </w:p>
+        </w:tc>
+        <w:tc>
+          <w:tcPr>
+            <w:tcW w:type="dxa" w:w="1500"/>
+            <w:vAlign w:val="center"/>
+            <w:tcMar>
+              <w:top w:w="80" w:type="dxa"/>
+              <w:bottom w:w="80" w:type="dxa"/>
+              <w:start w:w="120" w:type="dxa"/>
+              <w:end w:w="120" w:type="dxa"/>
+            </w:tcMar>
+            <w:shd w:fill="F2F4F7"/>
+          </w:tcPr>
+          <w:p>
+            <w:pPr>
+              <w:spacing w:after="0"/>
+              <w:jc w:val="center"/>
+            </w:pPr>
+            <w:r>
+              <w:rPr>
+                <w:rFonts w:ascii="AppleGothic" w:hAnsi="AppleGothic" w:eastAsia="AppleGothic"/>
+                <w:b/>
+                <w:i w:val="0"/>
+                <w:color w:val="0B2545"/>
+                <w:sz w:val="19"/>
+              </w:rPr>
+              <w:t>Workspace</w:t>
+            </w:r>
+          </w:p>
+        </w:tc>
+        <w:tc>
+          <w:tcPr>
+            <w:tcW w:type="dxa" w:w="1560"/>
+            <w:vAlign w:val="center"/>
+            <w:tcMar>
+              <w:top w:w="80" w:type="dxa"/>
+              <w:bottom w:w="80" w:type="dxa"/>
+              <w:start w:w="120" w:type="dxa"/>
+              <w:end w:w="120" w:type="dxa"/>
+            </w:tcMar>
+            <w:shd w:fill="F2F4F7"/>
+          </w:tcPr>
+          <w:p>
+            <w:pPr>
+              <w:spacing w:after="0"/>
+              <w:jc w:val="left"/>
+            </w:pPr>
+            <w:r>
+              <w:rPr>
+                <w:rFonts w:ascii="AppleGothic" w:hAnsi="AppleGothic" w:eastAsia="AppleGothic"/>
+                <w:b/>
+                <w:i w:val="0"/>
+                <w:color w:val="0B2545"/>
+                <w:sz w:val="19"/>
+              </w:rPr>
+              <w:t>Physical cycles</w:t>
+            </w:r>
+          </w:p>
+        </w:tc>
+      </w:tr>
+      <w:tr>
+        <w:trPr>
+          <w:trHeight w:hRule="atLeast"/>
+          <w:cantSplit/>
+        </w:trPr>
+        <w:tc>
+          <w:tcPr>
+            <w:tcW w:type="dxa" w:w="3100"/>
+            <w:vAlign w:val="center"/>
+            <w:tcMar>
+              <w:top w:w="80" w:type="dxa"/>
+              <w:bottom w:w="80" w:type="dxa"/>
+              <w:start w:w="120" w:type="dxa"/>
+              <w:end w:w="120" w:type="dxa"/>
+            </w:tcMar>
+          </w:tcPr>
+          <w:p>
+            <w:pPr>
+              <w:spacing w:after="0"/>
+              <w:jc w:val="left"/>
+            </w:pPr>
+            <w:r>
+              <w:rPr>
+                <w:rFonts w:ascii="AppleGothic" w:hAnsi="AppleGothic" w:eastAsia="AppleGothic"/>
+                <w:b w:val="0"/>
+                <w:i w:val="0"/>
+                <w:color w:val="000000"/>
+                <w:sz w:val="18"/>
+              </w:rPr>
+              <w:t>BakeNN direct CMSIS-NN</w:t>
+            </w:r>
+          </w:p>
+        </w:tc>
+        <w:tc>
+          <w:tcPr>
+            <w:tcW w:type="dxa" w:w="1600"/>
+            <w:vAlign w:val="center"/>
+            <w:tcMar>
+              <w:top w:w="80" w:type="dxa"/>
+              <w:bottom w:w="80" w:type="dxa"/>
+              <w:start w:w="120" w:type="dxa"/>
+              <w:end w:w="120" w:type="dxa"/>
+            </w:tcMar>
+          </w:tcPr>
+          <w:p>
+            <w:pPr>
+              <w:spacing w:after="0"/>
+              <w:jc w:val="center"/>
+            </w:pPr>
+            <w:r>
+              <w:rPr>
+                <w:rFonts w:ascii="AppleGothic" w:hAnsi="AppleGothic" w:eastAsia="AppleGothic"/>
+                <w:b w:val="0"/>
+                <w:i w:val="0"/>
+                <w:color w:val="000000"/>
+                <w:sz w:val="18"/>
+              </w:rPr>
+              <w:t>12,088 B</w:t>
+            </w:r>
+          </w:p>
+        </w:tc>
+        <w:tc>
+          <w:tcPr>
+            <w:tcW w:type="dxa" w:w="1600"/>
+            <w:vAlign w:val="center"/>
+            <w:tcMar>
+              <w:top w:w="80" w:type="dxa"/>
+              <w:bottom w:w="80" w:type="dxa"/>
+              <w:start w:w="120" w:type="dxa"/>
+              <w:end w:w="120" w:type="dxa"/>
+            </w:tcMar>
+          </w:tcPr>
+          <w:p>
+            <w:pPr>
+              <w:spacing w:after="0"/>
+              <w:jc w:val="center"/>
+            </w:pPr>
+            <w:r>
+              <w:rPr>
+                <w:rFonts w:ascii="AppleGothic" w:hAnsi="AppleGothic" w:eastAsia="AppleGothic"/>
+                <w:b w:val="0"/>
+                <w:i w:val="0"/>
+                <w:color w:val="000000"/>
+                <w:sz w:val="18"/>
+              </w:rPr>
+              <w:t>4,864 B</w:t>
+            </w:r>
+          </w:p>
+        </w:tc>
+        <w:tc>
+          <w:tcPr>
+            <w:tcW w:type="dxa" w:w="1500"/>
+            <w:vAlign w:val="center"/>
+            <w:tcMar>
+              <w:top w:w="80" w:type="dxa"/>
+              <w:bottom w:w="80" w:type="dxa"/>
+              <w:start w:w="120" w:type="dxa"/>
+              <w:end w:w="120" w:type="dxa"/>
+            </w:tcMar>
+          </w:tcPr>
+          <w:p>
+            <w:pPr>
+              <w:spacing w:after="0"/>
+              <w:jc w:val="center"/>
+            </w:pPr>
+            <w:r>
+              <w:rPr>
+                <w:rFonts w:ascii="AppleGothic" w:hAnsi="AppleGothic" w:eastAsia="AppleGothic"/>
+                <w:b w:val="0"/>
+                <w:i w:val="0"/>
+                <w:color w:val="000000"/>
+                <w:sz w:val="18"/>
+              </w:rPr>
+              <w:t>4,064 B</w:t>
+            </w:r>
+          </w:p>
+        </w:tc>
+        <w:tc>
+          <w:tcPr>
+            <w:tcW w:type="dxa" w:w="1560"/>
+            <w:vAlign w:val="center"/>
+            <w:tcMar>
+              <w:top w:w="80" w:type="dxa"/>
+              <w:bottom w:w="80" w:type="dxa"/>
+              <w:start w:w="120" w:type="dxa"/>
+              <w:end w:w="120" w:type="dxa"/>
+            </w:tcMar>
+          </w:tcPr>
+          <w:p>
+            <w:pPr>
+              <w:spacing w:after="0"/>
+              <w:jc w:val="left"/>
+            </w:pPr>
+            <w:r>
+              <w:rPr>
+                <w:rFonts w:ascii="AppleGothic" w:hAnsi="AppleGothic" w:eastAsia="AppleGothic"/>
+                <w:b w:val="0"/>
+                <w:i w:val="0"/>
+                <w:color w:val="000000"/>
+                <w:sz w:val="18"/>
+              </w:rPr>
+              <w:t>미측정</w:t>
+            </w:r>
+          </w:p>
+        </w:tc>
+      </w:tr>
+      <w:tr>
+        <w:trPr>
+          <w:trHeight w:hRule="atLeast"/>
+          <w:cantSplit/>
+        </w:trPr>
+        <w:tc>
+          <w:tcPr>
+            <w:tcW w:type="dxa" w:w="3100"/>
+            <w:vAlign w:val="center"/>
+            <w:tcMar>
+              <w:top w:w="80" w:type="dxa"/>
+              <w:bottom w:w="80" w:type="dxa"/>
+              <w:start w:w="120" w:type="dxa"/>
+              <w:end w:w="120" w:type="dxa"/>
+            </w:tcMar>
+          </w:tcPr>
+          <w:p>
+            <w:pPr>
+              <w:spacing w:after="0"/>
+              <w:jc w:val="left"/>
+            </w:pPr>
+            <w:r>
+              <w:rPr>
+                <w:rFonts w:ascii="AppleGothic" w:hAnsi="AppleGothic" w:eastAsia="AppleGothic"/>
+                <w:b w:val="0"/>
+                <w:i w:val="0"/>
+                <w:color w:val="000000"/>
+                <w:sz w:val="18"/>
+              </w:rPr>
+              <w:t>microTVM AOT+USMP+CMSIS-NN</w:t>
+            </w:r>
+          </w:p>
+        </w:tc>
+        <w:tc>
+          <w:tcPr>
+            <w:tcW w:type="dxa" w:w="1600"/>
+            <w:vAlign w:val="center"/>
+            <w:tcMar>
+              <w:top w:w="80" w:type="dxa"/>
+              <w:bottom w:w="80" w:type="dxa"/>
+              <w:start w:w="120" w:type="dxa"/>
+              <w:end w:w="120" w:type="dxa"/>
+            </w:tcMar>
+          </w:tcPr>
+          <w:p>
+            <w:pPr>
+              <w:spacing w:after="0"/>
+              <w:jc w:val="center"/>
+            </w:pPr>
+            <w:r>
+              <w:rPr>
+                <w:rFonts w:ascii="AppleGothic" w:hAnsi="AppleGothic" w:eastAsia="AppleGothic"/>
+                <w:b w:val="0"/>
+                <w:i w:val="0"/>
+                <w:color w:val="000000"/>
+                <w:sz w:val="18"/>
+              </w:rPr>
+              <w:t>17,456 B</w:t>
+            </w:r>
+          </w:p>
+        </w:tc>
+        <w:tc>
+          <w:tcPr>
+            <w:tcW w:type="dxa" w:w="1600"/>
+            <w:vAlign w:val="center"/>
+            <w:tcMar>
+              <w:top w:w="80" w:type="dxa"/>
+              <w:bottom w:w="80" w:type="dxa"/>
+              <w:start w:w="120" w:type="dxa"/>
+              <w:end w:w="120" w:type="dxa"/>
+            </w:tcMar>
+          </w:tcPr>
+          <w:p>
+            <w:pPr>
+              <w:spacing w:after="0"/>
+              <w:jc w:val="center"/>
+            </w:pPr>
+            <w:r>
+              <w:rPr>
+                <w:rFonts w:ascii="AppleGothic" w:hAnsi="AppleGothic" w:eastAsia="AppleGothic"/>
+                <w:b w:val="0"/>
+                <w:i w:val="0"/>
+                <w:color w:val="000000"/>
+                <w:sz w:val="18"/>
+              </w:rPr>
+              <w:t>4,862 B</w:t>
+            </w:r>
+          </w:p>
+        </w:tc>
+        <w:tc>
+          <w:tcPr>
+            <w:tcW w:type="dxa" w:w="1500"/>
+            <w:vAlign w:val="center"/>
+            <w:tcMar>
+              <w:top w:w="80" w:type="dxa"/>
+              <w:bottom w:w="80" w:type="dxa"/>
+              <w:start w:w="120" w:type="dxa"/>
+              <w:end w:w="120" w:type="dxa"/>
+            </w:tcMar>
+          </w:tcPr>
+          <w:p>
+            <w:pPr>
+              <w:spacing w:after="0"/>
+              <w:jc w:val="center"/>
+            </w:pPr>
+            <w:r>
+              <w:rPr>
+                <w:rFonts w:ascii="AppleGothic" w:hAnsi="AppleGothic" w:eastAsia="AppleGothic"/>
+                <w:b w:val="0"/>
+                <w:i w:val="0"/>
+                <w:color w:val="000000"/>
+                <w:sz w:val="18"/>
+              </w:rPr>
+              <w:t>4,064 B</w:t>
+            </w:r>
+          </w:p>
+        </w:tc>
+        <w:tc>
+          <w:tcPr>
+            <w:tcW w:type="dxa" w:w="1560"/>
+            <w:vAlign w:val="center"/>
+            <w:tcMar>
+              <w:top w:w="80" w:type="dxa"/>
+              <w:bottom w:w="80" w:type="dxa"/>
+              <w:start w:w="120" w:type="dxa"/>
+              <w:end w:w="120" w:type="dxa"/>
+            </w:tcMar>
+          </w:tcPr>
+          <w:p>
+            <w:pPr>
+              <w:spacing w:after="0"/>
+              <w:jc w:val="left"/>
+            </w:pPr>
+            <w:r>
+              <w:rPr>
+                <w:rFonts w:ascii="AppleGothic" w:hAnsi="AppleGothic" w:eastAsia="AppleGothic"/>
+                <w:b w:val="0"/>
+                <w:i w:val="0"/>
+                <w:color w:val="000000"/>
+                <w:sz w:val="18"/>
+              </w:rPr>
+              <w:t>미측정</w:t>
+            </w:r>
+          </w:p>
+        </w:tc>
+      </w:tr>
+    </w:tbl>
+    <w:p>
+      <w:pPr>
+        <w:spacing w:after="0"/>
+      </w:pPr>
+    </w:p>
+    <w:p>
+      <w:r>
+        <w:rPr>
+          <w:rFonts w:ascii="AppleGothic" w:hAnsi="AppleGothic" w:eastAsia="AppleGothic"/>
+          <w:b w:val="0"/>
+          <w:i w:val="0"/>
+          <w:color w:val="000000"/>
+          <w:sz w:val="22"/>
+        </w:rPr>
+        <w:t>이 ELF에서 BakeNN의 linked Flash는 microTVM보다 30.8% 작고 static SRAM은 사실상 같았다. trained MNIST ESP32 project도 cross-build와 corpus/hash 고정까지 완료했지만 UART transcript가 추가되기 전에는 물리 성능표에 넣지 않는다.</w:t>
+      </w:r>
+    </w:p>
+    <w:p>
+      <w:pPr>
+        <w:pStyle w:val="Heading1"/>
+      </w:pPr>
+      <w:r>
+        <w:t>11. TFLM 대비 실용적 차별점</w:t>
       </w:r>
     </w:p>
     <w:p>
@@ -4589,7 +6056,7 @@
       </w:pPr>
       <w:r>
         <w:rPr>
-          <w:rFonts w:ascii="Arial Unicode MS" w:hAnsi="Arial Unicode MS" w:eastAsia="Arial Unicode MS"/>
+          <w:rFonts w:ascii="AppleGothic" w:hAnsi="AppleGothic" w:eastAsia="AppleGothic"/>
           <w:b w:val="0"/>
           <w:i w:val="0"/>
           <w:color w:val="000000"/>
@@ -4607,7 +6074,7 @@
       </w:pPr>
       <w:r>
         <w:rPr>
-          <w:rFonts w:ascii="Arial Unicode MS" w:hAnsi="Arial Unicode MS" w:eastAsia="Arial Unicode MS"/>
+          <w:rFonts w:ascii="AppleGothic" w:hAnsi="AppleGothic" w:eastAsia="AppleGothic"/>
           <w:b w:val="0"/>
           <w:i w:val="0"/>
           <w:color w:val="000000"/>
@@ -4625,7 +6092,7 @@
       </w:pPr>
       <w:r>
         <w:rPr>
-          <w:rFonts w:ascii="Arial Unicode MS" w:hAnsi="Arial Unicode MS" w:eastAsia="Arial Unicode MS"/>
+          <w:rFonts w:ascii="AppleGothic" w:hAnsi="AppleGothic" w:eastAsia="AppleGothic"/>
           <w:b w:val="0"/>
           <w:i w:val="0"/>
           <w:color w:val="000000"/>
@@ -4643,7 +6110,7 @@
       </w:pPr>
       <w:r>
         <w:rPr>
-          <w:rFonts w:ascii="Arial Unicode MS" w:hAnsi="Arial Unicode MS" w:eastAsia="Arial Unicode MS"/>
+          <w:rFonts w:ascii="AppleGothic" w:hAnsi="AppleGothic" w:eastAsia="AppleGothic"/>
           <w:b w:val="0"/>
           <w:i w:val="0"/>
           <w:color w:val="000000"/>
@@ -4661,7 +6128,7 @@
       </w:pPr>
       <w:r>
         <w:rPr>
-          <w:rFonts w:ascii="Arial Unicode MS" w:hAnsi="Arial Unicode MS" w:eastAsia="Arial Unicode MS"/>
+          <w:rFonts w:ascii="AppleGothic" w:hAnsi="AppleGothic" w:eastAsia="AppleGothic"/>
           <w:b w:val="0"/>
           <w:i w:val="0"/>
           <w:color w:val="000000"/>
@@ -4673,7 +6140,7 @@
     <w:p>
       <w:r>
         <w:rPr>
-          <w:rFonts w:ascii="Arial Unicode MS" w:hAnsi="Arial Unicode MS" w:eastAsia="Arial Unicode MS"/>
+          <w:rFonts w:ascii="AppleGothic" w:hAnsi="AppleGothic" w:eastAsia="AppleGothic"/>
           <w:b w:val="0"/>
           <w:i w:val="0"/>
           <w:color w:val="000000"/>
@@ -4687,7 +6154,7 @@
         <w:pStyle w:val="Heading1"/>
       </w:pPr>
       <w:r>
-        <w:t>11. 오픈소스 구성과 재현 방법</w:t>
+        <w:t>12. 오픈소스 구성과 재현 방법</w:t>
       </w:r>
     </w:p>
     <w:tbl>
@@ -4728,7 +6195,7 @@
             </w:pPr>
             <w:r>
               <w:rPr>
-                <w:rFonts w:ascii="Arial Unicode MS" w:hAnsi="Arial Unicode MS" w:eastAsia="Arial Unicode MS"/>
+                <w:rFonts w:ascii="AppleGothic" w:hAnsi="AppleGothic" w:eastAsia="AppleGothic"/>
                 <w:b/>
                 <w:i w:val="0"/>
                 <w:color w:val="0B2545"/>
@@ -4757,7 +6224,7 @@
             </w:pPr>
             <w:r>
               <w:rPr>
-                <w:rFonts w:ascii="Arial Unicode MS" w:hAnsi="Arial Unicode MS" w:eastAsia="Arial Unicode MS"/>
+                <w:rFonts w:ascii="AppleGothic" w:hAnsi="AppleGothic" w:eastAsia="AppleGothic"/>
                 <w:b/>
                 <w:i w:val="0"/>
                 <w:color w:val="0B2545"/>
@@ -4791,7 +6258,7 @@
             </w:pPr>
             <w:r>
               <w:rPr>
-                <w:rFonts w:ascii="Arial Unicode MS" w:hAnsi="Arial Unicode MS" w:eastAsia="Arial Unicode MS"/>
+                <w:rFonts w:ascii="AppleGothic" w:hAnsi="AppleGothic" w:eastAsia="AppleGothic"/>
                 <w:b w:val="0"/>
                 <w:i w:val="0"/>
                 <w:color w:val="000000"/>
@@ -4819,7 +6286,7 @@
             </w:pPr>
             <w:r>
               <w:rPr>
-                <w:rFonts w:ascii="Arial Unicode MS" w:hAnsi="Arial Unicode MS" w:eastAsia="Arial Unicode MS"/>
+                <w:rFonts w:ascii="AppleGothic" w:hAnsi="AppleGothic" w:eastAsia="AppleGothic"/>
                 <w:b w:val="0"/>
                 <w:i w:val="0"/>
                 <w:color w:val="000000"/>
@@ -4853,7 +6320,7 @@
             </w:pPr>
             <w:r>
               <w:rPr>
-                <w:rFonts w:ascii="Arial Unicode MS" w:hAnsi="Arial Unicode MS" w:eastAsia="Arial Unicode MS"/>
+                <w:rFonts w:ascii="AppleGothic" w:hAnsi="AppleGothic" w:eastAsia="AppleGothic"/>
                 <w:b w:val="0"/>
                 <w:i w:val="0"/>
                 <w:color w:val="000000"/>
@@ -4881,7 +6348,7 @@
             </w:pPr>
             <w:r>
               <w:rPr>
-                <w:rFonts w:ascii="Arial Unicode MS" w:hAnsi="Arial Unicode MS" w:eastAsia="Arial Unicode MS"/>
+                <w:rFonts w:ascii="AppleGothic" w:hAnsi="AppleGothic" w:eastAsia="AppleGothic"/>
                 <w:b w:val="0"/>
                 <w:i w:val="0"/>
                 <w:color w:val="000000"/>
@@ -4915,7 +6382,7 @@
             </w:pPr>
             <w:r>
               <w:rPr>
-                <w:rFonts w:ascii="Arial Unicode MS" w:hAnsi="Arial Unicode MS" w:eastAsia="Arial Unicode MS"/>
+                <w:rFonts w:ascii="AppleGothic" w:hAnsi="AppleGothic" w:eastAsia="AppleGothic"/>
                 <w:b w:val="0"/>
                 <w:i w:val="0"/>
                 <w:color w:val="000000"/>
@@ -4943,7 +6410,7 @@
             </w:pPr>
             <w:r>
               <w:rPr>
-                <w:rFonts w:ascii="Arial Unicode MS" w:hAnsi="Arial Unicode MS" w:eastAsia="Arial Unicode MS"/>
+                <w:rFonts w:ascii="AppleGothic" w:hAnsi="AppleGothic" w:eastAsia="AppleGothic"/>
                 <w:b w:val="0"/>
                 <w:i w:val="0"/>
                 <w:color w:val="000000"/>
@@ -4977,7 +6444,7 @@
             </w:pPr>
             <w:r>
               <w:rPr>
-                <w:rFonts w:ascii="Arial Unicode MS" w:hAnsi="Arial Unicode MS" w:eastAsia="Arial Unicode MS"/>
+                <w:rFonts w:ascii="AppleGothic" w:hAnsi="AppleGothic" w:eastAsia="AppleGothic"/>
                 <w:b w:val="0"/>
                 <w:i w:val="0"/>
                 <w:color w:val="000000"/>
@@ -5005,7 +6472,7 @@
             </w:pPr>
             <w:r>
               <w:rPr>
-                <w:rFonts w:ascii="Arial Unicode MS" w:hAnsi="Arial Unicode MS" w:eastAsia="Arial Unicode MS"/>
+                <w:rFonts w:ascii="AppleGothic" w:hAnsi="AppleGothic" w:eastAsia="AppleGothic"/>
                 <w:b w:val="0"/>
                 <w:i w:val="0"/>
                 <w:color w:val="000000"/>
@@ -5039,7 +6506,7 @@
             </w:pPr>
             <w:r>
               <w:rPr>
-                <w:rFonts w:ascii="Arial Unicode MS" w:hAnsi="Arial Unicode MS" w:eastAsia="Arial Unicode MS"/>
+                <w:rFonts w:ascii="AppleGothic" w:hAnsi="AppleGothic" w:eastAsia="AppleGothic"/>
                 <w:b w:val="0"/>
                 <w:i w:val="0"/>
                 <w:color w:val="000000"/>
@@ -5067,13 +6534,13 @@
             </w:pPr>
             <w:r>
               <w:rPr>
-                <w:rFonts w:ascii="Arial Unicode MS" w:hAnsi="Arial Unicode MS" w:eastAsia="Arial Unicode MS"/>
+                <w:rFonts w:ascii="AppleGothic" w:hAnsi="AppleGothic" w:eastAsia="AppleGothic"/>
                 <w:b w:val="0"/>
                 <w:i w:val="0"/>
                 <w:color w:val="000000"/>
                 <w:sz w:val="18"/>
               </w:rPr>
-              <w:t>benchmarks/RESULTS.md 및 원본 UART/JSON report</w:t>
+              <w:t>물리 benchmarks/physical과 보드리스 benchmarks/cross_build를 분리</w:t>
             </w:r>
           </w:p>
         </w:tc>
@@ -5101,7 +6568,69 @@
             </w:pPr>
             <w:r>
               <w:rPr>
-                <w:rFonts w:ascii="Arial Unicode MS" w:hAnsi="Arial Unicode MS" w:eastAsia="Arial Unicode MS"/>
+                <w:rFonts w:ascii="AppleGothic" w:hAnsi="AppleGothic" w:eastAsia="AppleGothic"/>
+                <w:b w:val="0"/>
+                <w:i w:val="0"/>
+                <w:color w:val="000000"/>
+                <w:sz w:val="18"/>
+              </w:rPr>
+              <w:t>Clean room</w:t>
+            </w:r>
+          </w:p>
+        </w:tc>
+        <w:tc>
+          <w:tcPr>
+            <w:tcW w:type="dxa" w:w="7060"/>
+            <w:vAlign w:val="center"/>
+            <w:tcMar>
+              <w:top w:w="80" w:type="dxa"/>
+              <w:bottom w:w="80" w:type="dxa"/>
+              <w:start w:w="120" w:type="dxa"/>
+              <w:end w:w="120" w:type="dxa"/>
+            </w:tcMar>
+          </w:tcPr>
+          <w:p>
+            <w:pPr>
+              <w:spacing w:after="0"/>
+              <w:jc w:val="left"/>
+            </w:pPr>
+            <w:r>
+              <w:rPr>
+                <w:rFonts w:ascii="AppleGothic" w:hAnsi="AppleGothic" w:eastAsia="AppleGothic"/>
+                <w:b w:val="0"/>
+                <w:i w:val="0"/>
+                <w:color w:val="000000"/>
+                <w:sz w:val="18"/>
+              </w:rPr>
+              <w:t>scripts/verify_mnist_evidence.py; 외부 contributor PR gate</w:t>
+            </w:r>
+          </w:p>
+        </w:tc>
+      </w:tr>
+      <w:tr>
+        <w:trPr>
+          <w:trHeight w:hRule="atLeast"/>
+          <w:cantSplit/>
+        </w:trPr>
+        <w:tc>
+          <w:tcPr>
+            <w:tcW w:type="dxa" w:w="2300"/>
+            <w:vAlign w:val="center"/>
+            <w:tcMar>
+              <w:top w:w="80" w:type="dxa"/>
+              <w:bottom w:w="80" w:type="dxa"/>
+              <w:start w:w="120" w:type="dxa"/>
+              <w:end w:w="120" w:type="dxa"/>
+            </w:tcMar>
+          </w:tcPr>
+          <w:p>
+            <w:pPr>
+              <w:spacing w:after="0"/>
+              <w:jc w:val="left"/>
+            </w:pPr>
+            <w:r>
+              <w:rPr>
+                <w:rFonts w:ascii="AppleGothic" w:hAnsi="AppleGothic" w:eastAsia="AppleGothic"/>
                 <w:b w:val="0"/>
                 <w:i w:val="0"/>
                 <w:color w:val="000000"/>
@@ -5129,13 +6658,13 @@
             </w:pPr>
             <w:r>
               <w:rPr>
-                <w:rFonts w:ascii="Arial Unicode MS" w:hAnsi="Arial Unicode MS" w:eastAsia="Arial Unicode MS"/>
+                <w:rFonts w:ascii="AppleGothic" w:hAnsi="AppleGothic" w:eastAsia="AppleGothic"/>
                 <w:b w:val="0"/>
                 <w:i w:val="0"/>
                 <w:color w:val="000000"/>
                 <w:sz w:val="18"/>
               </w:rPr>
-              <w:t>examples/esp32s3_end_to_end/</w:t>
+              <w:t>examples/mnist 및 examples/esp32s3_end_to_end</w:t>
             </w:r>
           </w:p>
         </w:tc>
@@ -5175,7 +6704,7 @@
         <w:pStyle w:val="Heading1"/>
       </w:pPr>
       <w:r>
-        <w:t>12. 한계와 향후 계획</w:t>
+        <w:t>13. 한계와 향후 계획</w:t>
       </w:r>
     </w:p>
     <w:tbl>
@@ -5216,7 +6745,7 @@
             </w:pPr>
             <w:r>
               <w:rPr>
-                <w:rFonts w:ascii="Arial Unicode MS" w:hAnsi="Arial Unicode MS" w:eastAsia="Arial Unicode MS"/>
+                <w:rFonts w:ascii="AppleGothic" w:hAnsi="AppleGothic" w:eastAsia="AppleGothic"/>
                 <w:b/>
                 <w:i w:val="0"/>
                 <w:color w:val="0B2545"/>
@@ -5245,7 +6774,7 @@
             </w:pPr>
             <w:r>
               <w:rPr>
-                <w:rFonts w:ascii="Arial Unicode MS" w:hAnsi="Arial Unicode MS" w:eastAsia="Arial Unicode MS"/>
+                <w:rFonts w:ascii="AppleGothic" w:hAnsi="AppleGothic" w:eastAsia="AppleGothic"/>
                 <w:b/>
                 <w:i w:val="0"/>
                 <w:color w:val="0B2545"/>
@@ -5279,13 +6808,13 @@
             </w:pPr>
             <w:r>
               <w:rPr>
-                <w:rFonts w:ascii="Arial Unicode MS" w:hAnsi="Arial Unicode MS" w:eastAsia="Arial Unicode MS"/>
+                <w:rFonts w:ascii="AppleGothic" w:hAnsi="AppleGothic" w:eastAsia="AppleGothic"/>
                 <w:b w:val="0"/>
                 <w:i w:val="0"/>
                 <w:color w:val="000000"/>
                 <w:sz w:val="18"/>
               </w:rPr>
-              <w:t>ESP32/S3 물리 cycle·energy 미측정</w:t>
+              <w:t>ESP32-S3 물리 cycle·energy 미측정</w:t>
             </w:r>
           </w:p>
         </w:tc>
@@ -5307,7 +6836,7 @@
             </w:pPr>
             <w:r>
               <w:rPr>
-                <w:rFonts w:ascii="Arial Unicode MS" w:hAnsi="Arial Unicode MS" w:eastAsia="Arial Unicode MS"/>
+                <w:rFonts w:ascii="AppleGothic" w:hAnsi="AppleGothic" w:eastAsia="AppleGothic"/>
                 <w:b w:val="0"/>
                 <w:i w:val="0"/>
                 <w:color w:val="000000"/>
@@ -5341,7 +6870,69 @@
             </w:pPr>
             <w:r>
               <w:rPr>
-                <w:rFonts w:ascii="Arial Unicode MS" w:hAnsi="Arial Unicode MS" w:eastAsia="Arial Unicode MS"/>
+                <w:rFonts w:ascii="AppleGothic" w:hAnsi="AppleGothic" w:eastAsia="AppleGothic"/>
+                <w:b w:val="0"/>
+                <w:i w:val="0"/>
+                <w:color w:val="000000"/>
+                <w:sz w:val="18"/>
+              </w:rPr>
+              <w:t>trained MNIST 물리 UART 미수집</w:t>
+            </w:r>
+          </w:p>
+        </w:tc>
+        <w:tc>
+          <w:tcPr>
+            <w:tcW w:type="dxa" w:w="5560"/>
+            <w:vAlign w:val="center"/>
+            <w:tcMar>
+              <w:top w:w="80" w:type="dxa"/>
+              <w:bottom w:w="80" w:type="dxa"/>
+              <w:start w:w="120" w:type="dxa"/>
+              <w:end w:w="120" w:type="dxa"/>
+            </w:tcMar>
+          </w:tcPr>
+          <w:p>
+            <w:pPr>
+              <w:spacing w:after="0"/>
+              <w:jc w:val="left"/>
+            </w:pPr>
+            <w:r>
+              <w:rPr>
+                <w:rFonts w:ascii="AppleGothic" w:hAnsi="AppleGothic" w:eastAsia="AppleGothic"/>
+                <w:b w:val="0"/>
+                <w:i w:val="0"/>
+                <w:color w:val="000000"/>
+                <w:sz w:val="18"/>
+              </w:rPr>
+              <w:t>준비된 100장 corpus로 ESP32 flash·cycles·stack transcript 고정</w:t>
+            </w:r>
+          </w:p>
+        </w:tc>
+      </w:tr>
+      <w:tr>
+        <w:trPr>
+          <w:trHeight w:hRule="atLeast"/>
+          <w:cantSplit/>
+        </w:trPr>
+        <w:tc>
+          <w:tcPr>
+            <w:tcW w:type="dxa" w:w="3800"/>
+            <w:vAlign w:val="center"/>
+            <w:tcMar>
+              <w:top w:w="80" w:type="dxa"/>
+              <w:bottom w:w="80" w:type="dxa"/>
+              <w:start w:w="120" w:type="dxa"/>
+              <w:end w:w="120" w:type="dxa"/>
+            </w:tcMar>
+          </w:tcPr>
+          <w:p>
+            <w:pPr>
+              <w:spacing w:after="0"/>
+              <w:jc w:val="left"/>
+            </w:pPr>
+            <w:r>
+              <w:rPr>
+                <w:rFonts w:ascii="AppleGothic" w:hAnsi="AppleGothic" w:eastAsia="AppleGothic"/>
                 <w:b w:val="0"/>
                 <w:i w:val="0"/>
                 <w:color w:val="000000"/>
@@ -5369,7 +6960,7 @@
             </w:pPr>
             <w:r>
               <w:rPr>
-                <w:rFonts w:ascii="Arial Unicode MS" w:hAnsi="Arial Unicode MS" w:eastAsia="Arial Unicode MS"/>
+                <w:rFonts w:ascii="AppleGothic" w:hAnsi="AppleGothic" w:eastAsia="AppleGothic"/>
                 <w:b w:val="0"/>
                 <w:i w:val="0"/>
                 <w:color w:val="000000"/>
@@ -5403,7 +6994,7 @@
             </w:pPr>
             <w:r>
               <w:rPr>
-                <w:rFonts w:ascii="Arial Unicode MS" w:hAnsi="Arial Unicode MS" w:eastAsia="Arial Unicode MS"/>
+                <w:rFonts w:ascii="AppleGothic" w:hAnsi="AppleGothic" w:eastAsia="AppleGothic"/>
                 <w:b w:val="0"/>
                 <w:i w:val="0"/>
                 <w:color w:val="000000"/>
@@ -5431,7 +7022,7 @@
             </w:pPr>
             <w:r>
               <w:rPr>
-                <w:rFonts w:ascii="Arial Unicode MS" w:hAnsi="Arial Unicode MS" w:eastAsia="Arial Unicode MS"/>
+                <w:rFonts w:ascii="AppleGothic" w:hAnsi="AppleGothic" w:eastAsia="AppleGothic"/>
                 <w:b w:val="0"/>
                 <w:i w:val="0"/>
                 <w:color w:val="000000"/>
@@ -5465,7 +7056,7 @@
             </w:pPr>
             <w:r>
               <w:rPr>
-                <w:rFonts w:ascii="Arial Unicode MS" w:hAnsi="Arial Unicode MS" w:eastAsia="Arial Unicode MS"/>
+                <w:rFonts w:ascii="AppleGothic" w:hAnsi="AppleGothic" w:eastAsia="AppleGothic"/>
                 <w:b w:val="0"/>
                 <w:i w:val="0"/>
                 <w:color w:val="000000"/>
@@ -5493,7 +7084,7 @@
             </w:pPr>
             <w:r>
               <w:rPr>
-                <w:rFonts w:ascii="Arial Unicode MS" w:hAnsi="Arial Unicode MS" w:eastAsia="Arial Unicode MS"/>
+                <w:rFonts w:ascii="AppleGothic" w:hAnsi="AppleGothic" w:eastAsia="AppleGothic"/>
                 <w:b w:val="0"/>
                 <w:i w:val="0"/>
                 <w:color w:val="000000"/>
@@ -5527,7 +7118,7 @@
             </w:pPr>
             <w:r>
               <w:rPr>
-                <w:rFonts w:ascii="Arial Unicode MS" w:hAnsi="Arial Unicode MS" w:eastAsia="Arial Unicode MS"/>
+                <w:rFonts w:ascii="AppleGothic" w:hAnsi="AppleGothic" w:eastAsia="AppleGothic"/>
                 <w:b w:val="0"/>
                 <w:i w:val="0"/>
                 <w:color w:val="000000"/>
@@ -5555,7 +7146,7 @@
             </w:pPr>
             <w:r>
               <w:rPr>
-                <w:rFonts w:ascii="Arial Unicode MS" w:hAnsi="Arial Unicode MS" w:eastAsia="Arial Unicode MS"/>
+                <w:rFonts w:ascii="AppleGothic" w:hAnsi="AppleGothic" w:eastAsia="AppleGothic"/>
                 <w:b w:val="0"/>
                 <w:i w:val="0"/>
                 <w:color w:val="000000"/>
@@ -5577,7 +7168,7 @@
         <w:pStyle w:val="Heading1"/>
       </w:pPr>
       <w:r>
-        <w:t>13. 제출 항목 상태</w:t>
+        <w:t>14. 제출 항목 상태</w:t>
       </w:r>
     </w:p>
     <w:tbl>
@@ -5619,7 +7210,7 @@
             </w:pPr>
             <w:r>
               <w:rPr>
-                <w:rFonts w:ascii="Arial Unicode MS" w:hAnsi="Arial Unicode MS" w:eastAsia="Arial Unicode MS"/>
+                <w:rFonts w:ascii="AppleGothic" w:hAnsi="AppleGothic" w:eastAsia="AppleGothic"/>
                 <w:b/>
                 <w:i w:val="0"/>
                 <w:color w:val="0B2545"/>
@@ -5648,7 +7239,7 @@
             </w:pPr>
             <w:r>
               <w:rPr>
-                <w:rFonts w:ascii="Arial Unicode MS" w:hAnsi="Arial Unicode MS" w:eastAsia="Arial Unicode MS"/>
+                <w:rFonts w:ascii="AppleGothic" w:hAnsi="AppleGothic" w:eastAsia="AppleGothic"/>
                 <w:b/>
                 <w:i w:val="0"/>
                 <w:color w:val="0B2545"/>
@@ -5677,7 +7268,7 @@
             </w:pPr>
             <w:r>
               <w:rPr>
-                <w:rFonts w:ascii="Arial Unicode MS" w:hAnsi="Arial Unicode MS" w:eastAsia="Arial Unicode MS"/>
+                <w:rFonts w:ascii="AppleGothic" w:hAnsi="AppleGothic" w:eastAsia="AppleGothic"/>
                 <w:b/>
                 <w:i w:val="0"/>
                 <w:color w:val="0B2545"/>
@@ -5711,7 +7302,7 @@
             </w:pPr>
             <w:r>
               <w:rPr>
-                <w:rFonts w:ascii="Arial Unicode MS" w:hAnsi="Arial Unicode MS" w:eastAsia="Arial Unicode MS"/>
+                <w:rFonts w:ascii="AppleGothic" w:hAnsi="AppleGothic" w:eastAsia="AppleGothic"/>
                 <w:b w:val="0"/>
                 <w:i w:val="0"/>
                 <w:color w:val="000000"/>
@@ -5739,7 +7330,7 @@
             </w:pPr>
             <w:r>
               <w:rPr>
-                <w:rFonts w:ascii="Arial Unicode MS" w:hAnsi="Arial Unicode MS" w:eastAsia="Arial Unicode MS"/>
+                <w:rFonts w:ascii="AppleGothic" w:hAnsi="AppleGothic" w:eastAsia="AppleGothic"/>
                 <w:b w:val="0"/>
                 <w:i w:val="0"/>
                 <w:color w:val="000000"/>
@@ -5767,7 +7358,7 @@
             </w:pPr>
             <w:r>
               <w:rPr>
-                <w:rFonts w:ascii="Arial Unicode MS" w:hAnsi="Arial Unicode MS" w:eastAsia="Arial Unicode MS"/>
+                <w:rFonts w:ascii="AppleGothic" w:hAnsi="AppleGothic" w:eastAsia="AppleGothic"/>
                 <w:b w:val="0"/>
                 <w:i w:val="0"/>
                 <w:color w:val="000000"/>
@@ -5801,7 +7392,7 @@
             </w:pPr>
             <w:r>
               <w:rPr>
-                <w:rFonts w:ascii="Arial Unicode MS" w:hAnsi="Arial Unicode MS" w:eastAsia="Arial Unicode MS"/>
+                <w:rFonts w:ascii="AppleGothic" w:hAnsi="AppleGothic" w:eastAsia="AppleGothic"/>
                 <w:b w:val="0"/>
                 <w:i w:val="0"/>
                 <w:color w:val="000000"/>
@@ -5829,7 +7420,7 @@
             </w:pPr>
             <w:r>
               <w:rPr>
-                <w:rFonts w:ascii="Arial Unicode MS" w:hAnsi="Arial Unicode MS" w:eastAsia="Arial Unicode MS"/>
+                <w:rFonts w:ascii="AppleGothic" w:hAnsi="AppleGothic" w:eastAsia="AppleGothic"/>
                 <w:b w:val="0"/>
                 <w:i w:val="0"/>
                 <w:color w:val="000000"/>
@@ -5857,7 +7448,7 @@
             </w:pPr>
             <w:r>
               <w:rPr>
-                <w:rFonts w:ascii="Arial Unicode MS" w:hAnsi="Arial Unicode MS" w:eastAsia="Arial Unicode MS"/>
+                <w:rFonts w:ascii="AppleGothic" w:hAnsi="AppleGothic" w:eastAsia="AppleGothic"/>
                 <w:b w:val="0"/>
                 <w:i w:val="0"/>
                 <w:color w:val="000000"/>
@@ -5891,7 +7482,7 @@
             </w:pPr>
             <w:r>
               <w:rPr>
-                <w:rFonts w:ascii="Arial Unicode MS" w:hAnsi="Arial Unicode MS" w:eastAsia="Arial Unicode MS"/>
+                <w:rFonts w:ascii="AppleGothic" w:hAnsi="AppleGothic" w:eastAsia="AppleGothic"/>
                 <w:b w:val="0"/>
                 <w:i w:val="0"/>
                 <w:color w:val="000000"/>
@@ -5919,7 +7510,7 @@
             </w:pPr>
             <w:r>
               <w:rPr>
-                <w:rFonts w:ascii="Arial Unicode MS" w:hAnsi="Arial Unicode MS" w:eastAsia="Arial Unicode MS"/>
+                <w:rFonts w:ascii="AppleGothic" w:hAnsi="AppleGothic" w:eastAsia="AppleGothic"/>
                 <w:b w:val="0"/>
                 <w:i w:val="0"/>
                 <w:color w:val="000000"/>
@@ -5947,7 +7538,7 @@
             </w:pPr>
             <w:r>
               <w:rPr>
-                <w:rFonts w:ascii="Arial Unicode MS" w:hAnsi="Arial Unicode MS" w:eastAsia="Arial Unicode MS"/>
+                <w:rFonts w:ascii="AppleGothic" w:hAnsi="AppleGothic" w:eastAsia="AppleGothic"/>
                 <w:b w:val="0"/>
                 <w:i w:val="0"/>
                 <w:color w:val="000000"/>
@@ -5981,7 +7572,7 @@
             </w:pPr>
             <w:r>
               <w:rPr>
-                <w:rFonts w:ascii="Arial Unicode MS" w:hAnsi="Arial Unicode MS" w:eastAsia="Arial Unicode MS"/>
+                <w:rFonts w:ascii="AppleGothic" w:hAnsi="AppleGothic" w:eastAsia="AppleGothic"/>
                 <w:b w:val="0"/>
                 <w:i w:val="0"/>
                 <w:color w:val="000000"/>
@@ -6009,7 +7600,7 @@
             </w:pPr>
             <w:r>
               <w:rPr>
-                <w:rFonts w:ascii="Arial Unicode MS" w:hAnsi="Arial Unicode MS" w:eastAsia="Arial Unicode MS"/>
+                <w:rFonts w:ascii="AppleGothic" w:hAnsi="AppleGothic" w:eastAsia="AppleGothic"/>
                 <w:b w:val="0"/>
                 <w:i w:val="0"/>
                 <w:color w:val="000000"/>
@@ -6037,7 +7628,7 @@
             </w:pPr>
             <w:r>
               <w:rPr>
-                <w:rFonts w:ascii="Arial Unicode MS" w:hAnsi="Arial Unicode MS" w:eastAsia="Arial Unicode MS"/>
+                <w:rFonts w:ascii="AppleGothic" w:hAnsi="AppleGothic" w:eastAsia="AppleGothic"/>
                 <w:b w:val="0"/>
                 <w:i w:val="0"/>
                 <w:color w:val="000000"/>
@@ -6071,7 +7662,7 @@
             </w:pPr>
             <w:r>
               <w:rPr>
-                <w:rFonts w:ascii="Arial Unicode MS" w:hAnsi="Arial Unicode MS" w:eastAsia="Arial Unicode MS"/>
+                <w:rFonts w:ascii="AppleGothic" w:hAnsi="AppleGothic" w:eastAsia="AppleGothic"/>
                 <w:b w:val="0"/>
                 <w:i w:val="0"/>
                 <w:color w:val="000000"/>
@@ -6099,7 +7690,7 @@
             </w:pPr>
             <w:r>
               <w:rPr>
-                <w:rFonts w:ascii="Arial Unicode MS" w:hAnsi="Arial Unicode MS" w:eastAsia="Arial Unicode MS"/>
+                <w:rFonts w:ascii="AppleGothic" w:hAnsi="AppleGothic" w:eastAsia="AppleGothic"/>
                 <w:b w:val="0"/>
                 <w:i w:val="0"/>
                 <w:color w:val="000000"/>
@@ -6127,7 +7718,7 @@
             </w:pPr>
             <w:r>
               <w:rPr>
-                <w:rFonts w:ascii="Arial Unicode MS" w:hAnsi="Arial Unicode MS" w:eastAsia="Arial Unicode MS"/>
+                <w:rFonts w:ascii="AppleGothic" w:hAnsi="AppleGothic" w:eastAsia="AppleGothic"/>
                 <w:b w:val="0"/>
                 <w:i w:val="0"/>
                 <w:color w:val="000000"/>
@@ -6161,7 +7752,187 @@
             </w:pPr>
             <w:r>
               <w:rPr>
-                <w:rFonts w:ascii="Arial Unicode MS" w:hAnsi="Arial Unicode MS" w:eastAsia="Arial Unicode MS"/>
+                <w:rFonts w:ascii="AppleGothic" w:hAnsi="AppleGothic" w:eastAsia="AppleGothic"/>
+                <w:b w:val="0"/>
+                <w:i w:val="0"/>
+                <w:color w:val="000000"/>
+                <w:sz w:val="18"/>
+              </w:rPr>
+              <w:t>외부 clean-room PR</w:t>
+            </w:r>
+          </w:p>
+        </w:tc>
+        <w:tc>
+          <w:tcPr>
+            <w:tcW w:type="dxa" w:w="1500"/>
+            <w:vAlign w:val="center"/>
+            <w:tcMar>
+              <w:top w:w="80" w:type="dxa"/>
+              <w:bottom w:w="80" w:type="dxa"/>
+              <w:start w:w="120" w:type="dxa"/>
+              <w:end w:w="120" w:type="dxa"/>
+            </w:tcMar>
+          </w:tcPr>
+          <w:p>
+            <w:pPr>
+              <w:spacing w:after="0"/>
+              <w:jc w:val="center"/>
+            </w:pPr>
+            <w:r>
+              <w:rPr>
+                <w:rFonts w:ascii="AppleGothic" w:hAnsi="AppleGothic" w:eastAsia="AppleGothic"/>
+                <w:b w:val="0"/>
+                <w:i w:val="0"/>
+                <w:color w:val="000000"/>
+                <w:sz w:val="18"/>
+              </w:rPr>
+              <w:t>미완료</w:t>
+            </w:r>
+          </w:p>
+        </w:tc>
+        <w:tc>
+          <w:tcPr>
+            <w:tcW w:type="dxa" w:w="5260"/>
+            <w:vAlign w:val="center"/>
+            <w:tcMar>
+              <w:top w:w="80" w:type="dxa"/>
+              <w:bottom w:w="80" w:type="dxa"/>
+              <w:start w:w="120" w:type="dxa"/>
+              <w:end w:w="120" w:type="dxa"/>
+            </w:tcMar>
+          </w:tcPr>
+          <w:p>
+            <w:pPr>
+              <w:spacing w:after="0"/>
+              <w:jc w:val="left"/>
+            </w:pPr>
+            <w:r>
+              <w:rPr>
+                <w:rFonts w:ascii="AppleGothic" w:hAnsi="AppleGothic" w:eastAsia="AppleGothic"/>
+                <w:b w:val="0"/>
+                <w:i w:val="0"/>
+                <w:color w:val="000000"/>
+                <w:sz w:val="18"/>
+              </w:rPr>
+              <w:t>제3자가 fresh clone에서 1-command verifier 실행 후 JSON PR</w:t>
+            </w:r>
+          </w:p>
+        </w:tc>
+      </w:tr>
+      <w:tr>
+        <w:trPr>
+          <w:trHeight w:hRule="atLeast"/>
+          <w:cantSplit/>
+        </w:trPr>
+        <w:tc>
+          <w:tcPr>
+            <w:tcW w:type="dxa" w:w="2600"/>
+            <w:vAlign w:val="center"/>
+            <w:tcMar>
+              <w:top w:w="80" w:type="dxa"/>
+              <w:bottom w:w="80" w:type="dxa"/>
+              <w:start w:w="120" w:type="dxa"/>
+              <w:end w:w="120" w:type="dxa"/>
+            </w:tcMar>
+          </w:tcPr>
+          <w:p>
+            <w:pPr>
+              <w:spacing w:after="0"/>
+              <w:jc w:val="left"/>
+            </w:pPr>
+            <w:r>
+              <w:rPr>
+                <w:rFonts w:ascii="AppleGothic" w:hAnsi="AppleGothic" w:eastAsia="AppleGothic"/>
+                <w:b w:val="0"/>
+                <w:i w:val="0"/>
+                <w:color w:val="000000"/>
+                <w:sz w:val="18"/>
+              </w:rPr>
+              <w:t>trained MNIST physical</w:t>
+            </w:r>
+          </w:p>
+        </w:tc>
+        <w:tc>
+          <w:tcPr>
+            <w:tcW w:type="dxa" w:w="1500"/>
+            <w:vAlign w:val="center"/>
+            <w:tcMar>
+              <w:top w:w="80" w:type="dxa"/>
+              <w:bottom w:w="80" w:type="dxa"/>
+              <w:start w:w="120" w:type="dxa"/>
+              <w:end w:w="120" w:type="dxa"/>
+            </w:tcMar>
+          </w:tcPr>
+          <w:p>
+            <w:pPr>
+              <w:spacing w:after="0"/>
+              <w:jc w:val="center"/>
+            </w:pPr>
+            <w:r>
+              <w:rPr>
+                <w:rFonts w:ascii="AppleGothic" w:hAnsi="AppleGothic" w:eastAsia="AppleGothic"/>
+                <w:b w:val="0"/>
+                <w:i w:val="0"/>
+                <w:color w:val="000000"/>
+                <w:sz w:val="18"/>
+              </w:rPr>
+              <w:t>미완료</w:t>
+            </w:r>
+          </w:p>
+        </w:tc>
+        <w:tc>
+          <w:tcPr>
+            <w:tcW w:type="dxa" w:w="5260"/>
+            <w:vAlign w:val="center"/>
+            <w:tcMar>
+              <w:top w:w="80" w:type="dxa"/>
+              <w:bottom w:w="80" w:type="dxa"/>
+              <w:start w:w="120" w:type="dxa"/>
+              <w:end w:w="120" w:type="dxa"/>
+            </w:tcMar>
+          </w:tcPr>
+          <w:p>
+            <w:pPr>
+              <w:spacing w:after="0"/>
+              <w:jc w:val="left"/>
+            </w:pPr>
+            <w:r>
+              <w:rPr>
+                <w:rFonts w:ascii="AppleGothic" w:hAnsi="AppleGothic" w:eastAsia="AppleGothic"/>
+                <w:b w:val="0"/>
+                <w:i w:val="0"/>
+                <w:color w:val="000000"/>
+                <w:sz w:val="18"/>
+              </w:rPr>
+              <w:t>ESP32 UART transcript와 cycles/stack 결과 체크인</w:t>
+            </w:r>
+          </w:p>
+        </w:tc>
+      </w:tr>
+      <w:tr>
+        <w:trPr>
+          <w:trHeight w:hRule="atLeast"/>
+          <w:cantSplit/>
+        </w:trPr>
+        <w:tc>
+          <w:tcPr>
+            <w:tcW w:type="dxa" w:w="2600"/>
+            <w:vAlign w:val="center"/>
+            <w:tcMar>
+              <w:top w:w="80" w:type="dxa"/>
+              <w:bottom w:w="80" w:type="dxa"/>
+              <w:start w:w="120" w:type="dxa"/>
+              <w:end w:w="120" w:type="dxa"/>
+            </w:tcMar>
+          </w:tcPr>
+          <w:p>
+            <w:pPr>
+              <w:spacing w:after="0"/>
+              <w:jc w:val="left"/>
+            </w:pPr>
+            <w:r>
+              <w:rPr>
+                <w:rFonts w:ascii="AppleGothic" w:hAnsi="AppleGothic" w:eastAsia="AppleGothic"/>
                 <w:b w:val="0"/>
                 <w:i w:val="0"/>
                 <w:color w:val="000000"/>
@@ -6189,7 +7960,7 @@
             </w:pPr>
             <w:r>
               <w:rPr>
-                <w:rFonts w:ascii="Arial Unicode MS" w:hAnsi="Arial Unicode MS" w:eastAsia="Arial Unicode MS"/>
+                <w:rFonts w:ascii="AppleGothic" w:hAnsi="AppleGothic" w:eastAsia="AppleGothic"/>
                 <w:b w:val="0"/>
                 <w:i w:val="0"/>
                 <w:color w:val="000000"/>
@@ -6217,7 +7988,7 @@
             </w:pPr>
             <w:r>
               <w:rPr>
-                <w:rFonts w:ascii="Arial Unicode MS" w:hAnsi="Arial Unicode MS" w:eastAsia="Arial Unicode MS"/>
+                <w:rFonts w:ascii="AppleGothic" w:hAnsi="AppleGothic" w:eastAsia="AppleGothic"/>
                 <w:b w:val="0"/>
                 <w:i w:val="0"/>
                 <w:color w:val="000000"/>
@@ -6248,7 +8019,7 @@
       </w:pPr>
       <w:r>
         <w:rPr>
-          <w:rFonts w:ascii="Arial Unicode MS" w:hAnsi="Arial Unicode MS" w:eastAsia="Arial Unicode MS"/>
+          <w:rFonts w:ascii="AppleGothic" w:hAnsi="AppleGothic" w:eastAsia="AppleGothic"/>
           <w:b/>
           <w:i w:val="0"/>
           <w:color w:val="0B2545"/>
@@ -6258,7 +8029,7 @@
       </w:r>
       <w:r>
         <w:rPr>
-          <w:rFonts w:ascii="Arial Unicode MS" w:hAnsi="Arial Unicode MS" w:eastAsia="Arial Unicode MS"/>
+          <w:rFonts w:ascii="AppleGothic" w:hAnsi="AppleGothic" w:eastAsia="AppleGothic"/>
           <w:b w:val="0"/>
           <w:i w:val="0"/>
           <w:color w:val="0B2545"/>
@@ -6289,7 +8060,7 @@
       </w:pPr>
       <w:r>
         <w:rPr>
-          <w:rFonts w:ascii="Arial Unicode MS" w:hAnsi="Arial Unicode MS" w:eastAsia="Arial Unicode MS"/>
+          <w:rFonts w:ascii="AppleGothic" w:hAnsi="AppleGothic" w:eastAsia="AppleGothic"/>
           <w:b w:val="0"/>
           <w:i w:val="0"/>
           <w:color w:val="000000"/>
@@ -6307,7 +8078,7 @@
       </w:pPr>
       <w:r>
         <w:rPr>
-          <w:rFonts w:ascii="Arial Unicode MS" w:hAnsi="Arial Unicode MS" w:eastAsia="Arial Unicode MS"/>
+          <w:rFonts w:ascii="AppleGothic" w:hAnsi="AppleGothic" w:eastAsia="AppleGothic"/>
           <w:b w:val="0"/>
           <w:i w:val="0"/>
           <w:color w:val="000000"/>
@@ -6325,7 +8096,7 @@
       </w:pPr>
       <w:r>
         <w:rPr>
-          <w:rFonts w:ascii="Arial Unicode MS" w:hAnsi="Arial Unicode MS" w:eastAsia="Arial Unicode MS"/>
+          <w:rFonts w:ascii="AppleGothic" w:hAnsi="AppleGothic" w:eastAsia="AppleGothic"/>
           <w:b w:val="0"/>
           <w:i w:val="0"/>
           <w:color w:val="000000"/>
@@ -6343,7 +8114,97 @@
       </w:pPr>
       <w:r>
         <w:rPr>
-          <w:rFonts w:ascii="Arial Unicode MS" w:hAnsi="Arial Unicode MS" w:eastAsia="Arial Unicode MS"/>
+          <w:rFonts w:ascii="AppleGothic" w:hAnsi="AppleGothic" w:eastAsia="AppleGothic"/>
+          <w:b w:val="0"/>
+          <w:i w:val="0"/>
+          <w:color w:val="000000"/>
+          <w:sz w:val="22"/>
+        </w:rPr>
+        <w:t>benchmarks/esp32/results/mobilenet_v2_025_cifar10_esp32_tflm_espnn.md</w:t>
+      </w:r>
+    </w:p>
+    <w:p>
+      <w:pPr>
+        <w:numPr>
+          <w:ilvl w:val="0"/>
+          <w:numId w:val="10"/>
+        </w:numPr>
+      </w:pPr>
+      <w:r>
+        <w:rPr>
+          <w:rFonts w:ascii="AppleGothic" w:hAnsi="AppleGothic" w:eastAsia="AppleGothic"/>
+          <w:b w:val="0"/>
+          <w:i w:val="0"/>
+          <w:color w:val="000000"/>
+          <w:sz w:val="22"/>
+        </w:rPr>
+        <w:t>benchmarks/microtvm_compare/results/mnist_cortex_m4_cross_build.json</w:t>
+      </w:r>
+    </w:p>
+    <w:p>
+      <w:pPr>
+        <w:numPr>
+          <w:ilvl w:val="0"/>
+          <w:numId w:val="10"/>
+        </w:numPr>
+      </w:pPr>
+      <w:r>
+        <w:rPr>
+          <w:rFonts w:ascii="AppleGothic" w:hAnsi="AppleGothic" w:eastAsia="AppleGothic"/>
+          <w:b w:val="0"/>
+          <w:i w:val="0"/>
+          <w:color w:val="000000"/>
+          <w:sz w:val="22"/>
+        </w:rPr>
+        <w:t>examples/mnist/evidence/mnist_evidence.json</w:t>
+      </w:r>
+    </w:p>
+    <w:p>
+      <w:pPr>
+        <w:numPr>
+          <w:ilvl w:val="0"/>
+          <w:numId w:val="10"/>
+        </w:numPr>
+      </w:pPr>
+      <w:r>
+        <w:rPr>
+          <w:rFonts w:ascii="AppleGothic" w:hAnsi="AppleGothic" w:eastAsia="AppleGothic"/>
+          <w:b w:val="0"/>
+          <w:i w:val="0"/>
+          <w:color w:val="000000"/>
+          <w:sz w:val="22"/>
+        </w:rPr>
+        <w:t>docs/COMPARISON.md</w:t>
+      </w:r>
+    </w:p>
+    <w:p>
+      <w:pPr>
+        <w:numPr>
+          <w:ilvl w:val="0"/>
+          <w:numId w:val="10"/>
+        </w:numPr>
+      </w:pPr>
+      <w:r>
+        <w:rPr>
+          <w:rFonts w:ascii="AppleGothic" w:hAnsi="AppleGothic" w:eastAsia="AppleGothic"/>
+          <w:b w:val="0"/>
+          <w:i w:val="0"/>
+          <w:color w:val="000000"/>
+          <w:sz w:val="22"/>
+        </w:rPr>
+        <w:t>docs/CLEAN_ROOM_REPRODUCTION.md</w:t>
+      </w:r>
+    </w:p>
+    <w:p>
+      <w:pPr>
+        <w:numPr>
+          <w:ilvl w:val="0"/>
+          <w:numId w:val="10"/>
+        </w:numPr>
+      </w:pPr>
+      <w:r>
+        <w:rPr>
+          <w:rFonts w:ascii="AppleGothic" w:hAnsi="AppleGothic" w:eastAsia="AppleGothic"/>
           <w:b w:val="0"/>
           <w:i w:val="0"/>
           <w:color w:val="000000"/>
@@ -6361,7 +8222,7 @@
       </w:pPr>
       <w:r>
         <w:rPr>
-          <w:rFonts w:ascii="Arial Unicode MS" w:hAnsi="Arial Unicode MS" w:eastAsia="Arial Unicode MS"/>
+          <w:rFonts w:ascii="AppleGothic" w:hAnsi="AppleGothic" w:eastAsia="AppleGothic"/>
           <w:b w:val="0"/>
           <w:i w:val="0"/>
           <w:color w:val="000000"/>
@@ -6379,7 +8240,7 @@
       </w:pPr>
       <w:r>
         <w:rPr>
-          <w:rFonts w:ascii="Arial Unicode MS" w:hAnsi="Arial Unicode MS" w:eastAsia="Arial Unicode MS"/>
+          <w:rFonts w:ascii="AppleGothic" w:hAnsi="AppleGothic" w:eastAsia="AppleGothic"/>
           <w:b w:val="0"/>
           <w:i w:val="0"/>
           <w:color w:val="000000"/>
@@ -6397,7 +8258,7 @@
       </w:pPr>
       <w:r>
         <w:rPr>
-          <w:rFonts w:ascii="Arial Unicode MS" w:hAnsi="Arial Unicode MS" w:eastAsia="Arial Unicode MS"/>
+          <w:rFonts w:ascii="AppleGothic" w:hAnsi="AppleGothic" w:eastAsia="AppleGothic"/>
           <w:b w:val="0"/>
           <w:i w:val="0"/>
           <w:color w:val="000000"/>
@@ -6415,7 +8276,7 @@
       </w:pPr>
       <w:r>
         <w:rPr>
-          <w:rFonts w:ascii="Arial Unicode MS" w:hAnsi="Arial Unicode MS" w:eastAsia="Arial Unicode MS"/>
+          <w:rFonts w:ascii="AppleGothic" w:hAnsi="AppleGothic" w:eastAsia="AppleGothic"/>
           <w:b w:val="0"/>
           <w:i w:val="0"/>
           <w:color w:val="000000"/>
@@ -6445,7 +8306,7 @@
     </w:pPr>
     <w:r>
       <w:rPr>
-        <w:rFonts w:ascii="Arial Unicode MS" w:hAnsi="Arial Unicode MS" w:eastAsia="Arial Unicode MS"/>
+        <w:rFonts w:ascii="AppleGothic" w:hAnsi="AppleGothic" w:eastAsia="AppleGothic"/>
         <w:b w:val="0"/>
         <w:i w:val="0"/>
         <w:color w:val="666666"/>
@@ -6455,7 +8316,7 @@
     </w:r>
     <w:r>
       <w:rPr>
-        <w:rFonts w:ascii="Arial Unicode MS" w:hAnsi="Arial Unicode MS" w:eastAsia="Arial Unicode MS"/>
+        <w:rFonts w:ascii="AppleGothic" w:hAnsi="AppleGothic" w:eastAsia="AppleGothic"/>
         <w:b w:val="0"/>
         <w:i w:val="0"/>
         <w:color w:val="666666"/>
@@ -6468,7 +8329,7 @@
     </w:r>
     <w:r>
       <w:rPr>
-        <w:rFonts w:ascii="Arial Unicode MS" w:hAnsi="Arial Unicode MS" w:eastAsia="Arial Unicode MS"/>
+        <w:rFonts w:ascii="AppleGothic" w:hAnsi="AppleGothic" w:eastAsia="AppleGothic"/>
         <w:b w:val="0"/>
         <w:i w:val="0"/>
         <w:color w:val="666666"/>
@@ -6478,7 +8339,7 @@
     </w:r>
     <w:r>
       <w:rPr>
-        <w:rFonts w:ascii="Arial Unicode MS" w:hAnsi="Arial Unicode MS" w:eastAsia="Arial Unicode MS"/>
+        <w:rFonts w:ascii="AppleGothic" w:hAnsi="AppleGothic" w:eastAsia="AppleGothic"/>
         <w:b w:val="0"/>
         <w:i w:val="0"/>
         <w:color w:val="666666"/>
@@ -6503,7 +8364,7 @@
     </w:pPr>
     <w:r>
       <w:rPr>
-        <w:rFonts w:ascii="Arial Unicode MS" w:hAnsi="Arial Unicode MS" w:eastAsia="Arial Unicode MS"/>
+        <w:rFonts w:ascii="AppleGothic" w:hAnsi="AppleGothic" w:eastAsia="AppleGothic"/>
         <w:b w:val="0"/>
         <w:i w:val="0"/>
         <w:color w:val="666666"/>
@@ -6939,7 +8800,7 @@
       <w:spacing w:before="0" w:after="120" w:line="264" w:lineRule="auto"/>
     </w:pPr>
     <w:rPr>
-      <w:rFonts w:ascii="Arial Unicode MS" w:hAnsi="Arial Unicode MS" w:eastAsia="Arial Unicode MS"/>
+      <w:rFonts w:ascii="AppleGothic" w:hAnsi="AppleGothic" w:eastAsia="AppleGothic"/>
       <w:b w:val="0"/>
       <w:color w:val="000000"/>
       <w:sz w:val="22"/>
@@ -7004,7 +8865,7 @@
       <w:outlineLvl w:val="0"/>
     </w:pPr>
     <w:rPr>
-      <w:rFonts w:asciiTheme="majorHAnsi" w:eastAsiaTheme="majorEastAsia" w:hAnsiTheme="majorHAnsi" w:cstheme="majorBidi" w:ascii="Arial Unicode MS" w:hAnsi="Arial Unicode MS" w:eastAsia="Arial Unicode MS"/>
+      <w:rFonts w:asciiTheme="majorHAnsi" w:eastAsiaTheme="majorEastAsia" w:hAnsiTheme="majorHAnsi" w:cstheme="majorBidi" w:ascii="AppleGothic" w:hAnsi="AppleGothic" w:eastAsia="AppleGothic"/>
       <w:b/>
       <w:bCs/>
       <w:color w:val="2E74B5"/>
@@ -7028,7 +8889,7 @@
       <w:outlineLvl w:val="1"/>
     </w:pPr>
     <w:rPr>
-      <w:rFonts w:asciiTheme="majorHAnsi" w:eastAsiaTheme="majorEastAsia" w:hAnsiTheme="majorHAnsi" w:cstheme="majorBidi" w:ascii="Arial Unicode MS" w:hAnsi="Arial Unicode MS" w:eastAsia="Arial Unicode MS"/>
+      <w:rFonts w:asciiTheme="majorHAnsi" w:eastAsiaTheme="majorEastAsia" w:hAnsiTheme="majorHAnsi" w:cstheme="majorBidi" w:ascii="AppleGothic" w:hAnsi="AppleGothic" w:eastAsia="AppleGothic"/>
       <w:b/>
       <w:bCs/>
       <w:color w:val="2E74B5"/>
@@ -7052,7 +8913,7 @@
       <w:outlineLvl w:val="2"/>
     </w:pPr>
     <w:rPr>
-      <w:rFonts w:asciiTheme="majorHAnsi" w:eastAsiaTheme="majorEastAsia" w:hAnsiTheme="majorHAnsi" w:cstheme="majorBidi" w:ascii="Arial Unicode MS" w:hAnsi="Arial Unicode MS" w:eastAsia="Arial Unicode MS"/>
+      <w:rFonts w:asciiTheme="majorHAnsi" w:eastAsiaTheme="majorEastAsia" w:hAnsiTheme="majorHAnsi" w:cstheme="majorBidi" w:ascii="AppleGothic" w:hAnsi="AppleGothic" w:eastAsia="AppleGothic"/>
       <w:b/>
       <w:bCs/>
       <w:color w:val="1F4D78"/>
@@ -7295,7 +9156,7 @@
       <w:contextualSpacing/>
     </w:pPr>
     <w:rPr>
-      <w:rFonts w:asciiTheme="majorHAnsi" w:eastAsiaTheme="majorEastAsia" w:hAnsiTheme="majorHAnsi" w:cstheme="majorBidi" w:ascii="Arial Unicode MS" w:hAnsi="Arial Unicode MS" w:eastAsia="Arial Unicode MS"/>
+      <w:rFonts w:asciiTheme="majorHAnsi" w:eastAsiaTheme="majorEastAsia" w:hAnsiTheme="majorHAnsi" w:cstheme="majorBidi" w:ascii="AppleGothic" w:hAnsi="AppleGothic" w:eastAsia="AppleGothic"/>
       <w:b/>
       <w:color w:val="0B2545"/>
       <w:spacing w:val="5"/>
@@ -7335,7 +9196,7 @@
       <w:spacing w:before="0" w:after="240"/>
     </w:pPr>
     <w:rPr>
-      <w:rFonts w:asciiTheme="majorHAnsi" w:eastAsiaTheme="majorEastAsia" w:hAnsiTheme="majorHAnsi" w:cstheme="majorBidi" w:ascii="Arial Unicode MS" w:hAnsi="Arial Unicode MS" w:eastAsia="Arial Unicode MS"/>
+      <w:rFonts w:asciiTheme="majorHAnsi" w:eastAsiaTheme="majorEastAsia" w:hAnsiTheme="majorHAnsi" w:cstheme="majorBidi" w:ascii="AppleGothic" w:hAnsi="AppleGothic" w:eastAsia="AppleGothic"/>
       <w:b w:val="0"/>
       <w:i/>
       <w:iCs/>
@@ -7741,7 +9602,7 @@
       <w:spacing w:line="240" w:lineRule="auto" w:before="80" w:after="80"/>
     </w:pPr>
     <w:rPr>
-      <w:rFonts w:ascii="Arial Unicode MS" w:hAnsi="Arial Unicode MS" w:eastAsia="Arial Unicode MS"/>
+      <w:rFonts w:ascii="AppleGothic" w:hAnsi="AppleGothic" w:eastAsia="AppleGothic"/>
       <w:b w:val="0"/>
       <w:bCs/>
       <w:color w:val="666666"/>

</xml_diff>

<commit_message>
release: freeze BakeNN 1.0.0
</commit_message>
<xml_diff>
--- a/docs/submission/BakeNN_오픈소스개발자대회_결과보고서_초안.docx
+++ b/docs/submission/BakeNN_오픈소스개발자대회_결과보고서_초안.docx
@@ -28,7 +28,7 @@
       </w:pPr>
       <w:r>
         <w:rPr>
-          <w:rFonts w:ascii="AppleGothic" w:hAnsi="AppleGothic" w:eastAsia="AppleGothic"/>
+          <w:rFonts w:ascii="Arial Unicode MS" w:hAnsi="Arial Unicode MS" w:eastAsia="Arial Unicode MS"/>
           <w:b/>
           <w:i w:val="0"/>
           <w:color w:val="2E74B5"/>
@@ -44,7 +44,7 @@
       </w:pPr>
       <w:r>
         <w:rPr>
-          <w:rFonts w:ascii="AppleGothic" w:hAnsi="AppleGothic" w:eastAsia="AppleGothic"/>
+          <w:rFonts w:ascii="Arial Unicode MS" w:hAnsi="Arial Unicode MS" w:eastAsia="Arial Unicode MS"/>
           <w:b/>
           <w:i w:val="0"/>
           <w:color w:val="0B2545"/>
@@ -60,7 +60,7 @@
       </w:pPr>
       <w:r>
         <w:rPr>
-          <w:rFonts w:ascii="AppleGothic" w:hAnsi="AppleGothic" w:eastAsia="AppleGothic"/>
+          <w:rFonts w:ascii="Arial Unicode MS" w:hAnsi="Arial Unicode MS" w:eastAsia="Arial Unicode MS"/>
           <w:b w:val="0"/>
           <w:i w:val="0"/>
           <w:color w:val="1F4D78"/>
@@ -75,7 +75,7 @@
       </w:pPr>
       <w:r>
         <w:rPr>
-          <w:rFonts w:ascii="AppleGothic" w:hAnsi="AppleGothic" w:eastAsia="AppleGothic"/>
+          <w:rFonts w:ascii="Arial Unicode MS" w:hAnsi="Arial Unicode MS" w:eastAsia="Arial Unicode MS"/>
           <w:b w:val="0"/>
           <w:i w:val="0"/>
           <w:color w:val="666666"/>
@@ -129,7 +129,7 @@
             </w:pPr>
             <w:r>
               <w:rPr>
-                <w:rFonts w:ascii="AppleGothic" w:hAnsi="AppleGothic" w:eastAsia="AppleGothic"/>
+                <w:rFonts w:ascii="Arial Unicode MS" w:hAnsi="Arial Unicode MS" w:eastAsia="Arial Unicode MS"/>
                 <w:b/>
                 <w:i w:val="0"/>
                 <w:color w:val="0B2545"/>
@@ -158,7 +158,7 @@
             </w:pPr>
             <w:r>
               <w:rPr>
-                <w:rFonts w:ascii="AppleGothic" w:hAnsi="AppleGothic" w:eastAsia="AppleGothic"/>
+                <w:rFonts w:ascii="Arial Unicode MS" w:hAnsi="Arial Unicode MS" w:eastAsia="Arial Unicode MS"/>
                 <w:b/>
                 <w:i w:val="0"/>
                 <w:color w:val="0B2545"/>
@@ -192,7 +192,7 @@
             </w:pPr>
             <w:r>
               <w:rPr>
-                <w:rFonts w:ascii="AppleGothic" w:hAnsi="AppleGothic" w:eastAsia="AppleGothic"/>
+                <w:rFonts w:ascii="Arial Unicode MS" w:hAnsi="Arial Unicode MS" w:eastAsia="Arial Unicode MS"/>
                 <w:b w:val="0"/>
                 <w:i w:val="0"/>
                 <w:color w:val="000000"/>
@@ -220,7 +220,7 @@
             </w:pPr>
             <w:r>
               <w:rPr>
-                <w:rFonts w:ascii="AppleGothic" w:hAnsi="AppleGothic" w:eastAsia="AppleGothic"/>
+                <w:rFonts w:ascii="Arial Unicode MS" w:hAnsi="Arial Unicode MS" w:eastAsia="Arial Unicode MS"/>
                 <w:b w:val="0"/>
                 <w:i w:val="0"/>
                 <w:color w:val="000000"/>
@@ -254,7 +254,7 @@
             </w:pPr>
             <w:r>
               <w:rPr>
-                <w:rFonts w:ascii="AppleGothic" w:hAnsi="AppleGothic" w:eastAsia="AppleGothic"/>
+                <w:rFonts w:ascii="Arial Unicode MS" w:hAnsi="Arial Unicode MS" w:eastAsia="Arial Unicode MS"/>
                 <w:b w:val="0"/>
                 <w:i w:val="0"/>
                 <w:color w:val="000000"/>
@@ -282,7 +282,7 @@
             </w:pPr>
             <w:r>
               <w:rPr>
-                <w:rFonts w:ascii="AppleGothic" w:hAnsi="AppleGothic" w:eastAsia="AppleGothic"/>
+                <w:rFonts w:ascii="Arial Unicode MS" w:hAnsi="Arial Unicode MS" w:eastAsia="Arial Unicode MS"/>
                 <w:b w:val="0"/>
                 <w:i w:val="0"/>
                 <w:color w:val="000000"/>
@@ -316,7 +316,7 @@
             </w:pPr>
             <w:r>
               <w:rPr>
-                <w:rFonts w:ascii="AppleGothic" w:hAnsi="AppleGothic" w:eastAsia="AppleGothic"/>
+                <w:rFonts w:ascii="Arial Unicode MS" w:hAnsi="Arial Unicode MS" w:eastAsia="Arial Unicode MS"/>
                 <w:b w:val="0"/>
                 <w:i w:val="0"/>
                 <w:color w:val="000000"/>
@@ -344,13 +344,13 @@
             </w:pPr>
             <w:r>
               <w:rPr>
-                <w:rFonts w:ascii="AppleGothic" w:hAnsi="AppleGothic" w:eastAsia="AppleGothic"/>
+                <w:rFonts w:ascii="Arial Unicode MS" w:hAnsi="Arial Unicode MS" w:eastAsia="Arial Unicode MS"/>
                 <w:b w:val="0"/>
                 <w:i w:val="0"/>
                 <w:color w:val="000000"/>
                 <w:sz w:val="18"/>
               </w:rPr>
-              <w:t>BakeNN 0.1.0 (출품 준비 브랜치)</w:t>
+              <w:t>BakeNN 1.0.0</w:t>
             </w:r>
           </w:p>
         </w:tc>
@@ -378,7 +378,7 @@
             </w:pPr>
             <w:r>
               <w:rPr>
-                <w:rFonts w:ascii="AppleGothic" w:hAnsi="AppleGothic" w:eastAsia="AppleGothic"/>
+                <w:rFonts w:ascii="Arial Unicode MS" w:hAnsi="Arial Unicode MS" w:eastAsia="Arial Unicode MS"/>
                 <w:b w:val="0"/>
                 <w:i w:val="0"/>
                 <w:color w:val="000000"/>
@@ -406,13 +406,13 @@
             </w:pPr>
             <w:r>
               <w:rPr>
-                <w:rFonts w:ascii="AppleGothic" w:hAnsi="AppleGothic" w:eastAsia="AppleGothic"/>
+                <w:rFonts w:ascii="Arial Unicode MS" w:hAnsi="Arial Unicode MS" w:eastAsia="Arial Unicode MS"/>
                 <w:b w:val="0"/>
                 <w:i w:val="0"/>
                 <w:color w:val="000000"/>
                 <w:sz w:val="18"/>
               </w:rPr>
-              <w:t>2026년 8월 17일</w:t>
+              <w:t>2026년 8월 26일</w:t>
             </w:r>
           </w:p>
         </w:tc>
@@ -440,7 +440,7 @@
             </w:pPr>
             <w:r>
               <w:rPr>
-                <w:rFonts w:ascii="AppleGothic" w:hAnsi="AppleGothic" w:eastAsia="AppleGothic"/>
+                <w:rFonts w:ascii="Arial Unicode MS" w:hAnsi="Arial Unicode MS" w:eastAsia="Arial Unicode MS"/>
                 <w:b w:val="0"/>
                 <w:i w:val="0"/>
                 <w:color w:val="000000"/>
@@ -468,7 +468,7 @@
             </w:pPr>
             <w:r>
               <w:rPr>
-                <w:rFonts w:ascii="AppleGothic" w:hAnsi="AppleGothic" w:eastAsia="AppleGothic"/>
+                <w:rFonts w:ascii="Arial Unicode MS" w:hAnsi="Arial Unicode MS" w:eastAsia="Arial Unicode MS"/>
                 <w:b w:val="0"/>
                 <w:i w:val="0"/>
                 <w:color w:val="000000"/>
@@ -491,7 +491,7 @@
       </w:pPr>
       <w:r>
         <w:rPr>
-          <w:rFonts w:ascii="AppleGothic" w:hAnsi="AppleGothic" w:eastAsia="AppleGothic"/>
+          <w:rFonts w:ascii="Arial Unicode MS" w:hAnsi="Arial Unicode MS" w:eastAsia="Arial Unicode MS"/>
           <w:b w:val="0"/>
           <w:i/>
           <w:color w:val="666666"/>
@@ -527,7 +527,7 @@
       </w:pPr>
       <w:r>
         <w:rPr>
-          <w:rFonts w:ascii="AppleGothic" w:hAnsi="AppleGothic" w:eastAsia="AppleGothic"/>
+          <w:rFonts w:ascii="Arial Unicode MS" w:hAnsi="Arial Unicode MS" w:eastAsia="Arial Unicode MS"/>
           <w:b/>
           <w:i w:val="0"/>
           <w:color w:val="0B2545"/>
@@ -537,7 +537,7 @@
       </w:r>
       <w:r>
         <w:rPr>
-          <w:rFonts w:ascii="AppleGothic" w:hAnsi="AppleGothic" w:eastAsia="AppleGothic"/>
+          <w:rFonts w:ascii="Arial Unicode MS" w:hAnsi="Arial Unicode MS" w:eastAsia="Arial Unicode MS"/>
           <w:b w:val="0"/>
           <w:i w:val="0"/>
           <w:color w:val="0B2545"/>
@@ -549,7 +549,7 @@
     <w:p>
       <w:r>
         <w:rPr>
-          <w:rFonts w:ascii="AppleGothic" w:hAnsi="AppleGothic" w:eastAsia="AppleGothic"/>
+          <w:rFonts w:ascii="Arial Unicode MS" w:hAnsi="Arial Unicode MS" w:eastAsia="Arial Unicode MS"/>
           <w:b w:val="0"/>
           <w:i w:val="0"/>
           <w:color w:val="000000"/>
@@ -561,7 +561,7 @@
     <w:p>
       <w:r>
         <w:rPr>
-          <w:rFonts w:ascii="AppleGothic" w:hAnsi="AppleGothic" w:eastAsia="AppleGothic"/>
+          <w:rFonts w:ascii="Arial Unicode MS" w:hAnsi="Arial Unicode MS" w:eastAsia="Arial Unicode MS"/>
           <w:b w:val="0"/>
           <w:i w:val="0"/>
           <w:color w:val="000000"/>
@@ -587,7 +587,7 @@
       </w:pPr>
       <w:r>
         <w:rPr>
-          <w:rFonts w:ascii="AppleGothic" w:hAnsi="AppleGothic" w:eastAsia="AppleGothic"/>
+          <w:rFonts w:ascii="Arial Unicode MS" w:hAnsi="Arial Unicode MS" w:eastAsia="Arial Unicode MS"/>
           <w:b w:val="0"/>
           <w:i w:val="0"/>
           <w:color w:val="000000"/>
@@ -605,7 +605,7 @@
       </w:pPr>
       <w:r>
         <w:rPr>
-          <w:rFonts w:ascii="AppleGothic" w:hAnsi="AppleGothic" w:eastAsia="AppleGothic"/>
+          <w:rFonts w:ascii="Arial Unicode MS" w:hAnsi="Arial Unicode MS" w:eastAsia="Arial Unicode MS"/>
           <w:b w:val="0"/>
           <w:i w:val="0"/>
           <w:color w:val="000000"/>
@@ -623,7 +623,7 @@
       </w:pPr>
       <w:r>
         <w:rPr>
-          <w:rFonts w:ascii="AppleGothic" w:hAnsi="AppleGothic" w:eastAsia="AppleGothic"/>
+          <w:rFonts w:ascii="Arial Unicode MS" w:hAnsi="Arial Unicode MS" w:eastAsia="Arial Unicode MS"/>
           <w:b w:val="0"/>
           <w:i w:val="0"/>
           <w:color w:val="000000"/>
@@ -641,7 +641,7 @@
       </w:pPr>
       <w:r>
         <w:rPr>
-          <w:rFonts w:ascii="AppleGothic" w:hAnsi="AppleGothic" w:eastAsia="AppleGothic"/>
+          <w:rFonts w:ascii="Arial Unicode MS" w:hAnsi="Arial Unicode MS" w:eastAsia="Arial Unicode MS"/>
           <w:b w:val="0"/>
           <w:i w:val="0"/>
           <w:color w:val="000000"/>
@@ -695,7 +695,7 @@
       </w:pPr>
       <w:r>
         <w:rPr>
-          <w:rFonts w:ascii="AppleGothic" w:hAnsi="AppleGothic" w:eastAsia="AppleGothic"/>
+          <w:rFonts w:ascii="Arial Unicode MS" w:hAnsi="Arial Unicode MS" w:eastAsia="Arial Unicode MS"/>
           <w:b w:val="0"/>
           <w:i w:val="0"/>
           <w:color w:val="000000"/>
@@ -713,7 +713,7 @@
       </w:pPr>
       <w:r>
         <w:rPr>
-          <w:rFonts w:ascii="AppleGothic" w:hAnsi="AppleGothic" w:eastAsia="AppleGothic"/>
+          <w:rFonts w:ascii="Arial Unicode MS" w:hAnsi="Arial Unicode MS" w:eastAsia="Arial Unicode MS"/>
           <w:b w:val="0"/>
           <w:i w:val="0"/>
           <w:color w:val="000000"/>
@@ -731,7 +731,7 @@
       </w:pPr>
       <w:r>
         <w:rPr>
-          <w:rFonts w:ascii="AppleGothic" w:hAnsi="AppleGothic" w:eastAsia="AppleGothic"/>
+          <w:rFonts w:ascii="Arial Unicode MS" w:hAnsi="Arial Unicode MS" w:eastAsia="Arial Unicode MS"/>
           <w:b w:val="0"/>
           <w:i w:val="0"/>
           <w:color w:val="000000"/>
@@ -749,7 +749,7 @@
       </w:pPr>
       <w:r>
         <w:rPr>
-          <w:rFonts w:ascii="AppleGothic" w:hAnsi="AppleGothic" w:eastAsia="AppleGothic"/>
+          <w:rFonts w:ascii="Arial Unicode MS" w:hAnsi="Arial Unicode MS" w:eastAsia="Arial Unicode MS"/>
           <w:b w:val="0"/>
           <w:i w:val="0"/>
           <w:color w:val="000000"/>
@@ -767,7 +767,7 @@
       </w:pPr>
       <w:r>
         <w:rPr>
-          <w:rFonts w:ascii="AppleGothic" w:hAnsi="AppleGothic" w:eastAsia="AppleGothic"/>
+          <w:rFonts w:ascii="Arial Unicode MS" w:hAnsi="Arial Unicode MS" w:eastAsia="Arial Unicode MS"/>
           <w:b w:val="0"/>
           <w:i w:val="0"/>
           <w:color w:val="000000"/>
@@ -822,7 +822,7 @@
             </w:pPr>
             <w:r>
               <w:rPr>
-                <w:rFonts w:ascii="AppleGothic" w:hAnsi="AppleGothic" w:eastAsia="AppleGothic"/>
+                <w:rFonts w:ascii="Arial Unicode MS" w:hAnsi="Arial Unicode MS" w:eastAsia="Arial Unicode MS"/>
                 <w:b/>
                 <w:i w:val="0"/>
                 <w:color w:val="0B2545"/>
@@ -851,13 +851,13 @@
             </w:pPr>
             <w:r>
               <w:rPr>
-                <w:rFonts w:ascii="AppleGothic" w:hAnsi="AppleGothic" w:eastAsia="AppleGothic"/>
+                <w:rFonts w:ascii="Arial Unicode MS" w:hAnsi="Arial Unicode MS" w:eastAsia="Arial Unicode MS"/>
                 <w:b/>
                 <w:i w:val="0"/>
                 <w:color w:val="0B2545"/>
                 <w:sz w:val="19"/>
               </w:rPr>
-              <w:t>BakeNN 0.1.0 계약</w:t>
+              <w:t>BakeNN 1.0 계약</w:t>
             </w:r>
           </w:p>
         </w:tc>
@@ -885,7 +885,7 @@
             </w:pPr>
             <w:r>
               <w:rPr>
-                <w:rFonts w:ascii="AppleGothic" w:hAnsi="AppleGothic" w:eastAsia="AppleGothic"/>
+                <w:rFonts w:ascii="Arial Unicode MS" w:hAnsi="Arial Unicode MS" w:eastAsia="Arial Unicode MS"/>
                 <w:b w:val="0"/>
                 <w:i w:val="0"/>
                 <w:color w:val="000000"/>
@@ -913,7 +913,7 @@
             </w:pPr>
             <w:r>
               <w:rPr>
-                <w:rFonts w:ascii="AppleGothic" w:hAnsi="AppleGothic" w:eastAsia="AppleGothic"/>
+                <w:rFonts w:ascii="Arial Unicode MS" w:hAnsi="Arial Unicode MS" w:eastAsia="Arial Unicode MS"/>
                 <w:b w:val="0"/>
                 <w:i w:val="0"/>
                 <w:color w:val="000000"/>
@@ -947,7 +947,7 @@
             </w:pPr>
             <w:r>
               <w:rPr>
-                <w:rFonts w:ascii="AppleGothic" w:hAnsi="AppleGothic" w:eastAsia="AppleGothic"/>
+                <w:rFonts w:ascii="Arial Unicode MS" w:hAnsi="Arial Unicode MS" w:eastAsia="Arial Unicode MS"/>
                 <w:b w:val="0"/>
                 <w:i w:val="0"/>
                 <w:color w:val="000000"/>
@@ -975,7 +975,7 @@
             </w:pPr>
             <w:r>
               <w:rPr>
-                <w:rFonts w:ascii="AppleGothic" w:hAnsi="AppleGothic" w:eastAsia="AppleGothic"/>
+                <w:rFonts w:ascii="Arial Unicode MS" w:hAnsi="Arial Unicode MS" w:eastAsia="Arial Unicode MS"/>
                 <w:b w:val="0"/>
                 <w:i w:val="0"/>
                 <w:color w:val="000000"/>
@@ -1009,7 +1009,7 @@
             </w:pPr>
             <w:r>
               <w:rPr>
-                <w:rFonts w:ascii="AppleGothic" w:hAnsi="AppleGothic" w:eastAsia="AppleGothic"/>
+                <w:rFonts w:ascii="Arial Unicode MS" w:hAnsi="Arial Unicode MS" w:eastAsia="Arial Unicode MS"/>
                 <w:b w:val="0"/>
                 <w:i w:val="0"/>
                 <w:color w:val="000000"/>
@@ -1037,7 +1037,7 @@
             </w:pPr>
             <w:r>
               <w:rPr>
-                <w:rFonts w:ascii="AppleGothic" w:hAnsi="AppleGothic" w:eastAsia="AppleGothic"/>
+                <w:rFonts w:ascii="Arial Unicode MS" w:hAnsi="Arial Unicode MS" w:eastAsia="Arial Unicode MS"/>
                 <w:b w:val="0"/>
                 <w:i w:val="0"/>
                 <w:color w:val="000000"/>
@@ -1071,7 +1071,7 @@
             </w:pPr>
             <w:r>
               <w:rPr>
-                <w:rFonts w:ascii="AppleGothic" w:hAnsi="AppleGothic" w:eastAsia="AppleGothic"/>
+                <w:rFonts w:ascii="Arial Unicode MS" w:hAnsi="Arial Unicode MS" w:eastAsia="Arial Unicode MS"/>
                 <w:b w:val="0"/>
                 <w:i w:val="0"/>
                 <w:color w:val="000000"/>
@@ -1099,7 +1099,7 @@
             </w:pPr>
             <w:r>
               <w:rPr>
-                <w:rFonts w:ascii="AppleGothic" w:hAnsi="AppleGothic" w:eastAsia="AppleGothic"/>
+                <w:rFonts w:ascii="Arial Unicode MS" w:hAnsi="Arial Unicode MS" w:eastAsia="Arial Unicode MS"/>
                 <w:b w:val="0"/>
                 <w:i w:val="0"/>
                 <w:color w:val="000000"/>
@@ -1133,7 +1133,7 @@
             </w:pPr>
             <w:r>
               <w:rPr>
-                <w:rFonts w:ascii="AppleGothic" w:hAnsi="AppleGothic" w:eastAsia="AppleGothic"/>
+                <w:rFonts w:ascii="Arial Unicode MS" w:hAnsi="Arial Unicode MS" w:eastAsia="Arial Unicode MS"/>
                 <w:b w:val="0"/>
                 <w:i w:val="0"/>
                 <w:color w:val="000000"/>
@@ -1161,7 +1161,7 @@
             </w:pPr>
             <w:r>
               <w:rPr>
-                <w:rFonts w:ascii="AppleGothic" w:hAnsi="AppleGothic" w:eastAsia="AppleGothic"/>
+                <w:rFonts w:ascii="Arial Unicode MS" w:hAnsi="Arial Unicode MS" w:eastAsia="Arial Unicode MS"/>
                 <w:b w:val="0"/>
                 <w:i w:val="0"/>
                 <w:color w:val="000000"/>
@@ -1195,7 +1195,7 @@
             </w:pPr>
             <w:r>
               <w:rPr>
-                <w:rFonts w:ascii="AppleGothic" w:hAnsi="AppleGothic" w:eastAsia="AppleGothic"/>
+                <w:rFonts w:ascii="Arial Unicode MS" w:hAnsi="Arial Unicode MS" w:eastAsia="Arial Unicode MS"/>
                 <w:b w:val="0"/>
                 <w:i w:val="0"/>
                 <w:color w:val="000000"/>
@@ -1223,7 +1223,7 @@
             </w:pPr>
             <w:r>
               <w:rPr>
-                <w:rFonts w:ascii="AppleGothic" w:hAnsi="AppleGothic" w:eastAsia="AppleGothic"/>
+                <w:rFonts w:ascii="Arial Unicode MS" w:hAnsi="Arial Unicode MS" w:eastAsia="Arial Unicode MS"/>
                 <w:b w:val="0"/>
                 <w:i w:val="0"/>
                 <w:color w:val="000000"/>
@@ -1243,13 +1243,13 @@
     <w:p>
       <w:r>
         <w:rPr>
-          <w:rFonts w:ascii="AppleGothic" w:hAnsi="AppleGothic" w:eastAsia="AppleGothic"/>
+          <w:rFonts w:ascii="Arial Unicode MS" w:hAnsi="Arial Unicode MS" w:eastAsia="Arial Unicode MS"/>
           <w:b w:val="0"/>
           <w:i w:val="0"/>
           <w:color w:val="000000"/>
           <w:sz w:val="22"/>
         </w:rPr>
-        <w:t>변환 후 Python 정수 실행기와 생성 C는 같은 고정소수점 계약을 사용한다. Q31 multiplier·shift는 호스트에서 한 번 계산해 상수로 내보내며 타겟에서 float로 재계산하지 않는다. 지원 범위를 벗어난 vendor kernel은 AUTO에서 portable로 fallback하고 REQUIRE_OPTIMIZED에서는 이유와 함께 실패한다.</w:t>
+        <w:t>변환 후 Python 정수 실행기와 생성 C는 같은 고정소수점 계약을 사용한다. Q31 multiplier·shift는 호스트에서 한 번 계산해 상수로 내보내며 타겟에서 float로 재계산하지 않는다. 지원 범위를 벗어난 vendor kernel은 STATIC_PRIORITY에서 portable로 fallback하고 REQUIRE_OPTIMIZED에서는 이유와 함께 실패한다.</w:t>
       </w:r>
     </w:p>
     <w:p>
@@ -1299,7 +1299,7 @@
             </w:pPr>
             <w:r>
               <w:rPr>
-                <w:rFonts w:ascii="AppleGothic" w:hAnsi="AppleGothic" w:eastAsia="AppleGothic"/>
+                <w:rFonts w:ascii="Arial Unicode MS" w:hAnsi="Arial Unicode MS" w:eastAsia="Arial Unicode MS"/>
                 <w:b/>
                 <w:i w:val="0"/>
                 <w:color w:val="0B2545"/>
@@ -1328,7 +1328,7 @@
             </w:pPr>
             <w:r>
               <w:rPr>
-                <w:rFonts w:ascii="AppleGothic" w:hAnsi="AppleGothic" w:eastAsia="AppleGothic"/>
+                <w:rFonts w:ascii="Arial Unicode MS" w:hAnsi="Arial Unicode MS" w:eastAsia="Arial Unicode MS"/>
                 <w:b/>
                 <w:i w:val="0"/>
                 <w:color w:val="0B2545"/>
@@ -1357,7 +1357,7 @@
             </w:pPr>
             <w:r>
               <w:rPr>
-                <w:rFonts w:ascii="AppleGothic" w:hAnsi="AppleGothic" w:eastAsia="AppleGothic"/>
+                <w:rFonts w:ascii="Arial Unicode MS" w:hAnsi="Arial Unicode MS" w:eastAsia="Arial Unicode MS"/>
                 <w:b/>
                 <w:i w:val="0"/>
                 <w:color w:val="0B2545"/>
@@ -1391,7 +1391,7 @@
             </w:pPr>
             <w:r>
               <w:rPr>
-                <w:rFonts w:ascii="AppleGothic" w:hAnsi="AppleGothic" w:eastAsia="AppleGothic"/>
+                <w:rFonts w:ascii="Arial Unicode MS" w:hAnsi="Arial Unicode MS" w:eastAsia="Arial Unicode MS"/>
                 <w:b w:val="0"/>
                 <w:i w:val="0"/>
                 <w:color w:val="000000"/>
@@ -1419,7 +1419,7 @@
             </w:pPr>
             <w:r>
               <w:rPr>
-                <w:rFonts w:ascii="AppleGothic" w:hAnsi="AppleGothic" w:eastAsia="AppleGothic"/>
+                <w:rFonts w:ascii="Arial Unicode MS" w:hAnsi="Arial Unicode MS" w:eastAsia="Arial Unicode MS"/>
                 <w:b w:val="0"/>
                 <w:i w:val="0"/>
                 <w:color w:val="000000"/>
@@ -1447,7 +1447,7 @@
             </w:pPr>
             <w:r>
               <w:rPr>
-                <w:rFonts w:ascii="AppleGothic" w:hAnsi="AppleGothic" w:eastAsia="AppleGothic"/>
+                <w:rFonts w:ascii="Arial Unicode MS" w:hAnsi="Arial Unicode MS" w:eastAsia="Arial Unicode MS"/>
                 <w:b w:val="0"/>
                 <w:i w:val="0"/>
                 <w:color w:val="000000"/>
@@ -1481,7 +1481,7 @@
             </w:pPr>
             <w:r>
               <w:rPr>
-                <w:rFonts w:ascii="AppleGothic" w:hAnsi="AppleGothic" w:eastAsia="AppleGothic"/>
+                <w:rFonts w:ascii="Arial Unicode MS" w:hAnsi="Arial Unicode MS" w:eastAsia="Arial Unicode MS"/>
                 <w:b w:val="0"/>
                 <w:i w:val="0"/>
                 <w:color w:val="000000"/>
@@ -1509,7 +1509,7 @@
             </w:pPr>
             <w:r>
               <w:rPr>
-                <w:rFonts w:ascii="AppleGothic" w:hAnsi="AppleGothic" w:eastAsia="AppleGothic"/>
+                <w:rFonts w:ascii="Arial Unicode MS" w:hAnsi="Arial Unicode MS" w:eastAsia="Arial Unicode MS"/>
                 <w:b w:val="0"/>
                 <w:i w:val="0"/>
                 <w:color w:val="000000"/>
@@ -1537,7 +1537,7 @@
             </w:pPr>
             <w:r>
               <w:rPr>
-                <w:rFonts w:ascii="AppleGothic" w:hAnsi="AppleGothic" w:eastAsia="AppleGothic"/>
+                <w:rFonts w:ascii="Arial Unicode MS" w:hAnsi="Arial Unicode MS" w:eastAsia="Arial Unicode MS"/>
                 <w:b w:val="0"/>
                 <w:i w:val="0"/>
                 <w:color w:val="000000"/>
@@ -1571,7 +1571,7 @@
             </w:pPr>
             <w:r>
               <w:rPr>
-                <w:rFonts w:ascii="AppleGothic" w:hAnsi="AppleGothic" w:eastAsia="AppleGothic"/>
+                <w:rFonts w:ascii="Arial Unicode MS" w:hAnsi="Arial Unicode MS" w:eastAsia="Arial Unicode MS"/>
                 <w:b w:val="0"/>
                 <w:i w:val="0"/>
                 <w:color w:val="000000"/>
@@ -1599,7 +1599,7 @@
             </w:pPr>
             <w:r>
               <w:rPr>
-                <w:rFonts w:ascii="AppleGothic" w:hAnsi="AppleGothic" w:eastAsia="AppleGothic"/>
+                <w:rFonts w:ascii="Arial Unicode MS" w:hAnsi="Arial Unicode MS" w:eastAsia="Arial Unicode MS"/>
                 <w:b w:val="0"/>
                 <w:i w:val="0"/>
                 <w:color w:val="000000"/>
@@ -1627,7 +1627,7 @@
             </w:pPr>
             <w:r>
               <w:rPr>
-                <w:rFonts w:ascii="AppleGothic" w:hAnsi="AppleGothic" w:eastAsia="AppleGothic"/>
+                <w:rFonts w:ascii="Arial Unicode MS" w:hAnsi="Arial Unicode MS" w:eastAsia="Arial Unicode MS"/>
                 <w:b w:val="0"/>
                 <w:i w:val="0"/>
                 <w:color w:val="000000"/>
@@ -1661,7 +1661,7 @@
             </w:pPr>
             <w:r>
               <w:rPr>
-                <w:rFonts w:ascii="AppleGothic" w:hAnsi="AppleGothic" w:eastAsia="AppleGothic"/>
+                <w:rFonts w:ascii="Arial Unicode MS" w:hAnsi="Arial Unicode MS" w:eastAsia="Arial Unicode MS"/>
                 <w:b w:val="0"/>
                 <w:i w:val="0"/>
                 <w:color w:val="000000"/>
@@ -1689,7 +1689,7 @@
             </w:pPr>
             <w:r>
               <w:rPr>
-                <w:rFonts w:ascii="AppleGothic" w:hAnsi="AppleGothic" w:eastAsia="AppleGothic"/>
+                <w:rFonts w:ascii="Arial Unicode MS" w:hAnsi="Arial Unicode MS" w:eastAsia="Arial Unicode MS"/>
                 <w:b w:val="0"/>
                 <w:i w:val="0"/>
                 <w:color w:val="000000"/>
@@ -1717,7 +1717,7 @@
             </w:pPr>
             <w:r>
               <w:rPr>
-                <w:rFonts w:ascii="AppleGothic" w:hAnsi="AppleGothic" w:eastAsia="AppleGothic"/>
+                <w:rFonts w:ascii="Arial Unicode MS" w:hAnsi="Arial Unicode MS" w:eastAsia="Arial Unicode MS"/>
                 <w:b w:val="0"/>
                 <w:i w:val="0"/>
                 <w:color w:val="000000"/>
@@ -1751,7 +1751,7 @@
             </w:pPr>
             <w:r>
               <w:rPr>
-                <w:rFonts w:ascii="AppleGothic" w:hAnsi="AppleGothic" w:eastAsia="AppleGothic"/>
+                <w:rFonts w:ascii="Arial Unicode MS" w:hAnsi="Arial Unicode MS" w:eastAsia="Arial Unicode MS"/>
                 <w:b w:val="0"/>
                 <w:i w:val="0"/>
                 <w:color w:val="000000"/>
@@ -1779,7 +1779,7 @@
             </w:pPr>
             <w:r>
               <w:rPr>
-                <w:rFonts w:ascii="AppleGothic" w:hAnsi="AppleGothic" w:eastAsia="AppleGothic"/>
+                <w:rFonts w:ascii="Arial Unicode MS" w:hAnsi="Arial Unicode MS" w:eastAsia="Arial Unicode MS"/>
                 <w:b w:val="0"/>
                 <w:i w:val="0"/>
                 <w:color w:val="000000"/>
@@ -1807,7 +1807,7 @@
             </w:pPr>
             <w:r>
               <w:rPr>
-                <w:rFonts w:ascii="AppleGothic" w:hAnsi="AppleGothic" w:eastAsia="AppleGothic"/>
+                <w:rFonts w:ascii="Arial Unicode MS" w:hAnsi="Arial Unicode MS" w:eastAsia="Arial Unicode MS"/>
                 <w:b w:val="0"/>
                 <w:i w:val="0"/>
                 <w:color w:val="000000"/>
@@ -1841,7 +1841,7 @@
             </w:pPr>
             <w:r>
               <w:rPr>
-                <w:rFonts w:ascii="AppleGothic" w:hAnsi="AppleGothic" w:eastAsia="AppleGothic"/>
+                <w:rFonts w:ascii="Arial Unicode MS" w:hAnsi="Arial Unicode MS" w:eastAsia="Arial Unicode MS"/>
                 <w:b w:val="0"/>
                 <w:i w:val="0"/>
                 <w:color w:val="000000"/>
@@ -1869,7 +1869,7 @@
             </w:pPr>
             <w:r>
               <w:rPr>
-                <w:rFonts w:ascii="AppleGothic" w:hAnsi="AppleGothic" w:eastAsia="AppleGothic"/>
+                <w:rFonts w:ascii="Arial Unicode MS" w:hAnsi="Arial Unicode MS" w:eastAsia="Arial Unicode MS"/>
                 <w:b w:val="0"/>
                 <w:i w:val="0"/>
                 <w:color w:val="000000"/>
@@ -1897,7 +1897,7 @@
             </w:pPr>
             <w:r>
               <w:rPr>
-                <w:rFonts w:ascii="AppleGothic" w:hAnsi="AppleGothic" w:eastAsia="AppleGothic"/>
+                <w:rFonts w:ascii="Arial Unicode MS" w:hAnsi="Arial Unicode MS" w:eastAsia="Arial Unicode MS"/>
                 <w:b w:val="0"/>
                 <w:i w:val="0"/>
                 <w:color w:val="000000"/>
@@ -1917,7 +1917,7 @@
     <w:p>
       <w:r>
         <w:rPr>
-          <w:rFonts w:ascii="AppleGothic" w:hAnsi="AppleGothic" w:eastAsia="AppleGothic"/>
+          <w:rFonts w:ascii="Arial Unicode MS" w:hAnsi="Arial Unicode MS" w:eastAsia="Arial Unicode MS"/>
           <w:b w:val="0"/>
           <w:i w:val="0"/>
           <w:color w:val="000000"/>
@@ -1973,7 +1973,7 @@
             </w:pPr>
             <w:r>
               <w:rPr>
-                <w:rFonts w:ascii="AppleGothic" w:hAnsi="AppleGothic" w:eastAsia="AppleGothic"/>
+                <w:rFonts w:ascii="Arial Unicode MS" w:hAnsi="Arial Unicode MS" w:eastAsia="Arial Unicode MS"/>
                 <w:b/>
                 <w:i w:val="0"/>
                 <w:color w:val="0B2545"/>
@@ -2002,7 +2002,7 @@
             </w:pPr>
             <w:r>
               <w:rPr>
-                <w:rFonts w:ascii="AppleGothic" w:hAnsi="AppleGothic" w:eastAsia="AppleGothic"/>
+                <w:rFonts w:ascii="Arial Unicode MS" w:hAnsi="Arial Unicode MS" w:eastAsia="Arial Unicode MS"/>
                 <w:b/>
                 <w:i w:val="0"/>
                 <w:color w:val="0B2545"/>
@@ -2031,7 +2031,7 @@
             </w:pPr>
             <w:r>
               <w:rPr>
-                <w:rFonts w:ascii="AppleGothic" w:hAnsi="AppleGothic" w:eastAsia="AppleGothic"/>
+                <w:rFonts w:ascii="Arial Unicode MS" w:hAnsi="Arial Unicode MS" w:eastAsia="Arial Unicode MS"/>
                 <w:b/>
                 <w:i w:val="0"/>
                 <w:color w:val="0B2545"/>
@@ -2065,7 +2065,7 @@
             </w:pPr>
             <w:r>
               <w:rPr>
-                <w:rFonts w:ascii="AppleGothic" w:hAnsi="AppleGothic" w:eastAsia="AppleGothic"/>
+                <w:rFonts w:ascii="Arial Unicode MS" w:hAnsi="Arial Unicode MS" w:eastAsia="Arial Unicode MS"/>
                 <w:b w:val="0"/>
                 <w:i w:val="0"/>
                 <w:color w:val="000000"/>
@@ -2093,7 +2093,7 @@
             </w:pPr>
             <w:r>
               <w:rPr>
-                <w:rFonts w:ascii="AppleGothic" w:hAnsi="AppleGothic" w:eastAsia="AppleGothic"/>
+                <w:rFonts w:ascii="Arial Unicode MS" w:hAnsi="Arial Unicode MS" w:eastAsia="Arial Unicode MS"/>
                 <w:b w:val="0"/>
                 <w:i w:val="0"/>
                 <w:color w:val="000000"/>
@@ -2121,7 +2121,7 @@
             </w:pPr>
             <w:r>
               <w:rPr>
-                <w:rFonts w:ascii="AppleGothic" w:hAnsi="AppleGothic" w:eastAsia="AppleGothic"/>
+                <w:rFonts w:ascii="Arial Unicode MS" w:hAnsi="Arial Unicode MS" w:eastAsia="Arial Unicode MS"/>
                 <w:b w:val="0"/>
                 <w:i w:val="0"/>
                 <w:color w:val="000000"/>
@@ -2155,7 +2155,7 @@
             </w:pPr>
             <w:r>
               <w:rPr>
-                <w:rFonts w:ascii="AppleGothic" w:hAnsi="AppleGothic" w:eastAsia="AppleGothic"/>
+                <w:rFonts w:ascii="Arial Unicode MS" w:hAnsi="Arial Unicode MS" w:eastAsia="Arial Unicode MS"/>
                 <w:b w:val="0"/>
                 <w:i w:val="0"/>
                 <w:color w:val="000000"/>
@@ -2183,7 +2183,7 @@
             </w:pPr>
             <w:r>
               <w:rPr>
-                <w:rFonts w:ascii="AppleGothic" w:hAnsi="AppleGothic" w:eastAsia="AppleGothic"/>
+                <w:rFonts w:ascii="Arial Unicode MS" w:hAnsi="Arial Unicode MS" w:eastAsia="Arial Unicode MS"/>
                 <w:b w:val="0"/>
                 <w:i w:val="0"/>
                 <w:color w:val="000000"/>
@@ -2211,7 +2211,7 @@
             </w:pPr>
             <w:r>
               <w:rPr>
-                <w:rFonts w:ascii="AppleGothic" w:hAnsi="AppleGothic" w:eastAsia="AppleGothic"/>
+                <w:rFonts w:ascii="Arial Unicode MS" w:hAnsi="Arial Unicode MS" w:eastAsia="Arial Unicode MS"/>
                 <w:b w:val="0"/>
                 <w:i w:val="0"/>
                 <w:color w:val="000000"/>
@@ -2245,7 +2245,7 @@
             </w:pPr>
             <w:r>
               <w:rPr>
-                <w:rFonts w:ascii="AppleGothic" w:hAnsi="AppleGothic" w:eastAsia="AppleGothic"/>
+                <w:rFonts w:ascii="Arial Unicode MS" w:hAnsi="Arial Unicode MS" w:eastAsia="Arial Unicode MS"/>
                 <w:b w:val="0"/>
                 <w:i w:val="0"/>
                 <w:color w:val="000000"/>
@@ -2273,7 +2273,7 @@
             </w:pPr>
             <w:r>
               <w:rPr>
-                <w:rFonts w:ascii="AppleGothic" w:hAnsi="AppleGothic" w:eastAsia="AppleGothic"/>
+                <w:rFonts w:ascii="Arial Unicode MS" w:hAnsi="Arial Unicode MS" w:eastAsia="Arial Unicode MS"/>
                 <w:b w:val="0"/>
                 <w:i w:val="0"/>
                 <w:color w:val="000000"/>
@@ -2301,7 +2301,7 @@
             </w:pPr>
             <w:r>
               <w:rPr>
-                <w:rFonts w:ascii="AppleGothic" w:hAnsi="AppleGothic" w:eastAsia="AppleGothic"/>
+                <w:rFonts w:ascii="Arial Unicode MS" w:hAnsi="Arial Unicode MS" w:eastAsia="Arial Unicode MS"/>
                 <w:b w:val="0"/>
                 <w:i w:val="0"/>
                 <w:color w:val="000000"/>
@@ -2335,7 +2335,7 @@
             </w:pPr>
             <w:r>
               <w:rPr>
-                <w:rFonts w:ascii="AppleGothic" w:hAnsi="AppleGothic" w:eastAsia="AppleGothic"/>
+                <w:rFonts w:ascii="Arial Unicode MS" w:hAnsi="Arial Unicode MS" w:eastAsia="Arial Unicode MS"/>
                 <w:b w:val="0"/>
                 <w:i w:val="0"/>
                 <w:color w:val="000000"/>
@@ -2363,7 +2363,7 @@
             </w:pPr>
             <w:r>
               <w:rPr>
-                <w:rFonts w:ascii="AppleGothic" w:hAnsi="AppleGothic" w:eastAsia="AppleGothic"/>
+                <w:rFonts w:ascii="Arial Unicode MS" w:hAnsi="Arial Unicode MS" w:eastAsia="Arial Unicode MS"/>
                 <w:b w:val="0"/>
                 <w:i w:val="0"/>
                 <w:color w:val="000000"/>
@@ -2391,7 +2391,7 @@
             </w:pPr>
             <w:r>
               <w:rPr>
-                <w:rFonts w:ascii="AppleGothic" w:hAnsi="AppleGothic" w:eastAsia="AppleGothic"/>
+                <w:rFonts w:ascii="Arial Unicode MS" w:hAnsi="Arial Unicode MS" w:eastAsia="Arial Unicode MS"/>
                 <w:b w:val="0"/>
                 <w:i w:val="0"/>
                 <w:color w:val="000000"/>
@@ -2425,7 +2425,7 @@
             </w:pPr>
             <w:r>
               <w:rPr>
-                <w:rFonts w:ascii="AppleGothic" w:hAnsi="AppleGothic" w:eastAsia="AppleGothic"/>
+                <w:rFonts w:ascii="Arial Unicode MS" w:hAnsi="Arial Unicode MS" w:eastAsia="Arial Unicode MS"/>
                 <w:b w:val="0"/>
                 <w:i w:val="0"/>
                 <w:color w:val="000000"/>
@@ -2453,7 +2453,7 @@
             </w:pPr>
             <w:r>
               <w:rPr>
-                <w:rFonts w:ascii="AppleGothic" w:hAnsi="AppleGothic" w:eastAsia="AppleGothic"/>
+                <w:rFonts w:ascii="Arial Unicode MS" w:hAnsi="Arial Unicode MS" w:eastAsia="Arial Unicode MS"/>
                 <w:b w:val="0"/>
                 <w:i w:val="0"/>
                 <w:color w:val="000000"/>
@@ -2481,7 +2481,7 @@
             </w:pPr>
             <w:r>
               <w:rPr>
-                <w:rFonts w:ascii="AppleGothic" w:hAnsi="AppleGothic" w:eastAsia="AppleGothic"/>
+                <w:rFonts w:ascii="Arial Unicode MS" w:hAnsi="Arial Unicode MS" w:eastAsia="Arial Unicode MS"/>
                 <w:b w:val="0"/>
                 <w:i w:val="0"/>
                 <w:color w:val="000000"/>
@@ -2515,7 +2515,7 @@
             </w:pPr>
             <w:r>
               <w:rPr>
-                <w:rFonts w:ascii="AppleGothic" w:hAnsi="AppleGothic" w:eastAsia="AppleGothic"/>
+                <w:rFonts w:ascii="Arial Unicode MS" w:hAnsi="Arial Unicode MS" w:eastAsia="Arial Unicode MS"/>
                 <w:b w:val="0"/>
                 <w:i w:val="0"/>
                 <w:color w:val="000000"/>
@@ -2543,7 +2543,7 @@
             </w:pPr>
             <w:r>
               <w:rPr>
-                <w:rFonts w:ascii="AppleGothic" w:hAnsi="AppleGothic" w:eastAsia="AppleGothic"/>
+                <w:rFonts w:ascii="Arial Unicode MS" w:hAnsi="Arial Unicode MS" w:eastAsia="Arial Unicode MS"/>
                 <w:b w:val="0"/>
                 <w:i w:val="0"/>
                 <w:color w:val="000000"/>
@@ -2571,7 +2571,7 @@
             </w:pPr>
             <w:r>
               <w:rPr>
-                <w:rFonts w:ascii="AppleGothic" w:hAnsi="AppleGothic" w:eastAsia="AppleGothic"/>
+                <w:rFonts w:ascii="Arial Unicode MS" w:hAnsi="Arial Unicode MS" w:eastAsia="Arial Unicode MS"/>
                 <w:b w:val="0"/>
                 <w:i w:val="0"/>
                 <w:color w:val="000000"/>
@@ -2605,7 +2605,7 @@
             </w:pPr>
             <w:r>
               <w:rPr>
-                <w:rFonts w:ascii="AppleGothic" w:hAnsi="AppleGothic" w:eastAsia="AppleGothic"/>
+                <w:rFonts w:ascii="Arial Unicode MS" w:hAnsi="Arial Unicode MS" w:eastAsia="Arial Unicode MS"/>
                 <w:b w:val="0"/>
                 <w:i w:val="0"/>
                 <w:color w:val="000000"/>
@@ -2633,7 +2633,7 @@
             </w:pPr>
             <w:r>
               <w:rPr>
-                <w:rFonts w:ascii="AppleGothic" w:hAnsi="AppleGothic" w:eastAsia="AppleGothic"/>
+                <w:rFonts w:ascii="Arial Unicode MS" w:hAnsi="Arial Unicode MS" w:eastAsia="Arial Unicode MS"/>
                 <w:b w:val="0"/>
                 <w:i w:val="0"/>
                 <w:color w:val="000000"/>
@@ -2661,7 +2661,7 @@
             </w:pPr>
             <w:r>
               <w:rPr>
-                <w:rFonts w:ascii="AppleGothic" w:hAnsi="AppleGothic" w:eastAsia="AppleGothic"/>
+                <w:rFonts w:ascii="Arial Unicode MS" w:hAnsi="Arial Unicode MS" w:eastAsia="Arial Unicode MS"/>
                 <w:b w:val="0"/>
                 <w:i w:val="0"/>
                 <w:color w:val="000000"/>
@@ -2700,7 +2700,7 @@
       </w:pPr>
       <w:r>
         <w:rPr>
-          <w:rFonts w:ascii="AppleGothic" w:hAnsi="AppleGothic" w:eastAsia="AppleGothic"/>
+          <w:rFonts w:ascii="Arial Unicode MS" w:hAnsi="Arial Unicode MS" w:eastAsia="Arial Unicode MS"/>
           <w:b/>
           <w:i w:val="0"/>
           <w:color w:val="0B2545"/>
@@ -2710,13 +2710,13 @@
       </w:r>
       <w:r>
         <w:rPr>
-          <w:rFonts w:ascii="AppleGothic" w:hAnsi="AppleGothic" w:eastAsia="AppleGothic"/>
+          <w:rFonts w:ascii="Arial Unicode MS" w:hAnsi="Arial Unicode MS" w:eastAsia="Arial Unicode MS"/>
           <w:b w:val="0"/>
           <w:i w:val="0"/>
           <w:color w:val="0B2545"/>
           <w:sz w:val="21"/>
         </w:rPr>
-        <w:t>2026-08-17 제출 준비 브랜치에서 287 tests + 6 subtests가 통과했다. GitHub Actions는 Python 3.10/3.12 × GCC/Clang, PyTorch frontend/wheel, ARM/RISC-V cross-toolchain, ESP-IDF 3종을 검증한다.</w:t>
+        <w:t>2026-08-26 v1.0.0 릴리스 브랜치에서 355 tests + 6 subtests가 통과했다. GitHub Actions는 Python 3.10~3.13 × GCC/Clang, PyTorch frontend/wheel, ARM/RISC-V cross-toolchain, ESP-IDF 3종을 검증한다.</w:t>
       </w:r>
     </w:p>
     <w:p>
@@ -2728,7 +2728,7 @@
       </w:pPr>
       <w:r>
         <w:rPr>
-          <w:rFonts w:ascii="AppleGothic" w:hAnsi="AppleGothic" w:eastAsia="AppleGothic"/>
+          <w:rFonts w:ascii="Arial Unicode MS" w:hAnsi="Arial Unicode MS" w:eastAsia="Arial Unicode MS"/>
           <w:b w:val="0"/>
           <w:i w:val="0"/>
           <w:color w:val="000000"/>
@@ -2746,7 +2746,7 @@
       </w:pPr>
       <w:r>
         <w:rPr>
-          <w:rFonts w:ascii="AppleGothic" w:hAnsi="AppleGothic" w:eastAsia="AppleGothic"/>
+          <w:rFonts w:ascii="Arial Unicode MS" w:hAnsi="Arial Unicode MS" w:eastAsia="Arial Unicode MS"/>
           <w:b w:val="0"/>
           <w:i w:val="0"/>
           <w:color w:val="000000"/>
@@ -2764,7 +2764,7 @@
       </w:pPr>
       <w:r>
         <w:rPr>
-          <w:rFonts w:ascii="AppleGothic" w:hAnsi="AppleGothic" w:eastAsia="AppleGothic"/>
+          <w:rFonts w:ascii="Arial Unicode MS" w:hAnsi="Arial Unicode MS" w:eastAsia="Arial Unicode MS"/>
           <w:b w:val="0"/>
           <w:i w:val="0"/>
           <w:color w:val="000000"/>
@@ -2782,7 +2782,7 @@
       </w:pPr>
       <w:r>
         <w:rPr>
-          <w:rFonts w:ascii="AppleGothic" w:hAnsi="AppleGothic" w:eastAsia="AppleGothic"/>
+          <w:rFonts w:ascii="Arial Unicode MS" w:hAnsi="Arial Unicode MS" w:eastAsia="Arial Unicode MS"/>
           <w:b w:val="0"/>
           <w:i w:val="0"/>
           <w:color w:val="000000"/>
@@ -2800,7 +2800,7 @@
       </w:pPr>
       <w:r>
         <w:rPr>
-          <w:rFonts w:ascii="AppleGothic" w:hAnsi="AppleGothic" w:eastAsia="AppleGothic"/>
+          <w:rFonts w:ascii="Arial Unicode MS" w:hAnsi="Arial Unicode MS" w:eastAsia="Arial Unicode MS"/>
           <w:b w:val="0"/>
           <w:i w:val="0"/>
           <w:color w:val="000000"/>
@@ -2831,7 +2831,7 @@
       </w:pPr>
       <w:r>
         <w:rPr>
-          <w:rFonts w:ascii="AppleGothic" w:hAnsi="AppleGothic" w:eastAsia="AppleGothic"/>
+          <w:rFonts w:ascii="Arial Unicode MS" w:hAnsi="Arial Unicode MS" w:eastAsia="Arial Unicode MS"/>
           <w:b/>
           <w:i w:val="0"/>
           <w:color w:val="0B2545"/>
@@ -2841,7 +2841,7 @@
       </w:r>
       <w:r>
         <w:rPr>
-          <w:rFonts w:ascii="AppleGothic" w:hAnsi="AppleGothic" w:eastAsia="AppleGothic"/>
+          <w:rFonts w:ascii="Arial Unicode MS" w:hAnsi="Arial Unicode MS" w:eastAsia="Arial Unicode MS"/>
           <w:b w:val="0"/>
           <w:i w:val="0"/>
           <w:color w:val="0B2545"/>
@@ -2888,7 +2888,7 @@
             </w:pPr>
             <w:r>
               <w:rPr>
-                <w:rFonts w:ascii="AppleGothic" w:hAnsi="AppleGothic" w:eastAsia="AppleGothic"/>
+                <w:rFonts w:ascii="Arial Unicode MS" w:hAnsi="Arial Unicode MS" w:eastAsia="Arial Unicode MS"/>
                 <w:b/>
                 <w:i w:val="0"/>
                 <w:color w:val="0B2545"/>
@@ -2917,7 +2917,7 @@
             </w:pPr>
             <w:r>
               <w:rPr>
-                <w:rFonts w:ascii="AppleGothic" w:hAnsi="AppleGothic" w:eastAsia="AppleGothic"/>
+                <w:rFonts w:ascii="Arial Unicode MS" w:hAnsi="Arial Unicode MS" w:eastAsia="Arial Unicode MS"/>
                 <w:b/>
                 <w:i w:val="0"/>
                 <w:color w:val="0B2545"/>
@@ -2951,7 +2951,7 @@
             </w:pPr>
             <w:r>
               <w:rPr>
-                <w:rFonts w:ascii="AppleGothic" w:hAnsi="AppleGothic" w:eastAsia="AppleGothic"/>
+                <w:rFonts w:ascii="Arial Unicode MS" w:hAnsi="Arial Unicode MS" w:eastAsia="Arial Unicode MS"/>
                 <w:b w:val="0"/>
                 <w:i w:val="0"/>
                 <w:color w:val="000000"/>
@@ -2979,7 +2979,7 @@
             </w:pPr>
             <w:r>
               <w:rPr>
-                <w:rFonts w:ascii="AppleGothic" w:hAnsi="AppleGothic" w:eastAsia="AppleGothic"/>
+                <w:rFonts w:ascii="Arial Unicode MS" w:hAnsi="Arial Unicode MS" w:eastAsia="Arial Unicode MS"/>
                 <w:b w:val="0"/>
                 <w:i w:val="0"/>
                 <w:color w:val="000000"/>
@@ -3013,7 +3013,7 @@
             </w:pPr>
             <w:r>
               <w:rPr>
-                <w:rFonts w:ascii="AppleGothic" w:hAnsi="AppleGothic" w:eastAsia="AppleGothic"/>
+                <w:rFonts w:ascii="Arial Unicode MS" w:hAnsi="Arial Unicode MS" w:eastAsia="Arial Unicode MS"/>
                 <w:b w:val="0"/>
                 <w:i w:val="0"/>
                 <w:color w:val="000000"/>
@@ -3041,7 +3041,7 @@
             </w:pPr>
             <w:r>
               <w:rPr>
-                <w:rFonts w:ascii="AppleGothic" w:hAnsi="AppleGothic" w:eastAsia="AppleGothic"/>
+                <w:rFonts w:ascii="Arial Unicode MS" w:hAnsi="Arial Unicode MS" w:eastAsia="Arial Unicode MS"/>
                 <w:b w:val="0"/>
                 <w:i w:val="0"/>
                 <w:color w:val="000000"/>
@@ -3075,7 +3075,7 @@
             </w:pPr>
             <w:r>
               <w:rPr>
-                <w:rFonts w:ascii="AppleGothic" w:hAnsi="AppleGothic" w:eastAsia="AppleGothic"/>
+                <w:rFonts w:ascii="Arial Unicode MS" w:hAnsi="Arial Unicode MS" w:eastAsia="Arial Unicode MS"/>
                 <w:b w:val="0"/>
                 <w:i w:val="0"/>
                 <w:color w:val="000000"/>
@@ -3103,7 +3103,7 @@
             </w:pPr>
             <w:r>
               <w:rPr>
-                <w:rFonts w:ascii="AppleGothic" w:hAnsi="AppleGothic" w:eastAsia="AppleGothic"/>
+                <w:rFonts w:ascii="Arial Unicode MS" w:hAnsi="Arial Unicode MS" w:eastAsia="Arial Unicode MS"/>
                 <w:b w:val="0"/>
                 <w:i w:val="0"/>
                 <w:color w:val="000000"/>
@@ -3137,7 +3137,7 @@
             </w:pPr>
             <w:r>
               <w:rPr>
-                <w:rFonts w:ascii="AppleGothic" w:hAnsi="AppleGothic" w:eastAsia="AppleGothic"/>
+                <w:rFonts w:ascii="Arial Unicode MS" w:hAnsi="Arial Unicode MS" w:eastAsia="Arial Unicode MS"/>
                 <w:b w:val="0"/>
                 <w:i w:val="0"/>
                 <w:color w:val="000000"/>
@@ -3165,7 +3165,7 @@
             </w:pPr>
             <w:r>
               <w:rPr>
-                <w:rFonts w:ascii="AppleGothic" w:hAnsi="AppleGothic" w:eastAsia="AppleGothic"/>
+                <w:rFonts w:ascii="Arial Unicode MS" w:hAnsi="Arial Unicode MS" w:eastAsia="Arial Unicode MS"/>
                 <w:b w:val="0"/>
                 <w:i w:val="0"/>
                 <w:color w:val="000000"/>
@@ -3185,7 +3185,7 @@
     <w:p>
       <w:r>
         <w:rPr>
-          <w:rFonts w:ascii="AppleGothic" w:hAnsi="AppleGothic" w:eastAsia="AppleGothic"/>
+          <w:rFonts w:ascii="Arial Unicode MS" w:hAnsi="Arial Unicode MS" w:eastAsia="Arial Unicode MS"/>
           <w:b w:val="0"/>
           <w:i w:val="0"/>
           <w:color w:val="000000"/>
@@ -3235,7 +3235,7 @@
             </w:pPr>
             <w:r>
               <w:rPr>
-                <w:rFonts w:ascii="AppleGothic" w:hAnsi="AppleGothic" w:eastAsia="AppleGothic"/>
+                <w:rFonts w:ascii="Arial Unicode MS" w:hAnsi="Arial Unicode MS" w:eastAsia="Arial Unicode MS"/>
                 <w:b/>
                 <w:i w:val="0"/>
                 <w:color w:val="0B2545"/>
@@ -3264,7 +3264,7 @@
             </w:pPr>
             <w:r>
               <w:rPr>
-                <w:rFonts w:ascii="AppleGothic" w:hAnsi="AppleGothic" w:eastAsia="AppleGothic"/>
+                <w:rFonts w:ascii="Arial Unicode MS" w:hAnsi="Arial Unicode MS" w:eastAsia="Arial Unicode MS"/>
                 <w:b/>
                 <w:i w:val="0"/>
                 <w:color w:val="0B2545"/>
@@ -3293,7 +3293,7 @@
             </w:pPr>
             <w:r>
               <w:rPr>
-                <w:rFonts w:ascii="AppleGothic" w:hAnsi="AppleGothic" w:eastAsia="AppleGothic"/>
+                <w:rFonts w:ascii="Arial Unicode MS" w:hAnsi="Arial Unicode MS" w:eastAsia="Arial Unicode MS"/>
                 <w:b/>
                 <w:i w:val="0"/>
                 <w:color w:val="0B2545"/>
@@ -3322,7 +3322,7 @@
             </w:pPr>
             <w:r>
               <w:rPr>
-                <w:rFonts w:ascii="AppleGothic" w:hAnsi="AppleGothic" w:eastAsia="AppleGothic"/>
+                <w:rFonts w:ascii="Arial Unicode MS" w:hAnsi="Arial Unicode MS" w:eastAsia="Arial Unicode MS"/>
                 <w:b/>
                 <w:i w:val="0"/>
                 <w:color w:val="0B2545"/>
@@ -3351,7 +3351,7 @@
             </w:pPr>
             <w:r>
               <w:rPr>
-                <w:rFonts w:ascii="AppleGothic" w:hAnsi="AppleGothic" w:eastAsia="AppleGothic"/>
+                <w:rFonts w:ascii="Arial Unicode MS" w:hAnsi="Arial Unicode MS" w:eastAsia="Arial Unicode MS"/>
                 <w:b/>
                 <w:i w:val="0"/>
                 <w:color w:val="0B2545"/>
@@ -3385,7 +3385,7 @@
             </w:pPr>
             <w:r>
               <w:rPr>
-                <w:rFonts w:ascii="AppleGothic" w:hAnsi="AppleGothic" w:eastAsia="AppleGothic"/>
+                <w:rFonts w:ascii="Arial Unicode MS" w:hAnsi="Arial Unicode MS" w:eastAsia="Arial Unicode MS"/>
                 <w:b w:val="0"/>
                 <w:i w:val="0"/>
                 <w:color w:val="000000"/>
@@ -3413,7 +3413,7 @@
             </w:pPr>
             <w:r>
               <w:rPr>
-                <w:rFonts w:ascii="AppleGothic" w:hAnsi="AppleGothic" w:eastAsia="AppleGothic"/>
+                <w:rFonts w:ascii="Arial Unicode MS" w:hAnsi="Arial Unicode MS" w:eastAsia="Arial Unicode MS"/>
                 <w:b w:val="0"/>
                 <w:i w:val="0"/>
                 <w:color w:val="000000"/>
@@ -3441,7 +3441,7 @@
             </w:pPr>
             <w:r>
               <w:rPr>
-                <w:rFonts w:ascii="AppleGothic" w:hAnsi="AppleGothic" w:eastAsia="AppleGothic"/>
+                <w:rFonts w:ascii="Arial Unicode MS" w:hAnsi="Arial Unicode MS" w:eastAsia="Arial Unicode MS"/>
                 <w:b w:val="0"/>
                 <w:i w:val="0"/>
                 <w:color w:val="000000"/>
@@ -3469,7 +3469,7 @@
             </w:pPr>
             <w:r>
               <w:rPr>
-                <w:rFonts w:ascii="AppleGothic" w:hAnsi="AppleGothic" w:eastAsia="AppleGothic"/>
+                <w:rFonts w:ascii="Arial Unicode MS" w:hAnsi="Arial Unicode MS" w:eastAsia="Arial Unicode MS"/>
                 <w:b w:val="0"/>
                 <w:i w:val="0"/>
                 <w:color w:val="000000"/>
@@ -3497,7 +3497,7 @@
             </w:pPr>
             <w:r>
               <w:rPr>
-                <w:rFonts w:ascii="AppleGothic" w:hAnsi="AppleGothic" w:eastAsia="AppleGothic"/>
+                <w:rFonts w:ascii="Arial Unicode MS" w:hAnsi="Arial Unicode MS" w:eastAsia="Arial Unicode MS"/>
                 <w:b w:val="0"/>
                 <w:i w:val="0"/>
                 <w:color w:val="000000"/>
@@ -3531,7 +3531,7 @@
             </w:pPr>
             <w:r>
               <w:rPr>
-                <w:rFonts w:ascii="AppleGothic" w:hAnsi="AppleGothic" w:eastAsia="AppleGothic"/>
+                <w:rFonts w:ascii="Arial Unicode MS" w:hAnsi="Arial Unicode MS" w:eastAsia="Arial Unicode MS"/>
                 <w:b w:val="0"/>
                 <w:i w:val="0"/>
                 <w:color w:val="000000"/>
@@ -3559,7 +3559,7 @@
             </w:pPr>
             <w:r>
               <w:rPr>
-                <w:rFonts w:ascii="AppleGothic" w:hAnsi="AppleGothic" w:eastAsia="AppleGothic"/>
+                <w:rFonts w:ascii="Arial Unicode MS" w:hAnsi="Arial Unicode MS" w:eastAsia="Arial Unicode MS"/>
                 <w:b w:val="0"/>
                 <w:i w:val="0"/>
                 <w:color w:val="000000"/>
@@ -3587,7 +3587,7 @@
             </w:pPr>
             <w:r>
               <w:rPr>
-                <w:rFonts w:ascii="AppleGothic" w:hAnsi="AppleGothic" w:eastAsia="AppleGothic"/>
+                <w:rFonts w:ascii="Arial Unicode MS" w:hAnsi="Arial Unicode MS" w:eastAsia="Arial Unicode MS"/>
                 <w:b w:val="0"/>
                 <w:i w:val="0"/>
                 <w:color w:val="000000"/>
@@ -3615,7 +3615,7 @@
             </w:pPr>
             <w:r>
               <w:rPr>
-                <w:rFonts w:ascii="AppleGothic" w:hAnsi="AppleGothic" w:eastAsia="AppleGothic"/>
+                <w:rFonts w:ascii="Arial Unicode MS" w:hAnsi="Arial Unicode MS" w:eastAsia="Arial Unicode MS"/>
                 <w:b w:val="0"/>
                 <w:i w:val="0"/>
                 <w:color w:val="000000"/>
@@ -3643,7 +3643,7 @@
             </w:pPr>
             <w:r>
               <w:rPr>
-                <w:rFonts w:ascii="AppleGothic" w:hAnsi="AppleGothic" w:eastAsia="AppleGothic"/>
+                <w:rFonts w:ascii="Arial Unicode MS" w:hAnsi="Arial Unicode MS" w:eastAsia="Arial Unicode MS"/>
                 <w:b w:val="0"/>
                 <w:i w:val="0"/>
                 <w:color w:val="000000"/>
@@ -3677,7 +3677,7 @@
             </w:pPr>
             <w:r>
               <w:rPr>
-                <w:rFonts w:ascii="AppleGothic" w:hAnsi="AppleGothic" w:eastAsia="AppleGothic"/>
+                <w:rFonts w:ascii="Arial Unicode MS" w:hAnsi="Arial Unicode MS" w:eastAsia="Arial Unicode MS"/>
                 <w:b w:val="0"/>
                 <w:i w:val="0"/>
                 <w:color w:val="000000"/>
@@ -3705,7 +3705,7 @@
             </w:pPr>
             <w:r>
               <w:rPr>
-                <w:rFonts w:ascii="AppleGothic" w:hAnsi="AppleGothic" w:eastAsia="AppleGothic"/>
+                <w:rFonts w:ascii="Arial Unicode MS" w:hAnsi="Arial Unicode MS" w:eastAsia="Arial Unicode MS"/>
                 <w:b w:val="0"/>
                 <w:i w:val="0"/>
                 <w:color w:val="000000"/>
@@ -3733,7 +3733,7 @@
             </w:pPr>
             <w:r>
               <w:rPr>
-                <w:rFonts w:ascii="AppleGothic" w:hAnsi="AppleGothic" w:eastAsia="AppleGothic"/>
+                <w:rFonts w:ascii="Arial Unicode MS" w:hAnsi="Arial Unicode MS" w:eastAsia="Arial Unicode MS"/>
                 <w:b w:val="0"/>
                 <w:i w:val="0"/>
                 <w:color w:val="000000"/>
@@ -3761,7 +3761,7 @@
             </w:pPr>
             <w:r>
               <w:rPr>
-                <w:rFonts w:ascii="AppleGothic" w:hAnsi="AppleGothic" w:eastAsia="AppleGothic"/>
+                <w:rFonts w:ascii="Arial Unicode MS" w:hAnsi="Arial Unicode MS" w:eastAsia="Arial Unicode MS"/>
                 <w:b w:val="0"/>
                 <w:i w:val="0"/>
                 <w:color w:val="000000"/>
@@ -3789,7 +3789,7 @@
             </w:pPr>
             <w:r>
               <w:rPr>
-                <w:rFonts w:ascii="AppleGothic" w:hAnsi="AppleGothic" w:eastAsia="AppleGothic"/>
+                <w:rFonts w:ascii="Arial Unicode MS" w:hAnsi="Arial Unicode MS" w:eastAsia="Arial Unicode MS"/>
                 <w:b w:val="0"/>
                 <w:i w:val="0"/>
                 <w:color w:val="000000"/>
@@ -3823,7 +3823,7 @@
             </w:pPr>
             <w:r>
               <w:rPr>
-                <w:rFonts w:ascii="AppleGothic" w:hAnsi="AppleGothic" w:eastAsia="AppleGothic"/>
+                <w:rFonts w:ascii="Arial Unicode MS" w:hAnsi="Arial Unicode MS" w:eastAsia="Arial Unicode MS"/>
                 <w:b w:val="0"/>
                 <w:i w:val="0"/>
                 <w:color w:val="000000"/>
@@ -3851,7 +3851,7 @@
             </w:pPr>
             <w:r>
               <w:rPr>
-                <w:rFonts w:ascii="AppleGothic" w:hAnsi="AppleGothic" w:eastAsia="AppleGothic"/>
+                <w:rFonts w:ascii="Arial Unicode MS" w:hAnsi="Arial Unicode MS" w:eastAsia="Arial Unicode MS"/>
                 <w:b w:val="0"/>
                 <w:i w:val="0"/>
                 <w:color w:val="000000"/>
@@ -3879,7 +3879,7 @@
             </w:pPr>
             <w:r>
               <w:rPr>
-                <w:rFonts w:ascii="AppleGothic" w:hAnsi="AppleGothic" w:eastAsia="AppleGothic"/>
+                <w:rFonts w:ascii="Arial Unicode MS" w:hAnsi="Arial Unicode MS" w:eastAsia="Arial Unicode MS"/>
                 <w:b w:val="0"/>
                 <w:i w:val="0"/>
                 <w:color w:val="000000"/>
@@ -3907,7 +3907,7 @@
             </w:pPr>
             <w:r>
               <w:rPr>
-                <w:rFonts w:ascii="AppleGothic" w:hAnsi="AppleGothic" w:eastAsia="AppleGothic"/>
+                <w:rFonts w:ascii="Arial Unicode MS" w:hAnsi="Arial Unicode MS" w:eastAsia="Arial Unicode MS"/>
                 <w:b w:val="0"/>
                 <w:i w:val="0"/>
                 <w:color w:val="000000"/>
@@ -3935,7 +3935,7 @@
             </w:pPr>
             <w:r>
               <w:rPr>
-                <w:rFonts w:ascii="AppleGothic" w:hAnsi="AppleGothic" w:eastAsia="AppleGothic"/>
+                <w:rFonts w:ascii="Arial Unicode MS" w:hAnsi="Arial Unicode MS" w:eastAsia="Arial Unicode MS"/>
                 <w:b w:val="0"/>
                 <w:i w:val="0"/>
                 <w:color w:val="000000"/>
@@ -3969,7 +3969,7 @@
             </w:pPr>
             <w:r>
               <w:rPr>
-                <w:rFonts w:ascii="AppleGothic" w:hAnsi="AppleGothic" w:eastAsia="AppleGothic"/>
+                <w:rFonts w:ascii="Arial Unicode MS" w:hAnsi="Arial Unicode MS" w:eastAsia="Arial Unicode MS"/>
                 <w:b w:val="0"/>
                 <w:i w:val="0"/>
                 <w:color w:val="000000"/>
@@ -3997,7 +3997,7 @@
             </w:pPr>
             <w:r>
               <w:rPr>
-                <w:rFonts w:ascii="AppleGothic" w:hAnsi="AppleGothic" w:eastAsia="AppleGothic"/>
+                <w:rFonts w:ascii="Arial Unicode MS" w:hAnsi="Arial Unicode MS" w:eastAsia="Arial Unicode MS"/>
                 <w:b w:val="0"/>
                 <w:i w:val="0"/>
                 <w:color w:val="000000"/>
@@ -4025,7 +4025,7 @@
             </w:pPr>
             <w:r>
               <w:rPr>
-                <w:rFonts w:ascii="AppleGothic" w:hAnsi="AppleGothic" w:eastAsia="AppleGothic"/>
+                <w:rFonts w:ascii="Arial Unicode MS" w:hAnsi="Arial Unicode MS" w:eastAsia="Arial Unicode MS"/>
                 <w:b w:val="0"/>
                 <w:i w:val="0"/>
                 <w:color w:val="000000"/>
@@ -4053,7 +4053,7 @@
             </w:pPr>
             <w:r>
               <w:rPr>
-                <w:rFonts w:ascii="AppleGothic" w:hAnsi="AppleGothic" w:eastAsia="AppleGothic"/>
+                <w:rFonts w:ascii="Arial Unicode MS" w:hAnsi="Arial Unicode MS" w:eastAsia="Arial Unicode MS"/>
                 <w:b w:val="0"/>
                 <w:i w:val="0"/>
                 <w:color w:val="000000"/>
@@ -4081,7 +4081,7 @@
             </w:pPr>
             <w:r>
               <w:rPr>
-                <w:rFonts w:ascii="AppleGothic" w:hAnsi="AppleGothic" w:eastAsia="AppleGothic"/>
+                <w:rFonts w:ascii="Arial Unicode MS" w:hAnsi="Arial Unicode MS" w:eastAsia="Arial Unicode MS"/>
                 <w:b w:val="0"/>
                 <w:i w:val="0"/>
                 <w:color w:val="000000"/>
@@ -4115,7 +4115,7 @@
             </w:pPr>
             <w:r>
               <w:rPr>
-                <w:rFonts w:ascii="AppleGothic" w:hAnsi="AppleGothic" w:eastAsia="AppleGothic"/>
+                <w:rFonts w:ascii="Arial Unicode MS" w:hAnsi="Arial Unicode MS" w:eastAsia="Arial Unicode MS"/>
                 <w:b w:val="0"/>
                 <w:i w:val="0"/>
                 <w:color w:val="000000"/>
@@ -4143,7 +4143,7 @@
             </w:pPr>
             <w:r>
               <w:rPr>
-                <w:rFonts w:ascii="AppleGothic" w:hAnsi="AppleGothic" w:eastAsia="AppleGothic"/>
+                <w:rFonts w:ascii="Arial Unicode MS" w:hAnsi="Arial Unicode MS" w:eastAsia="Arial Unicode MS"/>
                 <w:b w:val="0"/>
                 <w:i w:val="0"/>
                 <w:color w:val="000000"/>
@@ -4171,7 +4171,7 @@
             </w:pPr>
             <w:r>
               <w:rPr>
-                <w:rFonts w:ascii="AppleGothic" w:hAnsi="AppleGothic" w:eastAsia="AppleGothic"/>
+                <w:rFonts w:ascii="Arial Unicode MS" w:hAnsi="Arial Unicode MS" w:eastAsia="Arial Unicode MS"/>
                 <w:b w:val="0"/>
                 <w:i w:val="0"/>
                 <w:color w:val="000000"/>
@@ -4199,7 +4199,7 @@
             </w:pPr>
             <w:r>
               <w:rPr>
-                <w:rFonts w:ascii="AppleGothic" w:hAnsi="AppleGothic" w:eastAsia="AppleGothic"/>
+                <w:rFonts w:ascii="Arial Unicode MS" w:hAnsi="Arial Unicode MS" w:eastAsia="Arial Unicode MS"/>
                 <w:b w:val="0"/>
                 <w:i w:val="0"/>
                 <w:color w:val="000000"/>
@@ -4227,7 +4227,7 @@
             </w:pPr>
             <w:r>
               <w:rPr>
-                <w:rFonts w:ascii="AppleGothic" w:hAnsi="AppleGothic" w:eastAsia="AppleGothic"/>
+                <w:rFonts w:ascii="Arial Unicode MS" w:hAnsi="Arial Unicode MS" w:eastAsia="Arial Unicode MS"/>
                 <w:b w:val="0"/>
                 <w:i w:val="0"/>
                 <w:color w:val="000000"/>
@@ -4247,7 +4247,7 @@
     <w:p>
       <w:r>
         <w:rPr>
-          <w:rFonts w:ascii="AppleGothic" w:hAnsi="AppleGothic" w:eastAsia="AppleGothic"/>
+          <w:rFonts w:ascii="Arial Unicode MS" w:hAnsi="Arial Unicode MS" w:eastAsia="Arial Unicode MS"/>
           <w:b w:val="0"/>
           <w:i w:val="0"/>
           <w:color w:val="000000"/>
@@ -4278,7 +4278,7 @@
       </w:pPr>
       <w:r>
         <w:rPr>
-          <w:rFonts w:ascii="AppleGothic" w:hAnsi="AppleGothic" w:eastAsia="AppleGothic"/>
+          <w:rFonts w:ascii="Arial Unicode MS" w:hAnsi="Arial Unicode MS" w:eastAsia="Arial Unicode MS"/>
           <w:b/>
           <w:i w:val="0"/>
           <w:color w:val="0B2545"/>
@@ -4288,7 +4288,7 @@
       </w:r>
       <w:r>
         <w:rPr>
-          <w:rFonts w:ascii="AppleGothic" w:hAnsi="AppleGothic" w:eastAsia="AppleGothic"/>
+          <w:rFonts w:ascii="Arial Unicode MS" w:hAnsi="Arial Unicode MS" w:eastAsia="Arial Unicode MS"/>
           <w:b w:val="0"/>
           <w:i w:val="0"/>
           <w:color w:val="0B2545"/>
@@ -4308,7 +4308,7 @@
     <w:p>
       <w:r>
         <w:rPr>
-          <w:rFonts w:ascii="AppleGothic" w:hAnsi="AppleGothic" w:eastAsia="AppleGothic"/>
+          <w:rFonts w:ascii="Arial Unicode MS" w:hAnsi="Arial Unicode MS" w:eastAsia="Arial Unicode MS"/>
           <w:b w:val="0"/>
           <w:i w:val="0"/>
           <w:color w:val="000000"/>
@@ -4357,7 +4357,7 @@
             </w:pPr>
             <w:r>
               <w:rPr>
-                <w:rFonts w:ascii="AppleGothic" w:hAnsi="AppleGothic" w:eastAsia="AppleGothic"/>
+                <w:rFonts w:ascii="Arial Unicode MS" w:hAnsi="Arial Unicode MS" w:eastAsia="Arial Unicode MS"/>
                 <w:b/>
                 <w:i w:val="0"/>
                 <w:color w:val="0B2545"/>
@@ -4386,7 +4386,7 @@
             </w:pPr>
             <w:r>
               <w:rPr>
-                <w:rFonts w:ascii="AppleGothic" w:hAnsi="AppleGothic" w:eastAsia="AppleGothic"/>
+                <w:rFonts w:ascii="Arial Unicode MS" w:hAnsi="Arial Unicode MS" w:eastAsia="Arial Unicode MS"/>
                 <w:b/>
                 <w:i w:val="0"/>
                 <w:color w:val="0B2545"/>
@@ -4415,7 +4415,7 @@
             </w:pPr>
             <w:r>
               <w:rPr>
-                <w:rFonts w:ascii="AppleGothic" w:hAnsi="AppleGothic" w:eastAsia="AppleGothic"/>
+                <w:rFonts w:ascii="Arial Unicode MS" w:hAnsi="Arial Unicode MS" w:eastAsia="Arial Unicode MS"/>
                 <w:b/>
                 <w:i w:val="0"/>
                 <w:color w:val="0B2545"/>
@@ -4444,7 +4444,7 @@
             </w:pPr>
             <w:r>
               <w:rPr>
-                <w:rFonts w:ascii="AppleGothic" w:hAnsi="AppleGothic" w:eastAsia="AppleGothic"/>
+                <w:rFonts w:ascii="Arial Unicode MS" w:hAnsi="Arial Unicode MS" w:eastAsia="Arial Unicode MS"/>
                 <w:b/>
                 <w:i w:val="0"/>
                 <w:color w:val="0B2545"/>
@@ -4478,7 +4478,7 @@
             </w:pPr>
             <w:r>
               <w:rPr>
-                <w:rFonts w:ascii="AppleGothic" w:hAnsi="AppleGothic" w:eastAsia="AppleGothic"/>
+                <w:rFonts w:ascii="Arial Unicode MS" w:hAnsi="Arial Unicode MS" w:eastAsia="Arial Unicode MS"/>
                 <w:b w:val="0"/>
                 <w:i w:val="0"/>
                 <w:color w:val="000000"/>
@@ -4506,7 +4506,7 @@
             </w:pPr>
             <w:r>
               <w:rPr>
-                <w:rFonts w:ascii="AppleGothic" w:hAnsi="AppleGothic" w:eastAsia="AppleGothic"/>
+                <w:rFonts w:ascii="Arial Unicode MS" w:hAnsi="Arial Unicode MS" w:eastAsia="Arial Unicode MS"/>
                 <w:b w:val="0"/>
                 <w:i w:val="0"/>
                 <w:color w:val="000000"/>
@@ -4534,7 +4534,7 @@
             </w:pPr>
             <w:r>
               <w:rPr>
-                <w:rFonts w:ascii="AppleGothic" w:hAnsi="AppleGothic" w:eastAsia="AppleGothic"/>
+                <w:rFonts w:ascii="Arial Unicode MS" w:hAnsi="Arial Unicode MS" w:eastAsia="Arial Unicode MS"/>
                 <w:b w:val="0"/>
                 <w:i w:val="0"/>
                 <w:color w:val="000000"/>
@@ -4562,7 +4562,7 @@
             </w:pPr>
             <w:r>
               <w:rPr>
-                <w:rFonts w:ascii="AppleGothic" w:hAnsi="AppleGothic" w:eastAsia="AppleGothic"/>
+                <w:rFonts w:ascii="Arial Unicode MS" w:hAnsi="Arial Unicode MS" w:eastAsia="Arial Unicode MS"/>
                 <w:b w:val="0"/>
                 <w:i w:val="0"/>
                 <w:color w:val="000000"/>
@@ -4596,7 +4596,7 @@
             </w:pPr>
             <w:r>
               <w:rPr>
-                <w:rFonts w:ascii="AppleGothic" w:hAnsi="AppleGothic" w:eastAsia="AppleGothic"/>
+                <w:rFonts w:ascii="Arial Unicode MS" w:hAnsi="Arial Unicode MS" w:eastAsia="Arial Unicode MS"/>
                 <w:b w:val="0"/>
                 <w:i w:val="0"/>
                 <w:color w:val="000000"/>
@@ -4624,7 +4624,7 @@
             </w:pPr>
             <w:r>
               <w:rPr>
-                <w:rFonts w:ascii="AppleGothic" w:hAnsi="AppleGothic" w:eastAsia="AppleGothic"/>
+                <w:rFonts w:ascii="Arial Unicode MS" w:hAnsi="Arial Unicode MS" w:eastAsia="Arial Unicode MS"/>
                 <w:b w:val="0"/>
                 <w:i w:val="0"/>
                 <w:color w:val="000000"/>
@@ -4652,7 +4652,7 @@
             </w:pPr>
             <w:r>
               <w:rPr>
-                <w:rFonts w:ascii="AppleGothic" w:hAnsi="AppleGothic" w:eastAsia="AppleGothic"/>
+                <w:rFonts w:ascii="Arial Unicode MS" w:hAnsi="Arial Unicode MS" w:eastAsia="Arial Unicode MS"/>
                 <w:b w:val="0"/>
                 <w:i w:val="0"/>
                 <w:color w:val="000000"/>
@@ -4680,7 +4680,7 @@
             </w:pPr>
             <w:r>
               <w:rPr>
-                <w:rFonts w:ascii="AppleGothic" w:hAnsi="AppleGothic" w:eastAsia="AppleGothic"/>
+                <w:rFonts w:ascii="Arial Unicode MS" w:hAnsi="Arial Unicode MS" w:eastAsia="Arial Unicode MS"/>
                 <w:b w:val="0"/>
                 <w:i w:val="0"/>
                 <w:color w:val="000000"/>
@@ -4714,7 +4714,7 @@
             </w:pPr>
             <w:r>
               <w:rPr>
-                <w:rFonts w:ascii="AppleGothic" w:hAnsi="AppleGothic" w:eastAsia="AppleGothic"/>
+                <w:rFonts w:ascii="Arial Unicode MS" w:hAnsi="Arial Unicode MS" w:eastAsia="Arial Unicode MS"/>
                 <w:b w:val="0"/>
                 <w:i w:val="0"/>
                 <w:color w:val="000000"/>
@@ -4742,7 +4742,7 @@
             </w:pPr>
             <w:r>
               <w:rPr>
-                <w:rFonts w:ascii="AppleGothic" w:hAnsi="AppleGothic" w:eastAsia="AppleGothic"/>
+                <w:rFonts w:ascii="Arial Unicode MS" w:hAnsi="Arial Unicode MS" w:eastAsia="Arial Unicode MS"/>
                 <w:b w:val="0"/>
                 <w:i w:val="0"/>
                 <w:color w:val="000000"/>
@@ -4770,7 +4770,7 @@
             </w:pPr>
             <w:r>
               <w:rPr>
-                <w:rFonts w:ascii="AppleGothic" w:hAnsi="AppleGothic" w:eastAsia="AppleGothic"/>
+                <w:rFonts w:ascii="Arial Unicode MS" w:hAnsi="Arial Unicode MS" w:eastAsia="Arial Unicode MS"/>
                 <w:b w:val="0"/>
                 <w:i w:val="0"/>
                 <w:color w:val="000000"/>
@@ -4798,7 +4798,7 @@
             </w:pPr>
             <w:r>
               <w:rPr>
-                <w:rFonts w:ascii="AppleGothic" w:hAnsi="AppleGothic" w:eastAsia="AppleGothic"/>
+                <w:rFonts w:ascii="Arial Unicode MS" w:hAnsi="Arial Unicode MS" w:eastAsia="Arial Unicode MS"/>
                 <w:b w:val="0"/>
                 <w:i w:val="0"/>
                 <w:color w:val="000000"/>
@@ -4832,7 +4832,7 @@
             </w:pPr>
             <w:r>
               <w:rPr>
-                <w:rFonts w:ascii="AppleGothic" w:hAnsi="AppleGothic" w:eastAsia="AppleGothic"/>
+                <w:rFonts w:ascii="Arial Unicode MS" w:hAnsi="Arial Unicode MS" w:eastAsia="Arial Unicode MS"/>
                 <w:b w:val="0"/>
                 <w:i w:val="0"/>
                 <w:color w:val="000000"/>
@@ -4860,7 +4860,7 @@
             </w:pPr>
             <w:r>
               <w:rPr>
-                <w:rFonts w:ascii="AppleGothic" w:hAnsi="AppleGothic" w:eastAsia="AppleGothic"/>
+                <w:rFonts w:ascii="Arial Unicode MS" w:hAnsi="Arial Unicode MS" w:eastAsia="Arial Unicode MS"/>
                 <w:b w:val="0"/>
                 <w:i w:val="0"/>
                 <w:color w:val="000000"/>
@@ -4888,7 +4888,7 @@
             </w:pPr>
             <w:r>
               <w:rPr>
-                <w:rFonts w:ascii="AppleGothic" w:hAnsi="AppleGothic" w:eastAsia="AppleGothic"/>
+                <w:rFonts w:ascii="Arial Unicode MS" w:hAnsi="Arial Unicode MS" w:eastAsia="Arial Unicode MS"/>
                 <w:b w:val="0"/>
                 <w:i w:val="0"/>
                 <w:color w:val="000000"/>
@@ -4916,7 +4916,7 @@
             </w:pPr>
             <w:r>
               <w:rPr>
-                <w:rFonts w:ascii="AppleGothic" w:hAnsi="AppleGothic" w:eastAsia="AppleGothic"/>
+                <w:rFonts w:ascii="Arial Unicode MS" w:hAnsi="Arial Unicode MS" w:eastAsia="Arial Unicode MS"/>
                 <w:b w:val="0"/>
                 <w:i w:val="0"/>
                 <w:color w:val="000000"/>
@@ -4947,7 +4947,7 @@
       </w:pPr>
       <w:r>
         <w:rPr>
-          <w:rFonts w:ascii="AppleGothic" w:hAnsi="AppleGothic" w:eastAsia="AppleGothic"/>
+          <w:rFonts w:ascii="Arial Unicode MS" w:hAnsi="Arial Unicode MS" w:eastAsia="Arial Unicode MS"/>
           <w:b/>
           <w:i w:val="0"/>
           <w:color w:val="0B2545"/>
@@ -4957,7 +4957,7 @@
       </w:r>
       <w:r>
         <w:rPr>
-          <w:rFonts w:ascii="AppleGothic" w:hAnsi="AppleGothic" w:eastAsia="AppleGothic"/>
+          <w:rFonts w:ascii="Arial Unicode MS" w:hAnsi="Arial Unicode MS" w:eastAsia="Arial Unicode MS"/>
           <w:b w:val="0"/>
           <w:i w:val="0"/>
           <w:color w:val="0B2545"/>
@@ -4969,7 +4969,7 @@
     <w:p>
       <w:r>
         <w:rPr>
-          <w:rFonts w:ascii="AppleGothic" w:hAnsi="AppleGothic" w:eastAsia="AppleGothic"/>
+          <w:rFonts w:ascii="Arial Unicode MS" w:hAnsi="Arial Unicode MS" w:eastAsia="Arial Unicode MS"/>
           <w:b w:val="0"/>
           <w:i w:val="0"/>
           <w:color w:val="000000"/>
@@ -4989,7 +4989,7 @@
     <w:p>
       <w:r>
         <w:rPr>
-          <w:rFonts w:ascii="AppleGothic" w:hAnsi="AppleGothic" w:eastAsia="AppleGothic"/>
+          <w:rFonts w:ascii="Arial Unicode MS" w:hAnsi="Arial Unicode MS" w:eastAsia="Arial Unicode MS"/>
           <w:b w:val="0"/>
           <w:i w:val="0"/>
           <w:color w:val="000000"/>
@@ -5038,7 +5038,7 @@
             </w:pPr>
             <w:r>
               <w:rPr>
-                <w:rFonts w:ascii="AppleGothic" w:hAnsi="AppleGothic" w:eastAsia="AppleGothic"/>
+                <w:rFonts w:ascii="Arial Unicode MS" w:hAnsi="Arial Unicode MS" w:eastAsia="Arial Unicode MS"/>
                 <w:b/>
                 <w:i w:val="0"/>
                 <w:color w:val="0B2545"/>
@@ -5067,7 +5067,7 @@
             </w:pPr>
             <w:r>
               <w:rPr>
-                <w:rFonts w:ascii="AppleGothic" w:hAnsi="AppleGothic" w:eastAsia="AppleGothic"/>
+                <w:rFonts w:ascii="Arial Unicode MS" w:hAnsi="Arial Unicode MS" w:eastAsia="Arial Unicode MS"/>
                 <w:b/>
                 <w:i w:val="0"/>
                 <w:color w:val="0B2545"/>
@@ -5096,7 +5096,7 @@
             </w:pPr>
             <w:r>
               <w:rPr>
-                <w:rFonts w:ascii="AppleGothic" w:hAnsi="AppleGothic" w:eastAsia="AppleGothic"/>
+                <w:rFonts w:ascii="Arial Unicode MS" w:hAnsi="Arial Unicode MS" w:eastAsia="Arial Unicode MS"/>
                 <w:b/>
                 <w:i w:val="0"/>
                 <w:color w:val="0B2545"/>
@@ -5125,7 +5125,7 @@
             </w:pPr>
             <w:r>
               <w:rPr>
-                <w:rFonts w:ascii="AppleGothic" w:hAnsi="AppleGothic" w:eastAsia="AppleGothic"/>
+                <w:rFonts w:ascii="Arial Unicode MS" w:hAnsi="Arial Unicode MS" w:eastAsia="Arial Unicode MS"/>
                 <w:b/>
                 <w:i w:val="0"/>
                 <w:color w:val="0B2545"/>
@@ -5159,7 +5159,7 @@
             </w:pPr>
             <w:r>
               <w:rPr>
-                <w:rFonts w:ascii="AppleGothic" w:hAnsi="AppleGothic" w:eastAsia="AppleGothic"/>
+                <w:rFonts w:ascii="Arial Unicode MS" w:hAnsi="Arial Unicode MS" w:eastAsia="Arial Unicode MS"/>
                 <w:b w:val="0"/>
                 <w:i w:val="0"/>
                 <w:color w:val="000000"/>
@@ -5187,7 +5187,7 @@
             </w:pPr>
             <w:r>
               <w:rPr>
-                <w:rFonts w:ascii="AppleGothic" w:hAnsi="AppleGothic" w:eastAsia="AppleGothic"/>
+                <w:rFonts w:ascii="Arial Unicode MS" w:hAnsi="Arial Unicode MS" w:eastAsia="Arial Unicode MS"/>
                 <w:b w:val="0"/>
                 <w:i w:val="0"/>
                 <w:color w:val="000000"/>
@@ -5215,7 +5215,7 @@
             </w:pPr>
             <w:r>
               <w:rPr>
-                <w:rFonts w:ascii="AppleGothic" w:hAnsi="AppleGothic" w:eastAsia="AppleGothic"/>
+                <w:rFonts w:ascii="Arial Unicode MS" w:hAnsi="Arial Unicode MS" w:eastAsia="Arial Unicode MS"/>
                 <w:b w:val="0"/>
                 <w:i w:val="0"/>
                 <w:color w:val="000000"/>
@@ -5243,7 +5243,7 @@
             </w:pPr>
             <w:r>
               <w:rPr>
-                <w:rFonts w:ascii="AppleGothic" w:hAnsi="AppleGothic" w:eastAsia="AppleGothic"/>
+                <w:rFonts w:ascii="Arial Unicode MS" w:hAnsi="Arial Unicode MS" w:eastAsia="Arial Unicode MS"/>
                 <w:b w:val="0"/>
                 <w:i w:val="0"/>
                 <w:color w:val="000000"/>
@@ -5277,7 +5277,7 @@
             </w:pPr>
             <w:r>
               <w:rPr>
-                <w:rFonts w:ascii="AppleGothic" w:hAnsi="AppleGothic" w:eastAsia="AppleGothic"/>
+                <w:rFonts w:ascii="Arial Unicode MS" w:hAnsi="Arial Unicode MS" w:eastAsia="Arial Unicode MS"/>
                 <w:b w:val="0"/>
                 <w:i w:val="0"/>
                 <w:color w:val="000000"/>
@@ -5305,7 +5305,7 @@
             </w:pPr>
             <w:r>
               <w:rPr>
-                <w:rFonts w:ascii="AppleGothic" w:hAnsi="AppleGothic" w:eastAsia="AppleGothic"/>
+                <w:rFonts w:ascii="Arial Unicode MS" w:hAnsi="Arial Unicode MS" w:eastAsia="Arial Unicode MS"/>
                 <w:b w:val="0"/>
                 <w:i w:val="0"/>
                 <w:color w:val="000000"/>
@@ -5333,7 +5333,7 @@
             </w:pPr>
             <w:r>
               <w:rPr>
-                <w:rFonts w:ascii="AppleGothic" w:hAnsi="AppleGothic" w:eastAsia="AppleGothic"/>
+                <w:rFonts w:ascii="Arial Unicode MS" w:hAnsi="Arial Unicode MS" w:eastAsia="Arial Unicode MS"/>
                 <w:b w:val="0"/>
                 <w:i w:val="0"/>
                 <w:color w:val="000000"/>
@@ -5361,7 +5361,7 @@
             </w:pPr>
             <w:r>
               <w:rPr>
-                <w:rFonts w:ascii="AppleGothic" w:hAnsi="AppleGothic" w:eastAsia="AppleGothic"/>
+                <w:rFonts w:ascii="Arial Unicode MS" w:hAnsi="Arial Unicode MS" w:eastAsia="Arial Unicode MS"/>
                 <w:b w:val="0"/>
                 <w:i w:val="0"/>
                 <w:color w:val="000000"/>
@@ -5395,7 +5395,7 @@
             </w:pPr>
             <w:r>
               <w:rPr>
-                <w:rFonts w:ascii="AppleGothic" w:hAnsi="AppleGothic" w:eastAsia="AppleGothic"/>
+                <w:rFonts w:ascii="Arial Unicode MS" w:hAnsi="Arial Unicode MS" w:eastAsia="Arial Unicode MS"/>
                 <w:b w:val="0"/>
                 <w:i w:val="0"/>
                 <w:color w:val="000000"/>
@@ -5423,7 +5423,7 @@
             </w:pPr>
             <w:r>
               <w:rPr>
-                <w:rFonts w:ascii="AppleGothic" w:hAnsi="AppleGothic" w:eastAsia="AppleGothic"/>
+                <w:rFonts w:ascii="Arial Unicode MS" w:hAnsi="Arial Unicode MS" w:eastAsia="Arial Unicode MS"/>
                 <w:b w:val="0"/>
                 <w:i w:val="0"/>
                 <w:color w:val="000000"/>
@@ -5451,7 +5451,7 @@
             </w:pPr>
             <w:r>
               <w:rPr>
-                <w:rFonts w:ascii="AppleGothic" w:hAnsi="AppleGothic" w:eastAsia="AppleGothic"/>
+                <w:rFonts w:ascii="Arial Unicode MS" w:hAnsi="Arial Unicode MS" w:eastAsia="Arial Unicode MS"/>
                 <w:b w:val="0"/>
                 <w:i w:val="0"/>
                 <w:color w:val="000000"/>
@@ -5479,7 +5479,7 @@
             </w:pPr>
             <w:r>
               <w:rPr>
-                <w:rFonts w:ascii="AppleGothic" w:hAnsi="AppleGothic" w:eastAsia="AppleGothic"/>
+                <w:rFonts w:ascii="Arial Unicode MS" w:hAnsi="Arial Unicode MS" w:eastAsia="Arial Unicode MS"/>
                 <w:b w:val="0"/>
                 <w:i w:val="0"/>
                 <w:color w:val="000000"/>
@@ -5499,7 +5499,7 @@
     <w:p>
       <w:r>
         <w:rPr>
-          <w:rFonts w:ascii="AppleGothic" w:hAnsi="AppleGothic" w:eastAsia="AppleGothic"/>
+          <w:rFonts w:ascii="Arial Unicode MS" w:hAnsi="Arial Unicode MS" w:eastAsia="Arial Unicode MS"/>
           <w:b w:val="0"/>
           <w:i w:val="0"/>
           <w:color w:val="000000"/>
@@ -5530,7 +5530,7 @@
       </w:pPr>
       <w:r>
         <w:rPr>
-          <w:rFonts w:ascii="AppleGothic" w:hAnsi="AppleGothic" w:eastAsia="AppleGothic"/>
+          <w:rFonts w:ascii="Arial Unicode MS" w:hAnsi="Arial Unicode MS" w:eastAsia="Arial Unicode MS"/>
           <w:b/>
           <w:i w:val="0"/>
           <w:color w:val="0B2545"/>
@@ -5540,7 +5540,7 @@
       </w:r>
       <w:r>
         <w:rPr>
-          <w:rFonts w:ascii="AppleGothic" w:hAnsi="AppleGothic" w:eastAsia="AppleGothic"/>
+          <w:rFonts w:ascii="Arial Unicode MS" w:hAnsi="Arial Unicode MS" w:eastAsia="Arial Unicode MS"/>
           <w:b w:val="0"/>
           <w:i w:val="0"/>
           <w:color w:val="0B2545"/>
@@ -5552,7 +5552,7 @@
     <w:p>
       <w:r>
         <w:rPr>
-          <w:rFonts w:ascii="AppleGothic" w:hAnsi="AppleGothic" w:eastAsia="AppleGothic"/>
+          <w:rFonts w:ascii="Arial Unicode MS" w:hAnsi="Arial Unicode MS" w:eastAsia="Arial Unicode MS"/>
           <w:b w:val="0"/>
           <w:i w:val="0"/>
           <w:color w:val="000000"/>
@@ -5602,7 +5602,7 @@
             </w:pPr>
             <w:r>
               <w:rPr>
-                <w:rFonts w:ascii="AppleGothic" w:hAnsi="AppleGothic" w:eastAsia="AppleGothic"/>
+                <w:rFonts w:ascii="Arial Unicode MS" w:hAnsi="Arial Unicode MS" w:eastAsia="Arial Unicode MS"/>
                 <w:b/>
                 <w:i w:val="0"/>
                 <w:color w:val="0B2545"/>
@@ -5631,7 +5631,7 @@
             </w:pPr>
             <w:r>
               <w:rPr>
-                <w:rFonts w:ascii="AppleGothic" w:hAnsi="AppleGothic" w:eastAsia="AppleGothic"/>
+                <w:rFonts w:ascii="Arial Unicode MS" w:hAnsi="Arial Unicode MS" w:eastAsia="Arial Unicode MS"/>
                 <w:b/>
                 <w:i w:val="0"/>
                 <w:color w:val="0B2545"/>
@@ -5660,7 +5660,7 @@
             </w:pPr>
             <w:r>
               <w:rPr>
-                <w:rFonts w:ascii="AppleGothic" w:hAnsi="AppleGothic" w:eastAsia="AppleGothic"/>
+                <w:rFonts w:ascii="Arial Unicode MS" w:hAnsi="Arial Unicode MS" w:eastAsia="Arial Unicode MS"/>
                 <w:b/>
                 <w:i w:val="0"/>
                 <w:color w:val="0B2545"/>
@@ -5689,7 +5689,7 @@
             </w:pPr>
             <w:r>
               <w:rPr>
-                <w:rFonts w:ascii="AppleGothic" w:hAnsi="AppleGothic" w:eastAsia="AppleGothic"/>
+                <w:rFonts w:ascii="Arial Unicode MS" w:hAnsi="Arial Unicode MS" w:eastAsia="Arial Unicode MS"/>
                 <w:b/>
                 <w:i w:val="0"/>
                 <w:color w:val="0B2545"/>
@@ -5718,7 +5718,7 @@
             </w:pPr>
             <w:r>
               <w:rPr>
-                <w:rFonts w:ascii="AppleGothic" w:hAnsi="AppleGothic" w:eastAsia="AppleGothic"/>
+                <w:rFonts w:ascii="Arial Unicode MS" w:hAnsi="Arial Unicode MS" w:eastAsia="Arial Unicode MS"/>
                 <w:b/>
                 <w:i w:val="0"/>
                 <w:color w:val="0B2545"/>
@@ -5752,7 +5752,7 @@
             </w:pPr>
             <w:r>
               <w:rPr>
-                <w:rFonts w:ascii="AppleGothic" w:hAnsi="AppleGothic" w:eastAsia="AppleGothic"/>
+                <w:rFonts w:ascii="Arial Unicode MS" w:hAnsi="Arial Unicode MS" w:eastAsia="Arial Unicode MS"/>
                 <w:b w:val="0"/>
                 <w:i w:val="0"/>
                 <w:color w:val="000000"/>
@@ -5780,7 +5780,7 @@
             </w:pPr>
             <w:r>
               <w:rPr>
-                <w:rFonts w:ascii="AppleGothic" w:hAnsi="AppleGothic" w:eastAsia="AppleGothic"/>
+                <w:rFonts w:ascii="Arial Unicode MS" w:hAnsi="Arial Unicode MS" w:eastAsia="Arial Unicode MS"/>
                 <w:b w:val="0"/>
                 <w:i w:val="0"/>
                 <w:color w:val="000000"/>
@@ -5808,7 +5808,7 @@
             </w:pPr>
             <w:r>
               <w:rPr>
-                <w:rFonts w:ascii="AppleGothic" w:hAnsi="AppleGothic" w:eastAsia="AppleGothic"/>
+                <w:rFonts w:ascii="Arial Unicode MS" w:hAnsi="Arial Unicode MS" w:eastAsia="Arial Unicode MS"/>
                 <w:b w:val="0"/>
                 <w:i w:val="0"/>
                 <w:color w:val="000000"/>
@@ -5836,7 +5836,7 @@
             </w:pPr>
             <w:r>
               <w:rPr>
-                <w:rFonts w:ascii="AppleGothic" w:hAnsi="AppleGothic" w:eastAsia="AppleGothic"/>
+                <w:rFonts w:ascii="Arial Unicode MS" w:hAnsi="Arial Unicode MS" w:eastAsia="Arial Unicode MS"/>
                 <w:b w:val="0"/>
                 <w:i w:val="0"/>
                 <w:color w:val="000000"/>
@@ -5864,7 +5864,7 @@
             </w:pPr>
             <w:r>
               <w:rPr>
-                <w:rFonts w:ascii="AppleGothic" w:hAnsi="AppleGothic" w:eastAsia="AppleGothic"/>
+                <w:rFonts w:ascii="Arial Unicode MS" w:hAnsi="Arial Unicode MS" w:eastAsia="Arial Unicode MS"/>
                 <w:b w:val="0"/>
                 <w:i w:val="0"/>
                 <w:color w:val="000000"/>
@@ -5898,7 +5898,7 @@
             </w:pPr>
             <w:r>
               <w:rPr>
-                <w:rFonts w:ascii="AppleGothic" w:hAnsi="AppleGothic" w:eastAsia="AppleGothic"/>
+                <w:rFonts w:ascii="Arial Unicode MS" w:hAnsi="Arial Unicode MS" w:eastAsia="Arial Unicode MS"/>
                 <w:b w:val="0"/>
                 <w:i w:val="0"/>
                 <w:color w:val="000000"/>
@@ -5926,7 +5926,7 @@
             </w:pPr>
             <w:r>
               <w:rPr>
-                <w:rFonts w:ascii="AppleGothic" w:hAnsi="AppleGothic" w:eastAsia="AppleGothic"/>
+                <w:rFonts w:ascii="Arial Unicode MS" w:hAnsi="Arial Unicode MS" w:eastAsia="Arial Unicode MS"/>
                 <w:b w:val="0"/>
                 <w:i w:val="0"/>
                 <w:color w:val="000000"/>
@@ -5954,7 +5954,7 @@
             </w:pPr>
             <w:r>
               <w:rPr>
-                <w:rFonts w:ascii="AppleGothic" w:hAnsi="AppleGothic" w:eastAsia="AppleGothic"/>
+                <w:rFonts w:ascii="Arial Unicode MS" w:hAnsi="Arial Unicode MS" w:eastAsia="Arial Unicode MS"/>
                 <w:b w:val="0"/>
                 <w:i w:val="0"/>
                 <w:color w:val="000000"/>
@@ -5982,7 +5982,7 @@
             </w:pPr>
             <w:r>
               <w:rPr>
-                <w:rFonts w:ascii="AppleGothic" w:hAnsi="AppleGothic" w:eastAsia="AppleGothic"/>
+                <w:rFonts w:ascii="Arial Unicode MS" w:hAnsi="Arial Unicode MS" w:eastAsia="Arial Unicode MS"/>
                 <w:b w:val="0"/>
                 <w:i w:val="0"/>
                 <w:color w:val="000000"/>
@@ -6010,7 +6010,7 @@
             </w:pPr>
             <w:r>
               <w:rPr>
-                <w:rFonts w:ascii="AppleGothic" w:hAnsi="AppleGothic" w:eastAsia="AppleGothic"/>
+                <w:rFonts w:ascii="Arial Unicode MS" w:hAnsi="Arial Unicode MS" w:eastAsia="Arial Unicode MS"/>
                 <w:b w:val="0"/>
                 <w:i w:val="0"/>
                 <w:color w:val="000000"/>
@@ -6030,7 +6030,7 @@
     <w:p>
       <w:r>
         <w:rPr>
-          <w:rFonts w:ascii="AppleGothic" w:hAnsi="AppleGothic" w:eastAsia="AppleGothic"/>
+          <w:rFonts w:ascii="Arial Unicode MS" w:hAnsi="Arial Unicode MS" w:eastAsia="Arial Unicode MS"/>
           <w:b w:val="0"/>
           <w:i w:val="0"/>
           <w:color w:val="000000"/>
@@ -6056,7 +6056,7 @@
       </w:pPr>
       <w:r>
         <w:rPr>
-          <w:rFonts w:ascii="AppleGothic" w:hAnsi="AppleGothic" w:eastAsia="AppleGothic"/>
+          <w:rFonts w:ascii="Arial Unicode MS" w:hAnsi="Arial Unicode MS" w:eastAsia="Arial Unicode MS"/>
           <w:b w:val="0"/>
           <w:i w:val="0"/>
           <w:color w:val="000000"/>
@@ -6074,7 +6074,7 @@
       </w:pPr>
       <w:r>
         <w:rPr>
-          <w:rFonts w:ascii="AppleGothic" w:hAnsi="AppleGothic" w:eastAsia="AppleGothic"/>
+          <w:rFonts w:ascii="Arial Unicode MS" w:hAnsi="Arial Unicode MS" w:eastAsia="Arial Unicode MS"/>
           <w:b w:val="0"/>
           <w:i w:val="0"/>
           <w:color w:val="000000"/>
@@ -6092,7 +6092,7 @@
       </w:pPr>
       <w:r>
         <w:rPr>
-          <w:rFonts w:ascii="AppleGothic" w:hAnsi="AppleGothic" w:eastAsia="AppleGothic"/>
+          <w:rFonts w:ascii="Arial Unicode MS" w:hAnsi="Arial Unicode MS" w:eastAsia="Arial Unicode MS"/>
           <w:b w:val="0"/>
           <w:i w:val="0"/>
           <w:color w:val="000000"/>
@@ -6110,7 +6110,7 @@
       </w:pPr>
       <w:r>
         <w:rPr>
-          <w:rFonts w:ascii="AppleGothic" w:hAnsi="AppleGothic" w:eastAsia="AppleGothic"/>
+          <w:rFonts w:ascii="Arial Unicode MS" w:hAnsi="Arial Unicode MS" w:eastAsia="Arial Unicode MS"/>
           <w:b w:val="0"/>
           <w:i w:val="0"/>
           <w:color w:val="000000"/>
@@ -6128,7 +6128,7 @@
       </w:pPr>
       <w:r>
         <w:rPr>
-          <w:rFonts w:ascii="AppleGothic" w:hAnsi="AppleGothic" w:eastAsia="AppleGothic"/>
+          <w:rFonts w:ascii="Arial Unicode MS" w:hAnsi="Arial Unicode MS" w:eastAsia="Arial Unicode MS"/>
           <w:b w:val="0"/>
           <w:i w:val="0"/>
           <w:color w:val="000000"/>
@@ -6140,7 +6140,7 @@
     <w:p>
       <w:r>
         <w:rPr>
-          <w:rFonts w:ascii="AppleGothic" w:hAnsi="AppleGothic" w:eastAsia="AppleGothic"/>
+          <w:rFonts w:ascii="Arial Unicode MS" w:hAnsi="Arial Unicode MS" w:eastAsia="Arial Unicode MS"/>
           <w:b w:val="0"/>
           <w:i w:val="0"/>
           <w:color w:val="000000"/>
@@ -6195,7 +6195,7 @@
             </w:pPr>
             <w:r>
               <w:rPr>
-                <w:rFonts w:ascii="AppleGothic" w:hAnsi="AppleGothic" w:eastAsia="AppleGothic"/>
+                <w:rFonts w:ascii="Arial Unicode MS" w:hAnsi="Arial Unicode MS" w:eastAsia="Arial Unicode MS"/>
                 <w:b/>
                 <w:i w:val="0"/>
                 <w:color w:val="0B2545"/>
@@ -6224,7 +6224,7 @@
             </w:pPr>
             <w:r>
               <w:rPr>
-                <w:rFonts w:ascii="AppleGothic" w:hAnsi="AppleGothic" w:eastAsia="AppleGothic"/>
+                <w:rFonts w:ascii="Arial Unicode MS" w:hAnsi="Arial Unicode MS" w:eastAsia="Arial Unicode MS"/>
                 <w:b/>
                 <w:i w:val="0"/>
                 <w:color w:val="0B2545"/>
@@ -6258,7 +6258,7 @@
             </w:pPr>
             <w:r>
               <w:rPr>
-                <w:rFonts w:ascii="AppleGothic" w:hAnsi="AppleGothic" w:eastAsia="AppleGothic"/>
+                <w:rFonts w:ascii="Arial Unicode MS" w:hAnsi="Arial Unicode MS" w:eastAsia="Arial Unicode MS"/>
                 <w:b w:val="0"/>
                 <w:i w:val="0"/>
                 <w:color w:val="000000"/>
@@ -6286,7 +6286,7 @@
             </w:pPr>
             <w:r>
               <w:rPr>
-                <w:rFonts w:ascii="AppleGothic" w:hAnsi="AppleGothic" w:eastAsia="AppleGothic"/>
+                <w:rFonts w:ascii="Arial Unicode MS" w:hAnsi="Arial Unicode MS" w:eastAsia="Arial Unicode MS"/>
                 <w:b w:val="0"/>
                 <w:i w:val="0"/>
                 <w:color w:val="000000"/>
@@ -6320,7 +6320,7 @@
             </w:pPr>
             <w:r>
               <w:rPr>
-                <w:rFonts w:ascii="AppleGothic" w:hAnsi="AppleGothic" w:eastAsia="AppleGothic"/>
+                <w:rFonts w:ascii="Arial Unicode MS" w:hAnsi="Arial Unicode MS" w:eastAsia="Arial Unicode MS"/>
                 <w:b w:val="0"/>
                 <w:i w:val="0"/>
                 <w:color w:val="000000"/>
@@ -6348,7 +6348,7 @@
             </w:pPr>
             <w:r>
               <w:rPr>
-                <w:rFonts w:ascii="AppleGothic" w:hAnsi="AppleGothic" w:eastAsia="AppleGothic"/>
+                <w:rFonts w:ascii="Arial Unicode MS" w:hAnsi="Arial Unicode MS" w:eastAsia="Arial Unicode MS"/>
                 <w:b w:val="0"/>
                 <w:i w:val="0"/>
                 <w:color w:val="000000"/>
@@ -6382,7 +6382,7 @@
             </w:pPr>
             <w:r>
               <w:rPr>
-                <w:rFonts w:ascii="AppleGothic" w:hAnsi="AppleGothic" w:eastAsia="AppleGothic"/>
+                <w:rFonts w:ascii="Arial Unicode MS" w:hAnsi="Arial Unicode MS" w:eastAsia="Arial Unicode MS"/>
                 <w:b w:val="0"/>
                 <w:i w:val="0"/>
                 <w:color w:val="000000"/>
@@ -6410,7 +6410,7 @@
             </w:pPr>
             <w:r>
               <w:rPr>
-                <w:rFonts w:ascii="AppleGothic" w:hAnsi="AppleGothic" w:eastAsia="AppleGothic"/>
+                <w:rFonts w:ascii="Arial Unicode MS" w:hAnsi="Arial Unicode MS" w:eastAsia="Arial Unicode MS"/>
                 <w:b w:val="0"/>
                 <w:i w:val="0"/>
                 <w:color w:val="000000"/>
@@ -6444,7 +6444,7 @@
             </w:pPr>
             <w:r>
               <w:rPr>
-                <w:rFonts w:ascii="AppleGothic" w:hAnsi="AppleGothic" w:eastAsia="AppleGothic"/>
+                <w:rFonts w:ascii="Arial Unicode MS" w:hAnsi="Arial Unicode MS" w:eastAsia="Arial Unicode MS"/>
                 <w:b w:val="0"/>
                 <w:i w:val="0"/>
                 <w:color w:val="000000"/>
@@ -6472,7 +6472,7 @@
             </w:pPr>
             <w:r>
               <w:rPr>
-                <w:rFonts w:ascii="AppleGothic" w:hAnsi="AppleGothic" w:eastAsia="AppleGothic"/>
+                <w:rFonts w:ascii="Arial Unicode MS" w:hAnsi="Arial Unicode MS" w:eastAsia="Arial Unicode MS"/>
                 <w:b w:val="0"/>
                 <w:i w:val="0"/>
                 <w:color w:val="000000"/>
@@ -6506,7 +6506,7 @@
             </w:pPr>
             <w:r>
               <w:rPr>
-                <w:rFonts w:ascii="AppleGothic" w:hAnsi="AppleGothic" w:eastAsia="AppleGothic"/>
+                <w:rFonts w:ascii="Arial Unicode MS" w:hAnsi="Arial Unicode MS" w:eastAsia="Arial Unicode MS"/>
                 <w:b w:val="0"/>
                 <w:i w:val="0"/>
                 <w:color w:val="000000"/>
@@ -6534,7 +6534,7 @@
             </w:pPr>
             <w:r>
               <w:rPr>
-                <w:rFonts w:ascii="AppleGothic" w:hAnsi="AppleGothic" w:eastAsia="AppleGothic"/>
+                <w:rFonts w:ascii="Arial Unicode MS" w:hAnsi="Arial Unicode MS" w:eastAsia="Arial Unicode MS"/>
                 <w:b w:val="0"/>
                 <w:i w:val="0"/>
                 <w:color w:val="000000"/>
@@ -6568,7 +6568,7 @@
             </w:pPr>
             <w:r>
               <w:rPr>
-                <w:rFonts w:ascii="AppleGothic" w:hAnsi="AppleGothic" w:eastAsia="AppleGothic"/>
+                <w:rFonts w:ascii="Arial Unicode MS" w:hAnsi="Arial Unicode MS" w:eastAsia="Arial Unicode MS"/>
                 <w:b w:val="0"/>
                 <w:i w:val="0"/>
                 <w:color w:val="000000"/>
@@ -6596,7 +6596,7 @@
             </w:pPr>
             <w:r>
               <w:rPr>
-                <w:rFonts w:ascii="AppleGothic" w:hAnsi="AppleGothic" w:eastAsia="AppleGothic"/>
+                <w:rFonts w:ascii="Arial Unicode MS" w:hAnsi="Arial Unicode MS" w:eastAsia="Arial Unicode MS"/>
                 <w:b w:val="0"/>
                 <w:i w:val="0"/>
                 <w:color w:val="000000"/>
@@ -6630,7 +6630,7 @@
             </w:pPr>
             <w:r>
               <w:rPr>
-                <w:rFonts w:ascii="AppleGothic" w:hAnsi="AppleGothic" w:eastAsia="AppleGothic"/>
+                <w:rFonts w:ascii="Arial Unicode MS" w:hAnsi="Arial Unicode MS" w:eastAsia="Arial Unicode MS"/>
                 <w:b w:val="0"/>
                 <w:i w:val="0"/>
                 <w:color w:val="000000"/>
@@ -6658,7 +6658,7 @@
             </w:pPr>
             <w:r>
               <w:rPr>
-                <w:rFonts w:ascii="AppleGothic" w:hAnsi="AppleGothic" w:eastAsia="AppleGothic"/>
+                <w:rFonts w:ascii="Arial Unicode MS" w:hAnsi="Arial Unicode MS" w:eastAsia="Arial Unicode MS"/>
                 <w:b w:val="0"/>
                 <w:i w:val="0"/>
                 <w:color w:val="000000"/>
@@ -6745,7 +6745,7 @@
             </w:pPr>
             <w:r>
               <w:rPr>
-                <w:rFonts w:ascii="AppleGothic" w:hAnsi="AppleGothic" w:eastAsia="AppleGothic"/>
+                <w:rFonts w:ascii="Arial Unicode MS" w:hAnsi="Arial Unicode MS" w:eastAsia="Arial Unicode MS"/>
                 <w:b/>
                 <w:i w:val="0"/>
                 <w:color w:val="0B2545"/>
@@ -6774,7 +6774,7 @@
             </w:pPr>
             <w:r>
               <w:rPr>
-                <w:rFonts w:ascii="AppleGothic" w:hAnsi="AppleGothic" w:eastAsia="AppleGothic"/>
+                <w:rFonts w:ascii="Arial Unicode MS" w:hAnsi="Arial Unicode MS" w:eastAsia="Arial Unicode MS"/>
                 <w:b/>
                 <w:i w:val="0"/>
                 <w:color w:val="0B2545"/>
@@ -6808,7 +6808,7 @@
             </w:pPr>
             <w:r>
               <w:rPr>
-                <w:rFonts w:ascii="AppleGothic" w:hAnsi="AppleGothic" w:eastAsia="AppleGothic"/>
+                <w:rFonts w:ascii="Arial Unicode MS" w:hAnsi="Arial Unicode MS" w:eastAsia="Arial Unicode MS"/>
                 <w:b w:val="0"/>
                 <w:i w:val="0"/>
                 <w:color w:val="000000"/>
@@ -6836,13 +6836,13 @@
             </w:pPr>
             <w:r>
               <w:rPr>
-                <w:rFonts w:ascii="AppleGothic" w:hAnsi="AppleGothic" w:eastAsia="AppleGothic"/>
+                <w:rFonts w:ascii="Arial Unicode MS" w:hAnsi="Arial Unicode MS" w:eastAsia="Arial Unicode MS"/>
                 <w:b w:val="0"/>
                 <w:i w:val="0"/>
                 <w:color w:val="000000"/>
                 <w:sz w:val="18"/>
               </w:rPr>
-              <w:t>동일 모델 TFLM/ESP-NN 실보드 비교와 measured AUTO cost table</w:t>
+              <w:t>동일 모델 TFLM/ESP-NN 실보드 비교와 exact measured cost table</w:t>
             </w:r>
           </w:p>
         </w:tc>
@@ -6870,13 +6870,13 @@
             </w:pPr>
             <w:r>
               <w:rPr>
-                <w:rFonts w:ascii="AppleGothic" w:hAnsi="AppleGothic" w:eastAsia="AppleGothic"/>
+                <w:rFonts w:ascii="Arial Unicode MS" w:hAnsi="Arial Unicode MS" w:eastAsia="Arial Unicode MS"/>
                 <w:b w:val="0"/>
                 <w:i w:val="0"/>
                 <w:color w:val="000000"/>
                 <w:sz w:val="18"/>
               </w:rPr>
-              <w:t>trained MNIST 물리 UART 미수집</w:t>
+              <w:t>trained MNIST 실측은 original ESP32 1종</w:t>
             </w:r>
           </w:p>
         </w:tc>
@@ -6898,13 +6898,13 @@
             </w:pPr>
             <w:r>
               <w:rPr>
-                <w:rFonts w:ascii="AppleGothic" w:hAnsi="AppleGothic" w:eastAsia="AppleGothic"/>
+                <w:rFonts w:ascii="Arial Unicode MS" w:hAnsi="Arial Unicode MS" w:eastAsia="Arial Unicode MS"/>
                 <w:b w:val="0"/>
                 <w:i w:val="0"/>
                 <w:color w:val="000000"/>
                 <w:sz w:val="18"/>
               </w:rPr>
-              <w:t>준비된 100장 corpus로 ESP32 flash·cycles·stack transcript 고정</w:t>
+              <w:t>같은 frozen corpus를 Cortex-M/ESP32-S3에도 확대 측정</w:t>
             </w:r>
           </w:p>
         </w:tc>
@@ -6932,7 +6932,7 @@
             </w:pPr>
             <w:r>
               <w:rPr>
-                <w:rFonts w:ascii="AppleGothic" w:hAnsi="AppleGothic" w:eastAsia="AppleGothic"/>
+                <w:rFonts w:ascii="Arial Unicode MS" w:hAnsi="Arial Unicode MS" w:eastAsia="Arial Unicode MS"/>
                 <w:b w:val="0"/>
                 <w:i w:val="0"/>
                 <w:color w:val="000000"/>
@@ -6960,7 +6960,7 @@
             </w:pPr>
             <w:r>
               <w:rPr>
-                <w:rFonts w:ascii="AppleGothic" w:hAnsi="AppleGothic" w:eastAsia="AppleGothic"/>
+                <w:rFonts w:ascii="Arial Unicode MS" w:hAnsi="Arial Unicode MS" w:eastAsia="Arial Unicode MS"/>
                 <w:b w:val="0"/>
                 <w:i w:val="0"/>
                 <w:color w:val="000000"/>
@@ -6994,7 +6994,7 @@
             </w:pPr>
             <w:r>
               <w:rPr>
-                <w:rFonts w:ascii="AppleGothic" w:hAnsi="AppleGothic" w:eastAsia="AppleGothic"/>
+                <w:rFonts w:ascii="Arial Unicode MS" w:hAnsi="Arial Unicode MS" w:eastAsia="Arial Unicode MS"/>
                 <w:b w:val="0"/>
                 <w:i w:val="0"/>
                 <w:color w:val="000000"/>
@@ -7022,7 +7022,7 @@
             </w:pPr>
             <w:r>
               <w:rPr>
-                <w:rFonts w:ascii="AppleGothic" w:hAnsi="AppleGothic" w:eastAsia="AppleGothic"/>
+                <w:rFonts w:ascii="Arial Unicode MS" w:hAnsi="Arial Unicode MS" w:eastAsia="Arial Unicode MS"/>
                 <w:b w:val="0"/>
                 <w:i w:val="0"/>
                 <w:color w:val="000000"/>
@@ -7056,7 +7056,7 @@
             </w:pPr>
             <w:r>
               <w:rPr>
-                <w:rFonts w:ascii="AppleGothic" w:hAnsi="AppleGothic" w:eastAsia="AppleGothic"/>
+                <w:rFonts w:ascii="Arial Unicode MS" w:hAnsi="Arial Unicode MS" w:eastAsia="Arial Unicode MS"/>
                 <w:b w:val="0"/>
                 <w:i w:val="0"/>
                 <w:color w:val="000000"/>
@@ -7084,7 +7084,7 @@
             </w:pPr>
             <w:r>
               <w:rPr>
-                <w:rFonts w:ascii="AppleGothic" w:hAnsi="AppleGothic" w:eastAsia="AppleGothic"/>
+                <w:rFonts w:ascii="Arial Unicode MS" w:hAnsi="Arial Unicode MS" w:eastAsia="Arial Unicode MS"/>
                 <w:b w:val="0"/>
                 <w:i w:val="0"/>
                 <w:color w:val="000000"/>
@@ -7118,7 +7118,7 @@
             </w:pPr>
             <w:r>
               <w:rPr>
-                <w:rFonts w:ascii="AppleGothic" w:hAnsi="AppleGothic" w:eastAsia="AppleGothic"/>
+                <w:rFonts w:ascii="Arial Unicode MS" w:hAnsi="Arial Unicode MS" w:eastAsia="Arial Unicode MS"/>
                 <w:b w:val="0"/>
                 <w:i w:val="0"/>
                 <w:color w:val="000000"/>
@@ -7146,7 +7146,7 @@
             </w:pPr>
             <w:r>
               <w:rPr>
-                <w:rFonts w:ascii="AppleGothic" w:hAnsi="AppleGothic" w:eastAsia="AppleGothic"/>
+                <w:rFonts w:ascii="Arial Unicode MS" w:hAnsi="Arial Unicode MS" w:eastAsia="Arial Unicode MS"/>
                 <w:b w:val="0"/>
                 <w:i w:val="0"/>
                 <w:color w:val="000000"/>
@@ -7210,7 +7210,7 @@
             </w:pPr>
             <w:r>
               <w:rPr>
-                <w:rFonts w:ascii="AppleGothic" w:hAnsi="AppleGothic" w:eastAsia="AppleGothic"/>
+                <w:rFonts w:ascii="Arial Unicode MS" w:hAnsi="Arial Unicode MS" w:eastAsia="Arial Unicode MS"/>
                 <w:b/>
                 <w:i w:val="0"/>
                 <w:color w:val="0B2545"/>
@@ -7239,7 +7239,7 @@
             </w:pPr>
             <w:r>
               <w:rPr>
-                <w:rFonts w:ascii="AppleGothic" w:hAnsi="AppleGothic" w:eastAsia="AppleGothic"/>
+                <w:rFonts w:ascii="Arial Unicode MS" w:hAnsi="Arial Unicode MS" w:eastAsia="Arial Unicode MS"/>
                 <w:b/>
                 <w:i w:val="0"/>
                 <w:color w:val="0B2545"/>
@@ -7268,7 +7268,7 @@
             </w:pPr>
             <w:r>
               <w:rPr>
-                <w:rFonts w:ascii="AppleGothic" w:hAnsi="AppleGothic" w:eastAsia="AppleGothic"/>
+                <w:rFonts w:ascii="Arial Unicode MS" w:hAnsi="Arial Unicode MS" w:eastAsia="Arial Unicode MS"/>
                 <w:b/>
                 <w:i w:val="0"/>
                 <w:color w:val="0B2545"/>
@@ -7302,7 +7302,7 @@
             </w:pPr>
             <w:r>
               <w:rPr>
-                <w:rFonts w:ascii="AppleGothic" w:hAnsi="AppleGothic" w:eastAsia="AppleGothic"/>
+                <w:rFonts w:ascii="Arial Unicode MS" w:hAnsi="Arial Unicode MS" w:eastAsia="Arial Unicode MS"/>
                 <w:b w:val="0"/>
                 <w:i w:val="0"/>
                 <w:color w:val="000000"/>
@@ -7330,7 +7330,7 @@
             </w:pPr>
             <w:r>
               <w:rPr>
-                <w:rFonts w:ascii="AppleGothic" w:hAnsi="AppleGothic" w:eastAsia="AppleGothic"/>
+                <w:rFonts w:ascii="Arial Unicode MS" w:hAnsi="Arial Unicode MS" w:eastAsia="Arial Unicode MS"/>
                 <w:b w:val="0"/>
                 <w:i w:val="0"/>
                 <w:color w:val="000000"/>
@@ -7358,7 +7358,7 @@
             </w:pPr>
             <w:r>
               <w:rPr>
-                <w:rFonts w:ascii="AppleGothic" w:hAnsi="AppleGothic" w:eastAsia="AppleGothic"/>
+                <w:rFonts w:ascii="Arial Unicode MS" w:hAnsi="Arial Unicode MS" w:eastAsia="Arial Unicode MS"/>
                 <w:b w:val="0"/>
                 <w:i w:val="0"/>
                 <w:color w:val="000000"/>
@@ -7392,7 +7392,7 @@
             </w:pPr>
             <w:r>
               <w:rPr>
-                <w:rFonts w:ascii="AppleGothic" w:hAnsi="AppleGothic" w:eastAsia="AppleGothic"/>
+                <w:rFonts w:ascii="Arial Unicode MS" w:hAnsi="Arial Unicode MS" w:eastAsia="Arial Unicode MS"/>
                 <w:b w:val="0"/>
                 <w:i w:val="0"/>
                 <w:color w:val="000000"/>
@@ -7420,7 +7420,7 @@
             </w:pPr>
             <w:r>
               <w:rPr>
-                <w:rFonts w:ascii="AppleGothic" w:hAnsi="AppleGothic" w:eastAsia="AppleGothic"/>
+                <w:rFonts w:ascii="Arial Unicode MS" w:hAnsi="Arial Unicode MS" w:eastAsia="Arial Unicode MS"/>
                 <w:b w:val="0"/>
                 <w:i w:val="0"/>
                 <w:color w:val="000000"/>
@@ -7448,7 +7448,7 @@
             </w:pPr>
             <w:r>
               <w:rPr>
-                <w:rFonts w:ascii="AppleGothic" w:hAnsi="AppleGothic" w:eastAsia="AppleGothic"/>
+                <w:rFonts w:ascii="Arial Unicode MS" w:hAnsi="Arial Unicode MS" w:eastAsia="Arial Unicode MS"/>
                 <w:b w:val="0"/>
                 <w:i w:val="0"/>
                 <w:color w:val="000000"/>
@@ -7482,7 +7482,7 @@
             </w:pPr>
             <w:r>
               <w:rPr>
-                <w:rFonts w:ascii="AppleGothic" w:hAnsi="AppleGothic" w:eastAsia="AppleGothic"/>
+                <w:rFonts w:ascii="Arial Unicode MS" w:hAnsi="Arial Unicode MS" w:eastAsia="Arial Unicode MS"/>
                 <w:b w:val="0"/>
                 <w:i w:val="0"/>
                 <w:color w:val="000000"/>
@@ -7510,7 +7510,7 @@
             </w:pPr>
             <w:r>
               <w:rPr>
-                <w:rFonts w:ascii="AppleGothic" w:hAnsi="AppleGothic" w:eastAsia="AppleGothic"/>
+                <w:rFonts w:ascii="Arial Unicode MS" w:hAnsi="Arial Unicode MS" w:eastAsia="Arial Unicode MS"/>
                 <w:b w:val="0"/>
                 <w:i w:val="0"/>
                 <w:color w:val="000000"/>
@@ -7538,7 +7538,7 @@
             </w:pPr>
             <w:r>
               <w:rPr>
-                <w:rFonts w:ascii="AppleGothic" w:hAnsi="AppleGothic" w:eastAsia="AppleGothic"/>
+                <w:rFonts w:ascii="Arial Unicode MS" w:hAnsi="Arial Unicode MS" w:eastAsia="Arial Unicode MS"/>
                 <w:b w:val="0"/>
                 <w:i w:val="0"/>
                 <w:color w:val="000000"/>
@@ -7572,7 +7572,7 @@
             </w:pPr>
             <w:r>
               <w:rPr>
-                <w:rFonts w:ascii="AppleGothic" w:hAnsi="AppleGothic" w:eastAsia="AppleGothic"/>
+                <w:rFonts w:ascii="Arial Unicode MS" w:hAnsi="Arial Unicode MS" w:eastAsia="Arial Unicode MS"/>
                 <w:b w:val="0"/>
                 <w:i w:val="0"/>
                 <w:color w:val="000000"/>
@@ -7600,7 +7600,7 @@
             </w:pPr>
             <w:r>
               <w:rPr>
-                <w:rFonts w:ascii="AppleGothic" w:hAnsi="AppleGothic" w:eastAsia="AppleGothic"/>
+                <w:rFonts w:ascii="Arial Unicode MS" w:hAnsi="Arial Unicode MS" w:eastAsia="Arial Unicode MS"/>
                 <w:b w:val="0"/>
                 <w:i w:val="0"/>
                 <w:color w:val="000000"/>
@@ -7628,7 +7628,7 @@
             </w:pPr>
             <w:r>
               <w:rPr>
-                <w:rFonts w:ascii="AppleGothic" w:hAnsi="AppleGothic" w:eastAsia="AppleGothic"/>
+                <w:rFonts w:ascii="Arial Unicode MS" w:hAnsi="Arial Unicode MS" w:eastAsia="Arial Unicode MS"/>
                 <w:b w:val="0"/>
                 <w:i w:val="0"/>
                 <w:color w:val="000000"/>
@@ -7662,7 +7662,7 @@
             </w:pPr>
             <w:r>
               <w:rPr>
-                <w:rFonts w:ascii="AppleGothic" w:hAnsi="AppleGothic" w:eastAsia="AppleGothic"/>
+                <w:rFonts w:ascii="Arial Unicode MS" w:hAnsi="Arial Unicode MS" w:eastAsia="Arial Unicode MS"/>
                 <w:b w:val="0"/>
                 <w:i w:val="0"/>
                 <w:color w:val="000000"/>
@@ -7690,7 +7690,7 @@
             </w:pPr>
             <w:r>
               <w:rPr>
-                <w:rFonts w:ascii="AppleGothic" w:hAnsi="AppleGothic" w:eastAsia="AppleGothic"/>
+                <w:rFonts w:ascii="Arial Unicode MS" w:hAnsi="Arial Unicode MS" w:eastAsia="Arial Unicode MS"/>
                 <w:b w:val="0"/>
                 <w:i w:val="0"/>
                 <w:color w:val="000000"/>
@@ -7718,7 +7718,7 @@
             </w:pPr>
             <w:r>
               <w:rPr>
-                <w:rFonts w:ascii="AppleGothic" w:hAnsi="AppleGothic" w:eastAsia="AppleGothic"/>
+                <w:rFonts w:ascii="Arial Unicode MS" w:hAnsi="Arial Unicode MS" w:eastAsia="Arial Unicode MS"/>
                 <w:b w:val="0"/>
                 <w:i w:val="0"/>
                 <w:color w:val="000000"/>
@@ -7752,7 +7752,7 @@
             </w:pPr>
             <w:r>
               <w:rPr>
-                <w:rFonts w:ascii="AppleGothic" w:hAnsi="AppleGothic" w:eastAsia="AppleGothic"/>
+                <w:rFonts w:ascii="Arial Unicode MS" w:hAnsi="Arial Unicode MS" w:eastAsia="Arial Unicode MS"/>
                 <w:b w:val="0"/>
                 <w:i w:val="0"/>
                 <w:color w:val="000000"/>
@@ -7780,7 +7780,7 @@
             </w:pPr>
             <w:r>
               <w:rPr>
-                <w:rFonts w:ascii="AppleGothic" w:hAnsi="AppleGothic" w:eastAsia="AppleGothic"/>
+                <w:rFonts w:ascii="Arial Unicode MS" w:hAnsi="Arial Unicode MS" w:eastAsia="Arial Unicode MS"/>
                 <w:b w:val="0"/>
                 <w:i w:val="0"/>
                 <w:color w:val="000000"/>
@@ -7808,7 +7808,7 @@
             </w:pPr>
             <w:r>
               <w:rPr>
-                <w:rFonts w:ascii="AppleGothic" w:hAnsi="AppleGothic" w:eastAsia="AppleGothic"/>
+                <w:rFonts w:ascii="Arial Unicode MS" w:hAnsi="Arial Unicode MS" w:eastAsia="Arial Unicode MS"/>
                 <w:b w:val="0"/>
                 <w:i w:val="0"/>
                 <w:color w:val="000000"/>
@@ -7842,7 +7842,7 @@
             </w:pPr>
             <w:r>
               <w:rPr>
-                <w:rFonts w:ascii="AppleGothic" w:hAnsi="AppleGothic" w:eastAsia="AppleGothic"/>
+                <w:rFonts w:ascii="Arial Unicode MS" w:hAnsi="Arial Unicode MS" w:eastAsia="Arial Unicode MS"/>
                 <w:b w:val="0"/>
                 <w:i w:val="0"/>
                 <w:color w:val="000000"/>
@@ -7870,13 +7870,13 @@
             </w:pPr>
             <w:r>
               <w:rPr>
-                <w:rFonts w:ascii="AppleGothic" w:hAnsi="AppleGothic" w:eastAsia="AppleGothic"/>
+                <w:rFonts w:ascii="Arial Unicode MS" w:hAnsi="Arial Unicode MS" w:eastAsia="Arial Unicode MS"/>
                 <w:b w:val="0"/>
                 <w:i w:val="0"/>
                 <w:color w:val="000000"/>
                 <w:sz w:val="18"/>
               </w:rPr>
-              <w:t>미완료</w:t>
+              <w:t>완료</w:t>
             </w:r>
           </w:p>
         </w:tc>
@@ -7898,13 +7898,13 @@
             </w:pPr>
             <w:r>
               <w:rPr>
-                <w:rFonts w:ascii="AppleGothic" w:hAnsi="AppleGothic" w:eastAsia="AppleGothic"/>
+                <w:rFonts w:ascii="Arial Unicode MS" w:hAnsi="Arial Unicode MS" w:eastAsia="Arial Unicode MS"/>
                 <w:b w:val="0"/>
                 <w:i w:val="0"/>
                 <w:color w:val="000000"/>
                 <w:sz w:val="18"/>
               </w:rPr>
-              <w:t>ESP32 UART transcript와 cycles/stack 결과 체크인</w:t>
+              <w:t>original ESP32 UART, 101회 cycles, size와 100장 exact output 체크인</w:t>
             </w:r>
           </w:p>
         </w:tc>
@@ -7932,7 +7932,7 @@
             </w:pPr>
             <w:r>
               <w:rPr>
-                <w:rFonts w:ascii="AppleGothic" w:hAnsi="AppleGothic" w:eastAsia="AppleGothic"/>
+                <w:rFonts w:ascii="Arial Unicode MS" w:hAnsi="Arial Unicode MS" w:eastAsia="Arial Unicode MS"/>
                 <w:b w:val="0"/>
                 <w:i w:val="0"/>
                 <w:color w:val="000000"/>
@@ -7960,13 +7960,13 @@
             </w:pPr>
             <w:r>
               <w:rPr>
-                <w:rFonts w:ascii="AppleGothic" w:hAnsi="AppleGothic" w:eastAsia="AppleGothic"/>
+                <w:rFonts w:ascii="Arial Unicode MS" w:hAnsi="Arial Unicode MS" w:eastAsia="Arial Unicode MS"/>
                 <w:b w:val="0"/>
                 <w:i w:val="0"/>
                 <w:color w:val="000000"/>
                 <w:sz w:val="18"/>
               </w:rPr>
-              <w:t>미완료</w:t>
+              <w:t>완료</w:t>
             </w:r>
           </w:p>
         </w:tc>
@@ -7988,13 +7988,13 @@
             </w:pPr>
             <w:r>
               <w:rPr>
-                <w:rFonts w:ascii="AppleGothic" w:hAnsi="AppleGothic" w:eastAsia="AppleGothic"/>
+                <w:rFonts w:ascii="Arial Unicode MS" w:hAnsi="Arial Unicode MS" w:eastAsia="Arial Unicode MS"/>
                 <w:b w:val="0"/>
                 <w:i w:val="0"/>
                 <w:color w:val="000000"/>
                 <w:sz w:val="18"/>
               </w:rPr>
-              <w:t>green PR merge 후 main에서 v0.1.0 tag/release</w:t>
+              <w:t>main의 v1.0.0 tag, GitHub Release와 PyPI 배포</w:t>
             </w:r>
           </w:p>
         </w:tc>
@@ -8019,7 +8019,7 @@
       </w:pPr>
       <w:r>
         <w:rPr>
-          <w:rFonts w:ascii="AppleGothic" w:hAnsi="AppleGothic" w:eastAsia="AppleGothic"/>
+          <w:rFonts w:ascii="Arial Unicode MS" w:hAnsi="Arial Unicode MS" w:eastAsia="Arial Unicode MS"/>
           <w:b/>
           <w:i w:val="0"/>
           <w:color w:val="0B2545"/>
@@ -8029,7 +8029,7 @@
       </w:r>
       <w:r>
         <w:rPr>
-          <w:rFonts w:ascii="AppleGothic" w:hAnsi="AppleGothic" w:eastAsia="AppleGothic"/>
+          <w:rFonts w:ascii="Arial Unicode MS" w:hAnsi="Arial Unicode MS" w:eastAsia="Arial Unicode MS"/>
           <w:b w:val="0"/>
           <w:i w:val="0"/>
           <w:color w:val="0B2545"/>
@@ -8060,7 +8060,7 @@
       </w:pPr>
       <w:r>
         <w:rPr>
-          <w:rFonts w:ascii="AppleGothic" w:hAnsi="AppleGothic" w:eastAsia="AppleGothic"/>
+          <w:rFonts w:ascii="Arial Unicode MS" w:hAnsi="Arial Unicode MS" w:eastAsia="Arial Unicode MS"/>
           <w:b w:val="0"/>
           <w:i w:val="0"/>
           <w:color w:val="000000"/>
@@ -8078,7 +8078,7 @@
       </w:pPr>
       <w:r>
         <w:rPr>
-          <w:rFonts w:ascii="AppleGothic" w:hAnsi="AppleGothic" w:eastAsia="AppleGothic"/>
+          <w:rFonts w:ascii="Arial Unicode MS" w:hAnsi="Arial Unicode MS" w:eastAsia="Arial Unicode MS"/>
           <w:b w:val="0"/>
           <w:i w:val="0"/>
           <w:color w:val="000000"/>
@@ -8096,7 +8096,7 @@
       </w:pPr>
       <w:r>
         <w:rPr>
-          <w:rFonts w:ascii="AppleGothic" w:hAnsi="AppleGothic" w:eastAsia="AppleGothic"/>
+          <w:rFonts w:ascii="Arial Unicode MS" w:hAnsi="Arial Unicode MS" w:eastAsia="Arial Unicode MS"/>
           <w:b w:val="0"/>
           <w:i w:val="0"/>
           <w:color w:val="000000"/>
@@ -8114,7 +8114,7 @@
       </w:pPr>
       <w:r>
         <w:rPr>
-          <w:rFonts w:ascii="AppleGothic" w:hAnsi="AppleGothic" w:eastAsia="AppleGothic"/>
+          <w:rFonts w:ascii="Arial Unicode MS" w:hAnsi="Arial Unicode MS" w:eastAsia="Arial Unicode MS"/>
           <w:b w:val="0"/>
           <w:i w:val="0"/>
           <w:color w:val="000000"/>
@@ -8132,7 +8132,7 @@
       </w:pPr>
       <w:r>
         <w:rPr>
-          <w:rFonts w:ascii="AppleGothic" w:hAnsi="AppleGothic" w:eastAsia="AppleGothic"/>
+          <w:rFonts w:ascii="Arial Unicode MS" w:hAnsi="Arial Unicode MS" w:eastAsia="Arial Unicode MS"/>
           <w:b w:val="0"/>
           <w:i w:val="0"/>
           <w:color w:val="000000"/>
@@ -8150,7 +8150,7 @@
       </w:pPr>
       <w:r>
         <w:rPr>
-          <w:rFonts w:ascii="AppleGothic" w:hAnsi="AppleGothic" w:eastAsia="AppleGothic"/>
+          <w:rFonts w:ascii="Arial Unicode MS" w:hAnsi="Arial Unicode MS" w:eastAsia="Arial Unicode MS"/>
           <w:b w:val="0"/>
           <w:i w:val="0"/>
           <w:color w:val="000000"/>
@@ -8168,7 +8168,7 @@
       </w:pPr>
       <w:r>
         <w:rPr>
-          <w:rFonts w:ascii="AppleGothic" w:hAnsi="AppleGothic" w:eastAsia="AppleGothic"/>
+          <w:rFonts w:ascii="Arial Unicode MS" w:hAnsi="Arial Unicode MS" w:eastAsia="Arial Unicode MS"/>
           <w:b w:val="0"/>
           <w:i w:val="0"/>
           <w:color w:val="000000"/>
@@ -8186,7 +8186,7 @@
       </w:pPr>
       <w:r>
         <w:rPr>
-          <w:rFonts w:ascii="AppleGothic" w:hAnsi="AppleGothic" w:eastAsia="AppleGothic"/>
+          <w:rFonts w:ascii="Arial Unicode MS" w:hAnsi="Arial Unicode MS" w:eastAsia="Arial Unicode MS"/>
           <w:b w:val="0"/>
           <w:i w:val="0"/>
           <w:color w:val="000000"/>
@@ -8204,7 +8204,7 @@
       </w:pPr>
       <w:r>
         <w:rPr>
-          <w:rFonts w:ascii="AppleGothic" w:hAnsi="AppleGothic" w:eastAsia="AppleGothic"/>
+          <w:rFonts w:ascii="Arial Unicode MS" w:hAnsi="Arial Unicode MS" w:eastAsia="Arial Unicode MS"/>
           <w:b w:val="0"/>
           <w:i w:val="0"/>
           <w:color w:val="000000"/>
@@ -8222,7 +8222,7 @@
       </w:pPr>
       <w:r>
         <w:rPr>
-          <w:rFonts w:ascii="AppleGothic" w:hAnsi="AppleGothic" w:eastAsia="AppleGothic"/>
+          <w:rFonts w:ascii="Arial Unicode MS" w:hAnsi="Arial Unicode MS" w:eastAsia="Arial Unicode MS"/>
           <w:b w:val="0"/>
           <w:i w:val="0"/>
           <w:color w:val="000000"/>
@@ -8240,7 +8240,7 @@
       </w:pPr>
       <w:r>
         <w:rPr>
-          <w:rFonts w:ascii="AppleGothic" w:hAnsi="AppleGothic" w:eastAsia="AppleGothic"/>
+          <w:rFonts w:ascii="Arial Unicode MS" w:hAnsi="Arial Unicode MS" w:eastAsia="Arial Unicode MS"/>
           <w:b w:val="0"/>
           <w:i w:val="0"/>
           <w:color w:val="000000"/>
@@ -8258,7 +8258,7 @@
       </w:pPr>
       <w:r>
         <w:rPr>
-          <w:rFonts w:ascii="AppleGothic" w:hAnsi="AppleGothic" w:eastAsia="AppleGothic"/>
+          <w:rFonts w:ascii="Arial Unicode MS" w:hAnsi="Arial Unicode MS" w:eastAsia="Arial Unicode MS"/>
           <w:b w:val="0"/>
           <w:i w:val="0"/>
           <w:color w:val="000000"/>
@@ -8276,7 +8276,7 @@
       </w:pPr>
       <w:r>
         <w:rPr>
-          <w:rFonts w:ascii="AppleGothic" w:hAnsi="AppleGothic" w:eastAsia="AppleGothic"/>
+          <w:rFonts w:ascii="Arial Unicode MS" w:hAnsi="Arial Unicode MS" w:eastAsia="Arial Unicode MS"/>
           <w:b w:val="0"/>
           <w:i w:val="0"/>
           <w:color w:val="000000"/>
@@ -8306,7 +8306,7 @@
     </w:pPr>
     <w:r>
       <w:rPr>
-        <w:rFonts w:ascii="AppleGothic" w:hAnsi="AppleGothic" w:eastAsia="AppleGothic"/>
+        <w:rFonts w:ascii="Arial Unicode MS" w:hAnsi="Arial Unicode MS" w:eastAsia="Arial Unicode MS"/>
         <w:b w:val="0"/>
         <w:i w:val="0"/>
         <w:color w:val="666666"/>
@@ -8316,7 +8316,7 @@
     </w:r>
     <w:r>
       <w:rPr>
-        <w:rFonts w:ascii="AppleGothic" w:hAnsi="AppleGothic" w:eastAsia="AppleGothic"/>
+        <w:rFonts w:ascii="Arial Unicode MS" w:hAnsi="Arial Unicode MS" w:eastAsia="Arial Unicode MS"/>
         <w:b w:val="0"/>
         <w:i w:val="0"/>
         <w:color w:val="666666"/>
@@ -8329,7 +8329,7 @@
     </w:r>
     <w:r>
       <w:rPr>
-        <w:rFonts w:ascii="AppleGothic" w:hAnsi="AppleGothic" w:eastAsia="AppleGothic"/>
+        <w:rFonts w:ascii="Arial Unicode MS" w:hAnsi="Arial Unicode MS" w:eastAsia="Arial Unicode MS"/>
         <w:b w:val="0"/>
         <w:i w:val="0"/>
         <w:color w:val="666666"/>
@@ -8339,7 +8339,7 @@
     </w:r>
     <w:r>
       <w:rPr>
-        <w:rFonts w:ascii="AppleGothic" w:hAnsi="AppleGothic" w:eastAsia="AppleGothic"/>
+        <w:rFonts w:ascii="Arial Unicode MS" w:hAnsi="Arial Unicode MS" w:eastAsia="Arial Unicode MS"/>
         <w:b w:val="0"/>
         <w:i w:val="0"/>
         <w:color w:val="666666"/>
@@ -8364,7 +8364,7 @@
     </w:pPr>
     <w:r>
       <w:rPr>
-        <w:rFonts w:ascii="AppleGothic" w:hAnsi="AppleGothic" w:eastAsia="AppleGothic"/>
+        <w:rFonts w:ascii="Arial Unicode MS" w:hAnsi="Arial Unicode MS" w:eastAsia="Arial Unicode MS"/>
         <w:b w:val="0"/>
         <w:i w:val="0"/>
         <w:color w:val="666666"/>
@@ -8800,7 +8800,7 @@
       <w:spacing w:before="0" w:after="120" w:line="264" w:lineRule="auto"/>
     </w:pPr>
     <w:rPr>
-      <w:rFonts w:ascii="AppleGothic" w:hAnsi="AppleGothic" w:eastAsia="AppleGothic"/>
+      <w:rFonts w:ascii="Arial Unicode MS" w:hAnsi="Arial Unicode MS" w:eastAsia="Arial Unicode MS"/>
       <w:b w:val="0"/>
       <w:color w:val="000000"/>
       <w:sz w:val="22"/>
@@ -8865,7 +8865,7 @@
       <w:outlineLvl w:val="0"/>
     </w:pPr>
     <w:rPr>
-      <w:rFonts w:asciiTheme="majorHAnsi" w:eastAsiaTheme="majorEastAsia" w:hAnsiTheme="majorHAnsi" w:cstheme="majorBidi" w:ascii="AppleGothic" w:hAnsi="AppleGothic" w:eastAsia="AppleGothic"/>
+      <w:rFonts w:asciiTheme="majorHAnsi" w:eastAsiaTheme="majorEastAsia" w:hAnsiTheme="majorHAnsi" w:cstheme="majorBidi" w:ascii="Arial Unicode MS" w:hAnsi="Arial Unicode MS" w:eastAsia="Arial Unicode MS"/>
       <w:b/>
       <w:bCs/>
       <w:color w:val="2E74B5"/>
@@ -8889,7 +8889,7 @@
       <w:outlineLvl w:val="1"/>
     </w:pPr>
     <w:rPr>
-      <w:rFonts w:asciiTheme="majorHAnsi" w:eastAsiaTheme="majorEastAsia" w:hAnsiTheme="majorHAnsi" w:cstheme="majorBidi" w:ascii="AppleGothic" w:hAnsi="AppleGothic" w:eastAsia="AppleGothic"/>
+      <w:rFonts w:asciiTheme="majorHAnsi" w:eastAsiaTheme="majorEastAsia" w:hAnsiTheme="majorHAnsi" w:cstheme="majorBidi" w:ascii="Arial Unicode MS" w:hAnsi="Arial Unicode MS" w:eastAsia="Arial Unicode MS"/>
       <w:b/>
       <w:bCs/>
       <w:color w:val="2E74B5"/>
@@ -8913,7 +8913,7 @@
       <w:outlineLvl w:val="2"/>
     </w:pPr>
     <w:rPr>
-      <w:rFonts w:asciiTheme="majorHAnsi" w:eastAsiaTheme="majorEastAsia" w:hAnsiTheme="majorHAnsi" w:cstheme="majorBidi" w:ascii="AppleGothic" w:hAnsi="AppleGothic" w:eastAsia="AppleGothic"/>
+      <w:rFonts w:asciiTheme="majorHAnsi" w:eastAsiaTheme="majorEastAsia" w:hAnsiTheme="majorHAnsi" w:cstheme="majorBidi" w:ascii="Arial Unicode MS" w:hAnsi="Arial Unicode MS" w:eastAsia="Arial Unicode MS"/>
       <w:b/>
       <w:bCs/>
       <w:color w:val="1F4D78"/>
@@ -9156,7 +9156,7 @@
       <w:contextualSpacing/>
     </w:pPr>
     <w:rPr>
-      <w:rFonts w:asciiTheme="majorHAnsi" w:eastAsiaTheme="majorEastAsia" w:hAnsiTheme="majorHAnsi" w:cstheme="majorBidi" w:ascii="AppleGothic" w:hAnsi="AppleGothic" w:eastAsia="AppleGothic"/>
+      <w:rFonts w:asciiTheme="majorHAnsi" w:eastAsiaTheme="majorEastAsia" w:hAnsiTheme="majorHAnsi" w:cstheme="majorBidi" w:ascii="Arial Unicode MS" w:hAnsi="Arial Unicode MS" w:eastAsia="Arial Unicode MS"/>
       <w:b/>
       <w:color w:val="0B2545"/>
       <w:spacing w:val="5"/>
@@ -9196,7 +9196,7 @@
       <w:spacing w:before="0" w:after="240"/>
     </w:pPr>
     <w:rPr>
-      <w:rFonts w:asciiTheme="majorHAnsi" w:eastAsiaTheme="majorEastAsia" w:hAnsiTheme="majorHAnsi" w:cstheme="majorBidi" w:ascii="AppleGothic" w:hAnsi="AppleGothic" w:eastAsia="AppleGothic"/>
+      <w:rFonts w:asciiTheme="majorHAnsi" w:eastAsiaTheme="majorEastAsia" w:hAnsiTheme="majorHAnsi" w:cstheme="majorBidi" w:ascii="Arial Unicode MS" w:hAnsi="Arial Unicode MS" w:eastAsia="Arial Unicode MS"/>
       <w:b w:val="0"/>
       <w:i/>
       <w:iCs/>
@@ -9602,7 +9602,7 @@
       <w:spacing w:line="240" w:lineRule="auto" w:before="80" w:after="80"/>
     </w:pPr>
     <w:rPr>
-      <w:rFonts w:ascii="AppleGothic" w:hAnsi="AppleGothic" w:eastAsia="AppleGothic"/>
+      <w:rFonts w:ascii="Arial Unicode MS" w:hAnsi="Arial Unicode MS" w:eastAsia="Arial Unicode MS"/>
       <w:b w:val="0"/>
       <w:bCs/>
       <w:color w:val="666666"/>

</xml_diff>